<commit_message>
Some Initial outlining of the scope and hurdles
</commit_message>
<xml_diff>
--- a/Traffic Sim.docx
+++ b/Traffic Sim.docx
@@ -1,15 +1,185 @@
 
 <file path=word/document.xml><?xml version="1.0" encoding="utf-8"?>
-<w:document xmlns:wpc="http://schemas.microsoft.com/office/word/2010/wordprocessingCanvas" xmlns:cx="http://schemas.microsoft.com/office/drawing/2014/chartex" xmlns:cx1="http://schemas.microsoft.com/office/drawing/2015/9/8/chartex" xmlns:cx2="http://schemas.microsoft.com/office/drawing/2015/10/21/chartex" xmlns:cx3="http://schemas.microsoft.com/office/drawing/2016/5/9/chartex" xmlns:cx4="http://schemas.microsoft.com/office/drawing/2016/5/10/chartex" xmlns:cx5="http://schemas.microsoft.com/office/drawing/2016/5/11/chartex" xmlns:cx6="http://schemas.microsoft.com/office/drawing/2016/5/12/chartex" xmlns:cx7="http://schemas.microsoft.com/office/drawing/2016/5/13/chartex" xmlns:cx8="http://schemas.microsoft.com/office/drawing/2016/5/14/chartex" xmlns:mc="http://schemas.openxmlformats.org/markup-compatibility/2006" xmlns:aink="http://schemas.microsoft.com/office/drawing/2016/ink" xmlns:am3d="http://schemas.microsoft.com/office/drawing/2017/model3d" xmlns:o="urn:schemas-microsoft-com:office:office" xmlns:oel="http://schemas.microsoft.com/office/2019/extlst" xmlns:r="http://schemas.openxmlformats.org/officeDocument/2006/relationships" xmlns:m="http://schemas.openxmlformats.org/officeDocument/2006/math" xmlns:v="urn:schemas-microsoft-com:vml" xmlns:wp14="http://schemas.microsoft.com/office/word/2010/wordprocessingDrawing" xmlns:wp="http://schemas.openxmlformats.org/drawingml/2006/wordprocessingDrawing" xmlns:w10="urn:schemas-microsoft-com:office:word" xmlns:w="http://schemas.openxmlformats.org/wordprocessingml/2006/main" xmlns:w14="http://schemas.microsoft.com/office/word/2010/wordml" xmlns:w15="http://schemas.microsoft.com/office/word/2012/wordml" xmlns:w16cex="http://schemas.microsoft.com/office/word/2018/wordml/cex" xmlns:w16cid="http://schemas.microsoft.com/office/word/2016/wordml/cid" xmlns:w16="http://schemas.microsoft.com/office/word/2018/wordml" xmlns:w16sdtdh="http://schemas.microsoft.com/office/word/2020/wordml/sdtdatahash" xmlns:w16se="http://schemas.microsoft.com/office/word/2015/wordml/symex" xmlns:wpg="http://schemas.microsoft.com/office/word/2010/wordprocessingGroup" xmlns:wpi="http://schemas.microsoft.com/office/word/2010/wordprocessingInk" xmlns:wne="http://schemas.microsoft.com/office/word/2006/wordml" xmlns:wps="http://schemas.microsoft.com/office/word/2010/wordprocessingShape" mc:Ignorable="w14 w15 w16se w16cid w16 w16cex w16sdtdh wp14">
+<w:document xmlns:wpc="http://schemas.microsoft.com/office/word/2010/wordprocessingCanvas" xmlns:cx="http://schemas.microsoft.com/office/drawing/2014/chartex" xmlns:cx1="http://schemas.microsoft.com/office/drawing/2015/9/8/chartex" xmlns:cx2="http://schemas.microsoft.com/office/drawing/2015/10/21/chartex" xmlns:cx3="http://schemas.microsoft.com/office/drawing/2016/5/9/chartex" xmlns:cx4="http://schemas.microsoft.com/office/drawing/2016/5/10/chartex" xmlns:cx5="http://schemas.microsoft.com/office/drawing/2016/5/11/chartex" xmlns:cx6="http://schemas.microsoft.com/office/drawing/2016/5/12/chartex" xmlns:cx7="http://schemas.microsoft.com/office/drawing/2016/5/13/chartex" xmlns:cx8="http://schemas.microsoft.com/office/drawing/2016/5/14/chartex" xmlns:mc="http://schemas.openxmlformats.org/markup-compatibility/2006" xmlns:aink="http://schemas.microsoft.com/office/drawing/2016/ink" xmlns:am3d="http://schemas.microsoft.com/office/drawing/2017/model3d" xmlns:o="urn:schemas-microsoft-com:office:office" xmlns:oel="http://schemas.microsoft.com/office/2019/extlst" xmlns:r="http://schemas.openxmlformats.org/officeDocument/2006/relationships" xmlns:m="http://schemas.openxmlformats.org/officeDocument/2006/math" xmlns:v="urn:schemas-microsoft-com:vml" xmlns:wp14="http://schemas.microsoft.com/office/word/2010/wordprocessingDrawing" xmlns:wp="http://schemas.openxmlformats.org/drawingml/2006/wordprocessingDrawing" xmlns:w10="urn:schemas-microsoft-com:office:word" xmlns:w="http://schemas.openxmlformats.org/wordprocessingml/2006/main" xmlns:w14="http://schemas.microsoft.com/office/word/2010/wordml" xmlns:w15="http://schemas.microsoft.com/office/word/2012/wordml" xmlns:w16cex="http://schemas.microsoft.com/office/word/2018/wordml/cex" xmlns:w16cid="http://schemas.microsoft.com/office/word/2016/wordml/cid" xmlns:w16="http://schemas.microsoft.com/office/word/2018/wordml" xmlns:w16du="http://schemas.microsoft.com/office/word/2023/wordml/word16du" xmlns:w16sdtdh="http://schemas.microsoft.com/office/word/2020/wordml/sdtdatahash" xmlns:w16sdtfl="http://schemas.microsoft.com/office/word/2024/wordml/sdtformatlock" xmlns:w16se="http://schemas.microsoft.com/office/word/2015/wordml/symex" xmlns:wpg="http://schemas.microsoft.com/office/word/2010/wordprocessingGroup" xmlns:wpi="http://schemas.microsoft.com/office/word/2010/wordprocessingInk" xmlns:wne="http://schemas.microsoft.com/office/word/2006/wordml" xmlns:wps="http://schemas.microsoft.com/office/word/2010/wordprocessingShape" mc:Ignorable="w14 w15 w16se w16cid w16 w16cex w16sdtdh w16sdtfl w16du wp14">
   <w:body>
     <w:p>
+      <w:pPr>
+        <w:pStyle w:val="ListParagraph"/>
+        <w:numPr>
+          <w:ilvl w:val="0"/>
+          <w:numId w:val="6"/>
+        </w:numPr>
+      </w:pPr>
       <w:r>
         <w:t>Scope</w:t>
       </w:r>
     </w:p>
     <w:p>
+      <w:pPr>
+        <w:pStyle w:val="ListParagraph"/>
+        <w:numPr>
+          <w:ilvl w:val="1"/>
+          <w:numId w:val="6"/>
+        </w:numPr>
+      </w:pPr>
+      <w:r>
+        <w:t>Boundaries</w:t>
+      </w:r>
+    </w:p>
+    <w:p>
+      <w:pPr>
+        <w:pStyle w:val="ListParagraph"/>
+        <w:numPr>
+          <w:ilvl w:val="2"/>
+          <w:numId w:val="6"/>
+        </w:numPr>
+      </w:pPr>
+      <w:r>
+        <w:t>User Controlled System</w:t>
+      </w:r>
+    </w:p>
+    <w:p>
+      <w:pPr>
+        <w:pStyle w:val="ListParagraph"/>
+        <w:numPr>
+          <w:ilvl w:val="1"/>
+          <w:numId w:val="6"/>
+        </w:numPr>
+      </w:pPr>
+      <w:r>
+        <w:t>Intended Users</w:t>
+      </w:r>
+    </w:p>
+    <w:p>
+      <w:pPr>
+        <w:pStyle w:val="ListParagraph"/>
+        <w:numPr>
+          <w:ilvl w:val="2"/>
+          <w:numId w:val="6"/>
+        </w:numPr>
+      </w:pPr>
+      <w:r>
+        <w:t>Civil Engineers</w:t>
+      </w:r>
+    </w:p>
+    <w:p>
+      <w:pPr>
+        <w:pStyle w:val="ListParagraph"/>
+        <w:numPr>
+          <w:ilvl w:val="2"/>
+          <w:numId w:val="6"/>
+        </w:numPr>
+      </w:pPr>
+      <w:r>
+        <w:t>City Traffic Departments</w:t>
+      </w:r>
+    </w:p>
+    <w:p>
+      <w:pPr>
+        <w:pStyle w:val="ListParagraph"/>
+        <w:numPr>
+          <w:ilvl w:val="1"/>
+          <w:numId w:val="6"/>
+        </w:numPr>
+      </w:pPr>
+      <w:r>
+        <w:t>Extent</w:t>
+      </w:r>
+    </w:p>
+    <w:p>
+      <w:pPr>
+        <w:pStyle w:val="ListParagraph"/>
+        <w:numPr>
+          <w:ilvl w:val="2"/>
+          <w:numId w:val="6"/>
+        </w:numPr>
+      </w:pPr>
+      <w:r>
+        <w:t>Complete Application for Individual Intersections</w:t>
+      </w:r>
+    </w:p>
+    <w:p>
+      <w:pPr>
+        <w:pStyle w:val="ListParagraph"/>
+        <w:numPr>
+          <w:ilvl w:val="1"/>
+          <w:numId w:val="6"/>
+        </w:numPr>
+      </w:pPr>
+      <w:r>
+        <w:t>Limitations</w:t>
+      </w:r>
+    </w:p>
+    <w:p>
+      <w:pPr>
+        <w:pStyle w:val="ListParagraph"/>
+        <w:numPr>
+          <w:ilvl w:val="2"/>
+          <w:numId w:val="6"/>
+        </w:numPr>
+      </w:pPr>
+      <w:r>
+        <w:t>Does not calculate cost</w:t>
+      </w:r>
+    </w:p>
+    <w:p>
+      <w:pPr>
+        <w:pStyle w:val="ListParagraph"/>
+        <w:numPr>
+          <w:ilvl w:val="2"/>
+          <w:numId w:val="6"/>
+        </w:numPr>
+      </w:pPr>
+      <w:r>
+        <w:t>Not a comprehensive road network</w:t>
+      </w:r>
+    </w:p>
+    <w:p>
+      <w:pPr>
+        <w:pStyle w:val="ListParagraph"/>
+        <w:numPr>
+          <w:ilvl w:val="0"/>
+          <w:numId w:val="6"/>
+        </w:numPr>
+      </w:pPr>
       <w:r>
         <w:t>Hurdles</w:t>
+      </w:r>
+    </w:p>
+    <w:p>
+      <w:pPr>
+        <w:pStyle w:val="ListParagraph"/>
+        <w:numPr>
+          <w:ilvl w:val="1"/>
+          <w:numId w:val="6"/>
+        </w:numPr>
+      </w:pPr>
+      <w:r>
+        <w:t>Acquiring Video of traffic through intersections</w:t>
+      </w:r>
+    </w:p>
+    <w:p>
+      <w:pPr>
+        <w:pStyle w:val="ListParagraph"/>
+        <w:numPr>
+          <w:ilvl w:val="1"/>
+          <w:numId w:val="6"/>
+        </w:numPr>
+      </w:pPr>
+      <w:r>
+        <w:t>Training AI Model for Safety</w:t>
+      </w:r>
+    </w:p>
+    <w:p>
+      <w:pPr>
+        <w:pStyle w:val="ListParagraph"/>
+        <w:numPr>
+          <w:ilvl w:val="1"/>
+          <w:numId w:val="6"/>
+        </w:numPr>
+      </w:pPr>
+      <w:r>
+        <w:t>Complex UI</w:t>
       </w:r>
     </w:p>
     <w:sectPr>
@@ -22,8 +192,709 @@
 </w:document>
 </file>
 
+<file path=word/numbering.xml><?xml version="1.0" encoding="utf-8"?>
+<w:numbering xmlns:wpc="http://schemas.microsoft.com/office/word/2010/wordprocessingCanvas" xmlns:cx="http://schemas.microsoft.com/office/drawing/2014/chartex" xmlns:cx1="http://schemas.microsoft.com/office/drawing/2015/9/8/chartex" xmlns:cx2="http://schemas.microsoft.com/office/drawing/2015/10/21/chartex" xmlns:cx3="http://schemas.microsoft.com/office/drawing/2016/5/9/chartex" xmlns:cx4="http://schemas.microsoft.com/office/drawing/2016/5/10/chartex" xmlns:cx5="http://schemas.microsoft.com/office/drawing/2016/5/11/chartex" xmlns:cx6="http://schemas.microsoft.com/office/drawing/2016/5/12/chartex" xmlns:cx7="http://schemas.microsoft.com/office/drawing/2016/5/13/chartex" xmlns:cx8="http://schemas.microsoft.com/office/drawing/2016/5/14/chartex" xmlns:mc="http://schemas.openxmlformats.org/markup-compatibility/2006" xmlns:aink="http://schemas.microsoft.com/office/drawing/2016/ink" xmlns:am3d="http://schemas.microsoft.com/office/drawing/2017/model3d" xmlns:o="urn:schemas-microsoft-com:office:office" xmlns:oel="http://schemas.microsoft.com/office/2019/extlst" xmlns:r="http://schemas.openxmlformats.org/officeDocument/2006/relationships" xmlns:m="http://schemas.openxmlformats.org/officeDocument/2006/math" xmlns:v="urn:schemas-microsoft-com:vml" xmlns:wp14="http://schemas.microsoft.com/office/word/2010/wordprocessingDrawing" xmlns:wp="http://schemas.openxmlformats.org/drawingml/2006/wordprocessingDrawing" xmlns:w10="urn:schemas-microsoft-com:office:word" xmlns:w="http://schemas.openxmlformats.org/wordprocessingml/2006/main" xmlns:w14="http://schemas.microsoft.com/office/word/2010/wordml" xmlns:w15="http://schemas.microsoft.com/office/word/2012/wordml" xmlns:w16cex="http://schemas.microsoft.com/office/word/2018/wordml/cex" xmlns:w16cid="http://schemas.microsoft.com/office/word/2016/wordml/cid" xmlns:w16="http://schemas.microsoft.com/office/word/2018/wordml" xmlns:w16du="http://schemas.microsoft.com/office/word/2023/wordml/word16du" xmlns:w16sdtdh="http://schemas.microsoft.com/office/word/2020/wordml/sdtdatahash" xmlns:w16sdtfl="http://schemas.microsoft.com/office/word/2024/wordml/sdtformatlock" xmlns:w16se="http://schemas.microsoft.com/office/word/2015/wordml/symex" xmlns:wpg="http://schemas.microsoft.com/office/word/2010/wordprocessingGroup" xmlns:wpi="http://schemas.microsoft.com/office/word/2010/wordprocessingInk" xmlns:wne="http://schemas.microsoft.com/office/word/2006/wordml" xmlns:wps="http://schemas.microsoft.com/office/word/2010/wordprocessingShape" mc:Ignorable="w14 w15 w16se w16cid w16 w16cex w16sdtdh w16sdtfl w16du wp14">
+  <w:abstractNum w:abstractNumId="0" w15:restartNumberingAfterBreak="0">
+    <w:nsid w:val="099703F6"/>
+    <w:multiLevelType w:val="hybridMultilevel"/>
+    <w:tmpl w:val="4998AC54"/>
+    <w:lvl w:ilvl="0" w:tplc="04090001">
+      <w:start w:val="1"/>
+      <w:numFmt w:val="bullet"/>
+      <w:lvlText w:val=""/>
+      <w:lvlJc w:val="left"/>
+      <w:pPr>
+        <w:ind w:left="720" w:hanging="360"/>
+      </w:pPr>
+      <w:rPr>
+        <w:rFonts w:ascii="Symbol" w:hAnsi="Symbol" w:hint="default"/>
+      </w:rPr>
+    </w:lvl>
+    <w:lvl w:ilvl="1" w:tplc="04090003">
+      <w:start w:val="1"/>
+      <w:numFmt w:val="bullet"/>
+      <w:lvlText w:val="o"/>
+      <w:lvlJc w:val="left"/>
+      <w:pPr>
+        <w:ind w:left="1440" w:hanging="360"/>
+      </w:pPr>
+      <w:rPr>
+        <w:rFonts w:ascii="Courier New" w:hAnsi="Courier New" w:cs="Courier New" w:hint="default"/>
+      </w:rPr>
+    </w:lvl>
+    <w:lvl w:ilvl="2" w:tplc="04090005">
+      <w:start w:val="1"/>
+      <w:numFmt w:val="bullet"/>
+      <w:lvlText w:val=""/>
+      <w:lvlJc w:val="left"/>
+      <w:pPr>
+        <w:ind w:left="2160" w:hanging="360"/>
+      </w:pPr>
+      <w:rPr>
+        <w:rFonts w:ascii="Wingdings" w:hAnsi="Wingdings" w:hint="default"/>
+      </w:rPr>
+    </w:lvl>
+    <w:lvl w:ilvl="3" w:tplc="04090001" w:tentative="1">
+      <w:start w:val="1"/>
+      <w:numFmt w:val="bullet"/>
+      <w:lvlText w:val=""/>
+      <w:lvlJc w:val="left"/>
+      <w:pPr>
+        <w:ind w:left="2880" w:hanging="360"/>
+      </w:pPr>
+      <w:rPr>
+        <w:rFonts w:ascii="Symbol" w:hAnsi="Symbol" w:hint="default"/>
+      </w:rPr>
+    </w:lvl>
+    <w:lvl w:ilvl="4" w:tplc="04090003" w:tentative="1">
+      <w:start w:val="1"/>
+      <w:numFmt w:val="bullet"/>
+      <w:lvlText w:val="o"/>
+      <w:lvlJc w:val="left"/>
+      <w:pPr>
+        <w:ind w:left="3600" w:hanging="360"/>
+      </w:pPr>
+      <w:rPr>
+        <w:rFonts w:ascii="Courier New" w:hAnsi="Courier New" w:cs="Courier New" w:hint="default"/>
+      </w:rPr>
+    </w:lvl>
+    <w:lvl w:ilvl="5" w:tplc="04090005" w:tentative="1">
+      <w:start w:val="1"/>
+      <w:numFmt w:val="bullet"/>
+      <w:lvlText w:val=""/>
+      <w:lvlJc w:val="left"/>
+      <w:pPr>
+        <w:ind w:left="4320" w:hanging="360"/>
+      </w:pPr>
+      <w:rPr>
+        <w:rFonts w:ascii="Wingdings" w:hAnsi="Wingdings" w:hint="default"/>
+      </w:rPr>
+    </w:lvl>
+    <w:lvl w:ilvl="6" w:tplc="04090001" w:tentative="1">
+      <w:start w:val="1"/>
+      <w:numFmt w:val="bullet"/>
+      <w:lvlText w:val=""/>
+      <w:lvlJc w:val="left"/>
+      <w:pPr>
+        <w:ind w:left="5040" w:hanging="360"/>
+      </w:pPr>
+      <w:rPr>
+        <w:rFonts w:ascii="Symbol" w:hAnsi="Symbol" w:hint="default"/>
+      </w:rPr>
+    </w:lvl>
+    <w:lvl w:ilvl="7" w:tplc="04090003" w:tentative="1">
+      <w:start w:val="1"/>
+      <w:numFmt w:val="bullet"/>
+      <w:lvlText w:val="o"/>
+      <w:lvlJc w:val="left"/>
+      <w:pPr>
+        <w:ind w:left="5760" w:hanging="360"/>
+      </w:pPr>
+      <w:rPr>
+        <w:rFonts w:ascii="Courier New" w:hAnsi="Courier New" w:cs="Courier New" w:hint="default"/>
+      </w:rPr>
+    </w:lvl>
+    <w:lvl w:ilvl="8" w:tplc="04090005" w:tentative="1">
+      <w:start w:val="1"/>
+      <w:numFmt w:val="bullet"/>
+      <w:lvlText w:val=""/>
+      <w:lvlJc w:val="left"/>
+      <w:pPr>
+        <w:ind w:left="6480" w:hanging="360"/>
+      </w:pPr>
+      <w:rPr>
+        <w:rFonts w:ascii="Wingdings" w:hAnsi="Wingdings" w:hint="default"/>
+      </w:rPr>
+    </w:lvl>
+  </w:abstractNum>
+  <w:abstractNum w:abstractNumId="1" w15:restartNumberingAfterBreak="0">
+    <w:nsid w:val="206166C1"/>
+    <w:multiLevelType w:val="hybridMultilevel"/>
+    <w:tmpl w:val="9F8A089E"/>
+    <w:lvl w:ilvl="0" w:tplc="04090001">
+      <w:start w:val="1"/>
+      <w:numFmt w:val="bullet"/>
+      <w:lvlText w:val=""/>
+      <w:lvlJc w:val="left"/>
+      <w:pPr>
+        <w:ind w:left="360" w:hanging="360"/>
+      </w:pPr>
+      <w:rPr>
+        <w:rFonts w:ascii="Symbol" w:hAnsi="Symbol" w:hint="default"/>
+      </w:rPr>
+    </w:lvl>
+    <w:lvl w:ilvl="1" w:tplc="04090003" w:tentative="1">
+      <w:start w:val="1"/>
+      <w:numFmt w:val="bullet"/>
+      <w:lvlText w:val="o"/>
+      <w:lvlJc w:val="left"/>
+      <w:pPr>
+        <w:ind w:left="1080" w:hanging="360"/>
+      </w:pPr>
+      <w:rPr>
+        <w:rFonts w:ascii="Courier New" w:hAnsi="Courier New" w:cs="Courier New" w:hint="default"/>
+      </w:rPr>
+    </w:lvl>
+    <w:lvl w:ilvl="2" w:tplc="04090005" w:tentative="1">
+      <w:start w:val="1"/>
+      <w:numFmt w:val="bullet"/>
+      <w:lvlText w:val=""/>
+      <w:lvlJc w:val="left"/>
+      <w:pPr>
+        <w:ind w:left="1800" w:hanging="360"/>
+      </w:pPr>
+      <w:rPr>
+        <w:rFonts w:ascii="Wingdings" w:hAnsi="Wingdings" w:hint="default"/>
+      </w:rPr>
+    </w:lvl>
+    <w:lvl w:ilvl="3" w:tplc="04090001" w:tentative="1">
+      <w:start w:val="1"/>
+      <w:numFmt w:val="bullet"/>
+      <w:lvlText w:val=""/>
+      <w:lvlJc w:val="left"/>
+      <w:pPr>
+        <w:ind w:left="2520" w:hanging="360"/>
+      </w:pPr>
+      <w:rPr>
+        <w:rFonts w:ascii="Symbol" w:hAnsi="Symbol" w:hint="default"/>
+      </w:rPr>
+    </w:lvl>
+    <w:lvl w:ilvl="4" w:tplc="04090003" w:tentative="1">
+      <w:start w:val="1"/>
+      <w:numFmt w:val="bullet"/>
+      <w:lvlText w:val="o"/>
+      <w:lvlJc w:val="left"/>
+      <w:pPr>
+        <w:ind w:left="3240" w:hanging="360"/>
+      </w:pPr>
+      <w:rPr>
+        <w:rFonts w:ascii="Courier New" w:hAnsi="Courier New" w:cs="Courier New" w:hint="default"/>
+      </w:rPr>
+    </w:lvl>
+    <w:lvl w:ilvl="5" w:tplc="04090005" w:tentative="1">
+      <w:start w:val="1"/>
+      <w:numFmt w:val="bullet"/>
+      <w:lvlText w:val=""/>
+      <w:lvlJc w:val="left"/>
+      <w:pPr>
+        <w:ind w:left="3960" w:hanging="360"/>
+      </w:pPr>
+      <w:rPr>
+        <w:rFonts w:ascii="Wingdings" w:hAnsi="Wingdings" w:hint="default"/>
+      </w:rPr>
+    </w:lvl>
+    <w:lvl w:ilvl="6" w:tplc="04090001" w:tentative="1">
+      <w:start w:val="1"/>
+      <w:numFmt w:val="bullet"/>
+      <w:lvlText w:val=""/>
+      <w:lvlJc w:val="left"/>
+      <w:pPr>
+        <w:ind w:left="4680" w:hanging="360"/>
+      </w:pPr>
+      <w:rPr>
+        <w:rFonts w:ascii="Symbol" w:hAnsi="Symbol" w:hint="default"/>
+      </w:rPr>
+    </w:lvl>
+    <w:lvl w:ilvl="7" w:tplc="04090003" w:tentative="1">
+      <w:start w:val="1"/>
+      <w:numFmt w:val="bullet"/>
+      <w:lvlText w:val="o"/>
+      <w:lvlJc w:val="left"/>
+      <w:pPr>
+        <w:ind w:left="5400" w:hanging="360"/>
+      </w:pPr>
+      <w:rPr>
+        <w:rFonts w:ascii="Courier New" w:hAnsi="Courier New" w:cs="Courier New" w:hint="default"/>
+      </w:rPr>
+    </w:lvl>
+    <w:lvl w:ilvl="8" w:tplc="04090005" w:tentative="1">
+      <w:start w:val="1"/>
+      <w:numFmt w:val="bullet"/>
+      <w:lvlText w:val=""/>
+      <w:lvlJc w:val="left"/>
+      <w:pPr>
+        <w:ind w:left="6120" w:hanging="360"/>
+      </w:pPr>
+      <w:rPr>
+        <w:rFonts w:ascii="Wingdings" w:hAnsi="Wingdings" w:hint="default"/>
+      </w:rPr>
+    </w:lvl>
+  </w:abstractNum>
+  <w:abstractNum w:abstractNumId="2" w15:restartNumberingAfterBreak="0">
+    <w:nsid w:val="43CE6B88"/>
+    <w:multiLevelType w:val="hybridMultilevel"/>
+    <w:tmpl w:val="3D94AEF6"/>
+    <w:lvl w:ilvl="0" w:tplc="04090001">
+      <w:start w:val="1"/>
+      <w:numFmt w:val="bullet"/>
+      <w:lvlText w:val=""/>
+      <w:lvlJc w:val="left"/>
+      <w:pPr>
+        <w:ind w:left="720" w:hanging="360"/>
+      </w:pPr>
+      <w:rPr>
+        <w:rFonts w:ascii="Symbol" w:hAnsi="Symbol" w:hint="default"/>
+      </w:rPr>
+    </w:lvl>
+    <w:lvl w:ilvl="1" w:tplc="04090003">
+      <w:start w:val="1"/>
+      <w:numFmt w:val="bullet"/>
+      <w:lvlText w:val="o"/>
+      <w:lvlJc w:val="left"/>
+      <w:pPr>
+        <w:ind w:left="1440" w:hanging="360"/>
+      </w:pPr>
+      <w:rPr>
+        <w:rFonts w:ascii="Courier New" w:hAnsi="Courier New" w:cs="Courier New" w:hint="default"/>
+      </w:rPr>
+    </w:lvl>
+    <w:lvl w:ilvl="2" w:tplc="04090005" w:tentative="1">
+      <w:start w:val="1"/>
+      <w:numFmt w:val="bullet"/>
+      <w:lvlText w:val=""/>
+      <w:lvlJc w:val="left"/>
+      <w:pPr>
+        <w:ind w:left="2160" w:hanging="360"/>
+      </w:pPr>
+      <w:rPr>
+        <w:rFonts w:ascii="Wingdings" w:hAnsi="Wingdings" w:hint="default"/>
+      </w:rPr>
+    </w:lvl>
+    <w:lvl w:ilvl="3" w:tplc="04090001" w:tentative="1">
+      <w:start w:val="1"/>
+      <w:numFmt w:val="bullet"/>
+      <w:lvlText w:val=""/>
+      <w:lvlJc w:val="left"/>
+      <w:pPr>
+        <w:ind w:left="2880" w:hanging="360"/>
+      </w:pPr>
+      <w:rPr>
+        <w:rFonts w:ascii="Symbol" w:hAnsi="Symbol" w:hint="default"/>
+      </w:rPr>
+    </w:lvl>
+    <w:lvl w:ilvl="4" w:tplc="04090003" w:tentative="1">
+      <w:start w:val="1"/>
+      <w:numFmt w:val="bullet"/>
+      <w:lvlText w:val="o"/>
+      <w:lvlJc w:val="left"/>
+      <w:pPr>
+        <w:ind w:left="3600" w:hanging="360"/>
+      </w:pPr>
+      <w:rPr>
+        <w:rFonts w:ascii="Courier New" w:hAnsi="Courier New" w:cs="Courier New" w:hint="default"/>
+      </w:rPr>
+    </w:lvl>
+    <w:lvl w:ilvl="5" w:tplc="04090005" w:tentative="1">
+      <w:start w:val="1"/>
+      <w:numFmt w:val="bullet"/>
+      <w:lvlText w:val=""/>
+      <w:lvlJc w:val="left"/>
+      <w:pPr>
+        <w:ind w:left="4320" w:hanging="360"/>
+      </w:pPr>
+      <w:rPr>
+        <w:rFonts w:ascii="Wingdings" w:hAnsi="Wingdings" w:hint="default"/>
+      </w:rPr>
+    </w:lvl>
+    <w:lvl w:ilvl="6" w:tplc="04090001" w:tentative="1">
+      <w:start w:val="1"/>
+      <w:numFmt w:val="bullet"/>
+      <w:lvlText w:val=""/>
+      <w:lvlJc w:val="left"/>
+      <w:pPr>
+        <w:ind w:left="5040" w:hanging="360"/>
+      </w:pPr>
+      <w:rPr>
+        <w:rFonts w:ascii="Symbol" w:hAnsi="Symbol" w:hint="default"/>
+      </w:rPr>
+    </w:lvl>
+    <w:lvl w:ilvl="7" w:tplc="04090003" w:tentative="1">
+      <w:start w:val="1"/>
+      <w:numFmt w:val="bullet"/>
+      <w:lvlText w:val="o"/>
+      <w:lvlJc w:val="left"/>
+      <w:pPr>
+        <w:ind w:left="5760" w:hanging="360"/>
+      </w:pPr>
+      <w:rPr>
+        <w:rFonts w:ascii="Courier New" w:hAnsi="Courier New" w:cs="Courier New" w:hint="default"/>
+      </w:rPr>
+    </w:lvl>
+    <w:lvl w:ilvl="8" w:tplc="04090005" w:tentative="1">
+      <w:start w:val="1"/>
+      <w:numFmt w:val="bullet"/>
+      <w:lvlText w:val=""/>
+      <w:lvlJc w:val="left"/>
+      <w:pPr>
+        <w:ind w:left="6480" w:hanging="360"/>
+      </w:pPr>
+      <w:rPr>
+        <w:rFonts w:ascii="Wingdings" w:hAnsi="Wingdings" w:hint="default"/>
+      </w:rPr>
+    </w:lvl>
+  </w:abstractNum>
+  <w:abstractNum w:abstractNumId="3" w15:restartNumberingAfterBreak="0">
+    <w:nsid w:val="5D8A4EC2"/>
+    <w:multiLevelType w:val="hybridMultilevel"/>
+    <w:tmpl w:val="4D587D8C"/>
+    <w:lvl w:ilvl="0" w:tplc="04090003">
+      <w:start w:val="1"/>
+      <w:numFmt w:val="bullet"/>
+      <w:lvlText w:val="o"/>
+      <w:lvlJc w:val="left"/>
+      <w:pPr>
+        <w:ind w:left="360" w:hanging="360"/>
+      </w:pPr>
+      <w:rPr>
+        <w:rFonts w:ascii="Courier New" w:hAnsi="Courier New" w:cs="Courier New" w:hint="default"/>
+      </w:rPr>
+    </w:lvl>
+    <w:lvl w:ilvl="1" w:tplc="04090003" w:tentative="1">
+      <w:start w:val="1"/>
+      <w:numFmt w:val="bullet"/>
+      <w:lvlText w:val="o"/>
+      <w:lvlJc w:val="left"/>
+      <w:pPr>
+        <w:ind w:left="360" w:hanging="360"/>
+      </w:pPr>
+      <w:rPr>
+        <w:rFonts w:ascii="Courier New" w:hAnsi="Courier New" w:cs="Courier New" w:hint="default"/>
+      </w:rPr>
+    </w:lvl>
+    <w:lvl w:ilvl="2" w:tplc="04090005" w:tentative="1">
+      <w:start w:val="1"/>
+      <w:numFmt w:val="bullet"/>
+      <w:lvlText w:val=""/>
+      <w:lvlJc w:val="left"/>
+      <w:pPr>
+        <w:ind w:left="1080" w:hanging="360"/>
+      </w:pPr>
+      <w:rPr>
+        <w:rFonts w:ascii="Wingdings" w:hAnsi="Wingdings" w:hint="default"/>
+      </w:rPr>
+    </w:lvl>
+    <w:lvl w:ilvl="3" w:tplc="04090001" w:tentative="1">
+      <w:start w:val="1"/>
+      <w:numFmt w:val="bullet"/>
+      <w:lvlText w:val=""/>
+      <w:lvlJc w:val="left"/>
+      <w:pPr>
+        <w:ind w:left="1800" w:hanging="360"/>
+      </w:pPr>
+      <w:rPr>
+        <w:rFonts w:ascii="Symbol" w:hAnsi="Symbol" w:hint="default"/>
+      </w:rPr>
+    </w:lvl>
+    <w:lvl w:ilvl="4" w:tplc="04090003" w:tentative="1">
+      <w:start w:val="1"/>
+      <w:numFmt w:val="bullet"/>
+      <w:lvlText w:val="o"/>
+      <w:lvlJc w:val="left"/>
+      <w:pPr>
+        <w:ind w:left="2520" w:hanging="360"/>
+      </w:pPr>
+      <w:rPr>
+        <w:rFonts w:ascii="Courier New" w:hAnsi="Courier New" w:cs="Courier New" w:hint="default"/>
+      </w:rPr>
+    </w:lvl>
+    <w:lvl w:ilvl="5" w:tplc="04090005" w:tentative="1">
+      <w:start w:val="1"/>
+      <w:numFmt w:val="bullet"/>
+      <w:lvlText w:val=""/>
+      <w:lvlJc w:val="left"/>
+      <w:pPr>
+        <w:ind w:left="3240" w:hanging="360"/>
+      </w:pPr>
+      <w:rPr>
+        <w:rFonts w:ascii="Wingdings" w:hAnsi="Wingdings" w:hint="default"/>
+      </w:rPr>
+    </w:lvl>
+    <w:lvl w:ilvl="6" w:tplc="04090001" w:tentative="1">
+      <w:start w:val="1"/>
+      <w:numFmt w:val="bullet"/>
+      <w:lvlText w:val=""/>
+      <w:lvlJc w:val="left"/>
+      <w:pPr>
+        <w:ind w:left="3960" w:hanging="360"/>
+      </w:pPr>
+      <w:rPr>
+        <w:rFonts w:ascii="Symbol" w:hAnsi="Symbol" w:hint="default"/>
+      </w:rPr>
+    </w:lvl>
+    <w:lvl w:ilvl="7" w:tplc="04090003" w:tentative="1">
+      <w:start w:val="1"/>
+      <w:numFmt w:val="bullet"/>
+      <w:lvlText w:val="o"/>
+      <w:lvlJc w:val="left"/>
+      <w:pPr>
+        <w:ind w:left="4680" w:hanging="360"/>
+      </w:pPr>
+      <w:rPr>
+        <w:rFonts w:ascii="Courier New" w:hAnsi="Courier New" w:cs="Courier New" w:hint="default"/>
+      </w:rPr>
+    </w:lvl>
+    <w:lvl w:ilvl="8" w:tplc="04090005" w:tentative="1">
+      <w:start w:val="1"/>
+      <w:numFmt w:val="bullet"/>
+      <w:lvlText w:val=""/>
+      <w:lvlJc w:val="left"/>
+      <w:pPr>
+        <w:ind w:left="5400" w:hanging="360"/>
+      </w:pPr>
+      <w:rPr>
+        <w:rFonts w:ascii="Wingdings" w:hAnsi="Wingdings" w:hint="default"/>
+      </w:rPr>
+    </w:lvl>
+  </w:abstractNum>
+  <w:abstractNum w:abstractNumId="4" w15:restartNumberingAfterBreak="0">
+    <w:nsid w:val="6FD57FF9"/>
+    <w:multiLevelType w:val="hybridMultilevel"/>
+    <w:tmpl w:val="CF48B830"/>
+    <w:lvl w:ilvl="0" w:tplc="04090001">
+      <w:start w:val="1"/>
+      <w:numFmt w:val="bullet"/>
+      <w:lvlText w:val=""/>
+      <w:lvlJc w:val="left"/>
+      <w:pPr>
+        <w:ind w:left="360" w:hanging="360"/>
+      </w:pPr>
+      <w:rPr>
+        <w:rFonts w:ascii="Symbol" w:hAnsi="Symbol" w:hint="default"/>
+      </w:rPr>
+    </w:lvl>
+    <w:lvl w:ilvl="1" w:tplc="04090003">
+      <w:start w:val="1"/>
+      <w:numFmt w:val="bullet"/>
+      <w:lvlText w:val="o"/>
+      <w:lvlJc w:val="left"/>
+      <w:pPr>
+        <w:ind w:left="360" w:hanging="360"/>
+      </w:pPr>
+      <w:rPr>
+        <w:rFonts w:ascii="Courier New" w:hAnsi="Courier New" w:cs="Courier New" w:hint="default"/>
+      </w:rPr>
+    </w:lvl>
+    <w:lvl w:ilvl="2" w:tplc="04090005">
+      <w:start w:val="1"/>
+      <w:numFmt w:val="bullet"/>
+      <w:lvlText w:val=""/>
+      <w:lvlJc w:val="left"/>
+      <w:pPr>
+        <w:ind w:left="1080" w:hanging="360"/>
+      </w:pPr>
+      <w:rPr>
+        <w:rFonts w:ascii="Wingdings" w:hAnsi="Wingdings" w:hint="default"/>
+      </w:rPr>
+    </w:lvl>
+    <w:lvl w:ilvl="3" w:tplc="04090001">
+      <w:start w:val="1"/>
+      <w:numFmt w:val="bullet"/>
+      <w:lvlText w:val=""/>
+      <w:lvlJc w:val="left"/>
+      <w:pPr>
+        <w:ind w:left="1800" w:hanging="360"/>
+      </w:pPr>
+      <w:rPr>
+        <w:rFonts w:ascii="Symbol" w:hAnsi="Symbol" w:hint="default"/>
+      </w:rPr>
+    </w:lvl>
+    <w:lvl w:ilvl="4" w:tplc="04090003" w:tentative="1">
+      <w:start w:val="1"/>
+      <w:numFmt w:val="bullet"/>
+      <w:lvlText w:val="o"/>
+      <w:lvlJc w:val="left"/>
+      <w:pPr>
+        <w:ind w:left="2520" w:hanging="360"/>
+      </w:pPr>
+      <w:rPr>
+        <w:rFonts w:ascii="Courier New" w:hAnsi="Courier New" w:cs="Courier New" w:hint="default"/>
+      </w:rPr>
+    </w:lvl>
+    <w:lvl w:ilvl="5" w:tplc="04090005" w:tentative="1">
+      <w:start w:val="1"/>
+      <w:numFmt w:val="bullet"/>
+      <w:lvlText w:val=""/>
+      <w:lvlJc w:val="left"/>
+      <w:pPr>
+        <w:ind w:left="3240" w:hanging="360"/>
+      </w:pPr>
+      <w:rPr>
+        <w:rFonts w:ascii="Wingdings" w:hAnsi="Wingdings" w:hint="default"/>
+      </w:rPr>
+    </w:lvl>
+    <w:lvl w:ilvl="6" w:tplc="04090001" w:tentative="1">
+      <w:start w:val="1"/>
+      <w:numFmt w:val="bullet"/>
+      <w:lvlText w:val=""/>
+      <w:lvlJc w:val="left"/>
+      <w:pPr>
+        <w:ind w:left="3960" w:hanging="360"/>
+      </w:pPr>
+      <w:rPr>
+        <w:rFonts w:ascii="Symbol" w:hAnsi="Symbol" w:hint="default"/>
+      </w:rPr>
+    </w:lvl>
+    <w:lvl w:ilvl="7" w:tplc="04090003" w:tentative="1">
+      <w:start w:val="1"/>
+      <w:numFmt w:val="bullet"/>
+      <w:lvlText w:val="o"/>
+      <w:lvlJc w:val="left"/>
+      <w:pPr>
+        <w:ind w:left="4680" w:hanging="360"/>
+      </w:pPr>
+      <w:rPr>
+        <w:rFonts w:ascii="Courier New" w:hAnsi="Courier New" w:cs="Courier New" w:hint="default"/>
+      </w:rPr>
+    </w:lvl>
+    <w:lvl w:ilvl="8" w:tplc="04090005" w:tentative="1">
+      <w:start w:val="1"/>
+      <w:numFmt w:val="bullet"/>
+      <w:lvlText w:val=""/>
+      <w:lvlJc w:val="left"/>
+      <w:pPr>
+        <w:ind w:left="5400" w:hanging="360"/>
+      </w:pPr>
+      <w:rPr>
+        <w:rFonts w:ascii="Wingdings" w:hAnsi="Wingdings" w:hint="default"/>
+      </w:rPr>
+    </w:lvl>
+  </w:abstractNum>
+  <w:abstractNum w:abstractNumId="5" w15:restartNumberingAfterBreak="0">
+    <w:nsid w:val="7827385A"/>
+    <w:multiLevelType w:val="hybridMultilevel"/>
+    <w:tmpl w:val="CF76A11C"/>
+    <w:lvl w:ilvl="0" w:tplc="04090001">
+      <w:start w:val="1"/>
+      <w:numFmt w:val="bullet"/>
+      <w:lvlText w:val=""/>
+      <w:lvlJc w:val="left"/>
+      <w:pPr>
+        <w:ind w:left="720" w:hanging="360"/>
+      </w:pPr>
+      <w:rPr>
+        <w:rFonts w:ascii="Symbol" w:hAnsi="Symbol" w:hint="default"/>
+      </w:rPr>
+    </w:lvl>
+    <w:lvl w:ilvl="1" w:tplc="04090003">
+      <w:start w:val="1"/>
+      <w:numFmt w:val="bullet"/>
+      <w:lvlText w:val="o"/>
+      <w:lvlJc w:val="left"/>
+      <w:pPr>
+        <w:ind w:left="1440" w:hanging="360"/>
+      </w:pPr>
+      <w:rPr>
+        <w:rFonts w:ascii="Courier New" w:hAnsi="Courier New" w:cs="Courier New" w:hint="default"/>
+      </w:rPr>
+    </w:lvl>
+    <w:lvl w:ilvl="2" w:tplc="04090005">
+      <w:start w:val="1"/>
+      <w:numFmt w:val="bullet"/>
+      <w:lvlText w:val=""/>
+      <w:lvlJc w:val="left"/>
+      <w:pPr>
+        <w:ind w:left="2160" w:hanging="360"/>
+      </w:pPr>
+      <w:rPr>
+        <w:rFonts w:ascii="Wingdings" w:hAnsi="Wingdings" w:hint="default"/>
+      </w:rPr>
+    </w:lvl>
+    <w:lvl w:ilvl="3" w:tplc="04090001">
+      <w:start w:val="1"/>
+      <w:numFmt w:val="bullet"/>
+      <w:lvlText w:val=""/>
+      <w:lvlJc w:val="left"/>
+      <w:pPr>
+        <w:ind w:left="2880" w:hanging="360"/>
+      </w:pPr>
+      <w:rPr>
+        <w:rFonts w:ascii="Symbol" w:hAnsi="Symbol" w:hint="default"/>
+      </w:rPr>
+    </w:lvl>
+    <w:lvl w:ilvl="4" w:tplc="04090003" w:tentative="1">
+      <w:start w:val="1"/>
+      <w:numFmt w:val="bullet"/>
+      <w:lvlText w:val="o"/>
+      <w:lvlJc w:val="left"/>
+      <w:pPr>
+        <w:ind w:left="3600" w:hanging="360"/>
+      </w:pPr>
+      <w:rPr>
+        <w:rFonts w:ascii="Courier New" w:hAnsi="Courier New" w:cs="Courier New" w:hint="default"/>
+      </w:rPr>
+    </w:lvl>
+    <w:lvl w:ilvl="5" w:tplc="04090005" w:tentative="1">
+      <w:start w:val="1"/>
+      <w:numFmt w:val="bullet"/>
+      <w:lvlText w:val=""/>
+      <w:lvlJc w:val="left"/>
+      <w:pPr>
+        <w:ind w:left="4320" w:hanging="360"/>
+      </w:pPr>
+      <w:rPr>
+        <w:rFonts w:ascii="Wingdings" w:hAnsi="Wingdings" w:hint="default"/>
+      </w:rPr>
+    </w:lvl>
+    <w:lvl w:ilvl="6" w:tplc="04090001" w:tentative="1">
+      <w:start w:val="1"/>
+      <w:numFmt w:val="bullet"/>
+      <w:lvlText w:val=""/>
+      <w:lvlJc w:val="left"/>
+      <w:pPr>
+        <w:ind w:left="5040" w:hanging="360"/>
+      </w:pPr>
+      <w:rPr>
+        <w:rFonts w:ascii="Symbol" w:hAnsi="Symbol" w:hint="default"/>
+      </w:rPr>
+    </w:lvl>
+    <w:lvl w:ilvl="7" w:tplc="04090003" w:tentative="1">
+      <w:start w:val="1"/>
+      <w:numFmt w:val="bullet"/>
+      <w:lvlText w:val="o"/>
+      <w:lvlJc w:val="left"/>
+      <w:pPr>
+        <w:ind w:left="5760" w:hanging="360"/>
+      </w:pPr>
+      <w:rPr>
+        <w:rFonts w:ascii="Courier New" w:hAnsi="Courier New" w:cs="Courier New" w:hint="default"/>
+      </w:rPr>
+    </w:lvl>
+    <w:lvl w:ilvl="8" w:tplc="04090005" w:tentative="1">
+      <w:start w:val="1"/>
+      <w:numFmt w:val="bullet"/>
+      <w:lvlText w:val=""/>
+      <w:lvlJc w:val="left"/>
+      <w:pPr>
+        <w:ind w:left="6480" w:hanging="360"/>
+      </w:pPr>
+      <w:rPr>
+        <w:rFonts w:ascii="Wingdings" w:hAnsi="Wingdings" w:hint="default"/>
+      </w:rPr>
+    </w:lvl>
+  </w:abstractNum>
+  <w:num w:numId="1" w16cid:durableId="827987962">
+    <w:abstractNumId w:val="5"/>
+  </w:num>
+  <w:num w:numId="2" w16cid:durableId="963000405">
+    <w:abstractNumId w:val="3"/>
+  </w:num>
+  <w:num w:numId="3" w16cid:durableId="1710181857">
+    <w:abstractNumId w:val="4"/>
+  </w:num>
+  <w:num w:numId="4" w16cid:durableId="1729067200">
+    <w:abstractNumId w:val="1"/>
+  </w:num>
+  <w:num w:numId="5" w16cid:durableId="843252723">
+    <w:abstractNumId w:val="2"/>
+  </w:num>
+  <w:num w:numId="6" w16cid:durableId="339893344">
+    <w:abstractNumId w:val="0"/>
+  </w:num>
+</w:numbering>
+</file>
+
 <file path=word/styles.xml><?xml version="1.0" encoding="utf-8"?>
-<w:styles xmlns:mc="http://schemas.openxmlformats.org/markup-compatibility/2006" xmlns:r="http://schemas.openxmlformats.org/officeDocument/2006/relationships" xmlns:w="http://schemas.openxmlformats.org/wordprocessingml/2006/main" xmlns:w14="http://schemas.microsoft.com/office/word/2010/wordml" xmlns:w15="http://schemas.microsoft.com/office/word/2012/wordml" xmlns:w16cex="http://schemas.microsoft.com/office/word/2018/wordml/cex" xmlns:w16cid="http://schemas.microsoft.com/office/word/2016/wordml/cid" xmlns:w16="http://schemas.microsoft.com/office/word/2018/wordml" xmlns:w16sdtdh="http://schemas.microsoft.com/office/word/2020/wordml/sdtdatahash" xmlns:w16se="http://schemas.microsoft.com/office/word/2015/wordml/symex" mc:Ignorable="w14 w15 w16se w16cid w16 w16cex w16sdtdh">
+<w:styles xmlns:mc="http://schemas.openxmlformats.org/markup-compatibility/2006" xmlns:r="http://schemas.openxmlformats.org/officeDocument/2006/relationships" xmlns:w="http://schemas.openxmlformats.org/wordprocessingml/2006/main" xmlns:w14="http://schemas.microsoft.com/office/word/2010/wordml" xmlns:w15="http://schemas.microsoft.com/office/word/2012/wordml" xmlns:w16cex="http://schemas.microsoft.com/office/word/2018/wordml/cex" xmlns:w16cid="http://schemas.microsoft.com/office/word/2016/wordml/cid" xmlns:w16="http://schemas.microsoft.com/office/word/2018/wordml" xmlns:w16du="http://schemas.microsoft.com/office/word/2023/wordml/word16du" xmlns:w16sdtdh="http://schemas.microsoft.com/office/word/2020/wordml/sdtdatahash" xmlns:w16sdtfl="http://schemas.microsoft.com/office/word/2024/wordml/sdtformatlock" xmlns:w16se="http://schemas.microsoft.com/office/word/2015/wordml/symex" mc:Ignorable="w14 w15 w16se w16cid w16 w16cex w16sdtdh w16sdtfl w16du">
   <w:docDefaults>
     <w:rPrDefault>
       <w:rPr>

</xml_diff>

<commit_message>
Finished the outline for the scope and hurdles
</commit_message>
<xml_diff>
--- a/Traffic Sim.docx
+++ b/Traffic Sim.docx
@@ -42,6 +42,102 @@
       <w:pPr>
         <w:pStyle w:val="ListParagraph"/>
         <w:numPr>
+          <w:ilvl w:val="3"/>
+          <w:numId w:val="6"/>
+        </w:numPr>
+      </w:pPr>
+      <w:r>
+        <w:t>Provides video</w:t>
+      </w:r>
+    </w:p>
+    <w:p>
+      <w:pPr>
+        <w:pStyle w:val="ListParagraph"/>
+        <w:numPr>
+          <w:ilvl w:val="4"/>
+          <w:numId w:val="6"/>
+        </w:numPr>
+      </w:pPr>
+      <w:r>
+        <w:t>Not required to use program</w:t>
+      </w:r>
+    </w:p>
+    <w:p>
+      <w:pPr>
+        <w:pStyle w:val="ListParagraph"/>
+        <w:numPr>
+          <w:ilvl w:val="3"/>
+          <w:numId w:val="6"/>
+        </w:numPr>
+      </w:pPr>
+      <w:r>
+        <w:t>Defines parameters</w:t>
+      </w:r>
+    </w:p>
+    <w:p>
+      <w:pPr>
+        <w:pStyle w:val="ListParagraph"/>
+        <w:numPr>
+          <w:ilvl w:val="4"/>
+          <w:numId w:val="6"/>
+        </w:numPr>
+      </w:pPr>
+      <w:r>
+        <w:t>Set or Tweak parameters</w:t>
+      </w:r>
+    </w:p>
+    <w:p>
+      <w:pPr>
+        <w:pStyle w:val="ListParagraph"/>
+        <w:numPr>
+          <w:ilvl w:val="3"/>
+          <w:numId w:val="6"/>
+        </w:numPr>
+      </w:pPr>
+      <w:r>
+        <w:t>Interacts with the AI</w:t>
+      </w:r>
+    </w:p>
+    <w:p>
+      <w:pPr>
+        <w:pStyle w:val="ListParagraph"/>
+        <w:numPr>
+          <w:ilvl w:val="4"/>
+          <w:numId w:val="6"/>
+        </w:numPr>
+      </w:pPr>
+      <w:r>
+        <w:t>Decides if the AI should run</w:t>
+      </w:r>
+    </w:p>
+    <w:p>
+      <w:pPr>
+        <w:pStyle w:val="ListParagraph"/>
+        <w:numPr>
+          <w:ilvl w:val="2"/>
+          <w:numId w:val="6"/>
+        </w:numPr>
+      </w:pPr>
+      <w:r>
+        <w:t>Data Collection for User</w:t>
+      </w:r>
+    </w:p>
+    <w:p>
+      <w:pPr>
+        <w:pStyle w:val="ListParagraph"/>
+        <w:numPr>
+          <w:ilvl w:val="3"/>
+          <w:numId w:val="6"/>
+        </w:numPr>
+      </w:pPr>
+      <w:r>
+        <w:t>Compare different simulations data</w:t>
+      </w:r>
+    </w:p>
+    <w:p>
+      <w:pPr>
+        <w:pStyle w:val="ListParagraph"/>
+        <w:numPr>
           <w:ilvl w:val="1"/>
           <w:numId w:val="6"/>
         </w:numPr>
@@ -95,7 +191,46 @@
         </w:numPr>
       </w:pPr>
       <w:r>
-        <w:t>Complete Application for Individual Intersections</w:t>
+        <w:t xml:space="preserve">Complete </w:t>
+      </w:r>
+      <w:r>
+        <w:t>Application for Individual Intersections</w:t>
+      </w:r>
+    </w:p>
+    <w:p>
+      <w:pPr>
+        <w:pStyle w:val="ListParagraph"/>
+        <w:numPr>
+          <w:ilvl w:val="3"/>
+          <w:numId w:val="6"/>
+        </w:numPr>
+      </w:pPr>
+      <w:r>
+        <w:t>Design</w:t>
+      </w:r>
+    </w:p>
+    <w:p>
+      <w:pPr>
+        <w:pStyle w:val="ListParagraph"/>
+        <w:numPr>
+          <w:ilvl w:val="3"/>
+          <w:numId w:val="6"/>
+        </w:numPr>
+      </w:pPr>
+      <w:r>
+        <w:t>Test</w:t>
+      </w:r>
+    </w:p>
+    <w:p>
+      <w:pPr>
+        <w:pStyle w:val="ListParagraph"/>
+        <w:numPr>
+          <w:ilvl w:val="3"/>
+          <w:numId w:val="6"/>
+        </w:numPr>
+      </w:pPr>
+      <w:r>
+        <w:t>Compare</w:t>
       </w:r>
     </w:p>
     <w:p>
@@ -138,6 +273,30 @@
       <w:pPr>
         <w:pStyle w:val="ListParagraph"/>
         <w:numPr>
+          <w:ilvl w:val="2"/>
+          <w:numId w:val="6"/>
+        </w:numPr>
+      </w:pPr>
+      <w:r>
+        <w:t>2 Dimensional Simulation</w:t>
+      </w:r>
+    </w:p>
+    <w:p>
+      <w:pPr>
+        <w:pStyle w:val="ListParagraph"/>
+        <w:numPr>
+          <w:ilvl w:val="2"/>
+          <w:numId w:val="6"/>
+        </w:numPr>
+      </w:pPr>
+      <w:r>
+        <w:t>Application is a tool</w:t>
+      </w:r>
+    </w:p>
+    <w:p>
+      <w:pPr>
+        <w:pStyle w:val="ListParagraph"/>
+        <w:numPr>
           <w:ilvl w:val="0"/>
           <w:numId w:val="6"/>
         </w:numPr>
@@ -155,7 +314,55 @@
         </w:numPr>
       </w:pPr>
       <w:r>
-        <w:t>Acquiring Video of traffic through intersections</w:t>
+        <w:t>Acquiring and Using Video Footage</w:t>
+      </w:r>
+    </w:p>
+    <w:p>
+      <w:pPr>
+        <w:pStyle w:val="ListParagraph"/>
+        <w:numPr>
+          <w:ilvl w:val="2"/>
+          <w:numId w:val="6"/>
+        </w:numPr>
+      </w:pPr>
+      <w:r>
+        <w:t>Footage required for testing</w:t>
+      </w:r>
+    </w:p>
+    <w:p>
+      <w:pPr>
+        <w:pStyle w:val="ListParagraph"/>
+        <w:numPr>
+          <w:ilvl w:val="3"/>
+          <w:numId w:val="6"/>
+        </w:numPr>
+      </w:pPr>
+      <w:r>
+        <w:t>Accurately tracking traffic entrance and exit lanes</w:t>
+      </w:r>
+    </w:p>
+    <w:p>
+      <w:pPr>
+        <w:pStyle w:val="ListParagraph"/>
+        <w:numPr>
+          <w:ilvl w:val="3"/>
+          <w:numId w:val="6"/>
+        </w:numPr>
+      </w:pPr>
+      <w:r>
+        <w:t>Converting video footage to useful data</w:t>
+      </w:r>
+    </w:p>
+    <w:p>
+      <w:pPr>
+        <w:pStyle w:val="ListParagraph"/>
+        <w:numPr>
+          <w:ilvl w:val="2"/>
+          <w:numId w:val="6"/>
+        </w:numPr>
+      </w:pPr>
+      <w:r>
+        <w:t>For application the user provides the video</w:t>
       </w:r>
     </w:p>
     <w:p>
@@ -167,7 +374,31 @@
         </w:numPr>
       </w:pPr>
       <w:r>
-        <w:t>Training AI Model for Safety</w:t>
+        <w:t>Complex UI</w:t>
+      </w:r>
+    </w:p>
+    <w:p>
+      <w:pPr>
+        <w:pStyle w:val="ListParagraph"/>
+        <w:numPr>
+          <w:ilvl w:val="2"/>
+          <w:numId w:val="6"/>
+        </w:numPr>
+      </w:pPr>
+      <w:r>
+        <w:t>Custom Intersection Designs</w:t>
+      </w:r>
+    </w:p>
+    <w:p>
+      <w:pPr>
+        <w:pStyle w:val="ListParagraph"/>
+        <w:numPr>
+          <w:ilvl w:val="2"/>
+          <w:numId w:val="6"/>
+        </w:numPr>
+      </w:pPr>
+      <w:r>
+        <w:t>Balance of flexibility to usability</w:t>
       </w:r>
     </w:p>
     <w:p>
@@ -179,7 +410,43 @@
         </w:numPr>
       </w:pPr>
       <w:r>
-        <w:t>Complex UI</w:t>
+        <w:t>Modeling Realistic Traffic Behavior</w:t>
+      </w:r>
+    </w:p>
+    <w:p>
+      <w:pPr>
+        <w:pStyle w:val="ListParagraph"/>
+        <w:numPr>
+          <w:ilvl w:val="2"/>
+          <w:numId w:val="6"/>
+        </w:numPr>
+      </w:pPr>
+      <w:r>
+        <w:t>Variety of behaviors in drivers</w:t>
+      </w:r>
+    </w:p>
+    <w:p>
+      <w:pPr>
+        <w:pStyle w:val="ListParagraph"/>
+        <w:numPr>
+          <w:ilvl w:val="2"/>
+          <w:numId w:val="6"/>
+        </w:numPr>
+      </w:pPr>
+      <w:r>
+        <w:t>Real people make simple mistakes</w:t>
+      </w:r>
+    </w:p>
+    <w:p>
+      <w:pPr>
+        <w:pStyle w:val="ListParagraph"/>
+        <w:numPr>
+          <w:ilvl w:val="2"/>
+          <w:numId w:val="6"/>
+        </w:numPr>
+      </w:pPr>
+      <w:r>
+        <w:t>Real people make bad decisions</w:t>
       </w:r>
     </w:p>
     <w:sectPr>
@@ -234,7 +501,7 @@
         <w:rFonts w:ascii="Wingdings" w:hAnsi="Wingdings" w:hint="default"/>
       </w:rPr>
     </w:lvl>
-    <w:lvl w:ilvl="3" w:tplc="04090001" w:tentative="1">
+    <w:lvl w:ilvl="3" w:tplc="04090001">
       <w:start w:val="1"/>
       <w:numFmt w:val="bullet"/>
       <w:lvlText w:val=""/>
@@ -246,7 +513,7 @@
         <w:rFonts w:ascii="Symbol" w:hAnsi="Symbol" w:hint="default"/>
       </w:rPr>
     </w:lvl>
-    <w:lvl w:ilvl="4" w:tplc="04090003" w:tentative="1">
+    <w:lvl w:ilvl="4" w:tplc="04090003">
       <w:start w:val="1"/>
       <w:numFmt w:val="bullet"/>
       <w:lvlText w:val="o"/>

</xml_diff>

<commit_message>
Outline for Features and AI usage
</commit_message>
<xml_diff>
--- a/Traffic Sim.docx
+++ b/Traffic Sim.docx
@@ -3,9 +3,160 @@
 <w:document xmlns:wpc="http://schemas.microsoft.com/office/word/2010/wordprocessingCanvas" xmlns:cx="http://schemas.microsoft.com/office/drawing/2014/chartex" xmlns:cx1="http://schemas.microsoft.com/office/drawing/2015/9/8/chartex" xmlns:cx2="http://schemas.microsoft.com/office/drawing/2015/10/21/chartex" xmlns:cx3="http://schemas.microsoft.com/office/drawing/2016/5/9/chartex" xmlns:cx4="http://schemas.microsoft.com/office/drawing/2016/5/10/chartex" xmlns:cx5="http://schemas.microsoft.com/office/drawing/2016/5/11/chartex" xmlns:cx6="http://schemas.microsoft.com/office/drawing/2016/5/12/chartex" xmlns:cx7="http://schemas.microsoft.com/office/drawing/2016/5/13/chartex" xmlns:cx8="http://schemas.microsoft.com/office/drawing/2016/5/14/chartex" xmlns:mc="http://schemas.openxmlformats.org/markup-compatibility/2006" xmlns:aink="http://schemas.microsoft.com/office/drawing/2016/ink" xmlns:am3d="http://schemas.microsoft.com/office/drawing/2017/model3d" xmlns:o="urn:schemas-microsoft-com:office:office" xmlns:oel="http://schemas.microsoft.com/office/2019/extlst" xmlns:r="http://schemas.openxmlformats.org/officeDocument/2006/relationships" xmlns:m="http://schemas.openxmlformats.org/officeDocument/2006/math" xmlns:v="urn:schemas-microsoft-com:vml" xmlns:wp14="http://schemas.microsoft.com/office/word/2010/wordprocessingDrawing" xmlns:wp="http://schemas.openxmlformats.org/drawingml/2006/wordprocessingDrawing" xmlns:w10="urn:schemas-microsoft-com:office:word" xmlns:w="http://schemas.openxmlformats.org/wordprocessingml/2006/main" xmlns:w14="http://schemas.microsoft.com/office/word/2010/wordml" xmlns:w15="http://schemas.microsoft.com/office/word/2012/wordml" xmlns:w16cex="http://schemas.microsoft.com/office/word/2018/wordml/cex" xmlns:w16cid="http://schemas.microsoft.com/office/word/2016/wordml/cid" xmlns:w16="http://schemas.microsoft.com/office/word/2018/wordml" xmlns:w16du="http://schemas.microsoft.com/office/word/2023/wordml/word16du" xmlns:w16sdtdh="http://schemas.microsoft.com/office/word/2020/wordml/sdtdatahash" xmlns:w16sdtfl="http://schemas.microsoft.com/office/word/2024/wordml/sdtformatlock" xmlns:w16se="http://schemas.microsoft.com/office/word/2015/wordml/symex" xmlns:wpg="http://schemas.microsoft.com/office/word/2010/wordprocessingGroup" xmlns:wpi="http://schemas.microsoft.com/office/word/2010/wordprocessingInk" xmlns:wne="http://schemas.microsoft.com/office/word/2006/wordml" xmlns:wps="http://schemas.microsoft.com/office/word/2010/wordprocessingShape" mc:Ignorable="w14 w15 w16se w16cid w16 w16cex w16sdtdh w16sdtfl w16du wp14">
   <w:body>
     <w:p>
+      <w:pPr>
+        <w:pStyle w:val="Heading1"/>
+        <w:jc w:val="center"/>
+      </w:pPr>
       <w:r>
-        <w:t>things</w:t>
+        <w:t>Features</w:t>
       </w:r>
+    </w:p>
+    <w:p>
+      <w:pPr>
+        <w:pStyle w:val="ListParagraph"/>
+        <w:numPr>
+          <w:ilvl w:val="0"/>
+          <w:numId w:val="1"/>
+        </w:numPr>
+      </w:pPr>
+      <w:r>
+        <w:t>Base features:</w:t>
+      </w:r>
+    </w:p>
+    <w:p>
+      <w:pPr>
+        <w:pStyle w:val="ListParagraph"/>
+        <w:numPr>
+          <w:ilvl w:val="1"/>
+          <w:numId w:val="1"/>
+        </w:numPr>
+      </w:pPr>
+      <w:r>
+        <w:t>Ability to draw intersections</w:t>
+      </w:r>
+    </w:p>
+    <w:p>
+      <w:pPr>
+        <w:pStyle w:val="ListParagraph"/>
+        <w:numPr>
+          <w:ilvl w:val="1"/>
+          <w:numId w:val="1"/>
+        </w:numPr>
+      </w:pPr>
+      <w:r>
+        <w:t>Run simulations on created intersections</w:t>
+      </w:r>
+    </w:p>
+    <w:p>
+      <w:pPr>
+        <w:pStyle w:val="ListParagraph"/>
+        <w:numPr>
+          <w:ilvl w:val="1"/>
+          <w:numId w:val="1"/>
+        </w:numPr>
+      </w:pPr>
+      <w:r>
+        <w:t>Get diagnostics back from simulation</w:t>
+      </w:r>
+    </w:p>
+    <w:p>
+      <w:pPr>
+        <w:pStyle w:val="ListParagraph"/>
+        <w:numPr>
+          <w:ilvl w:val="0"/>
+          <w:numId w:val="1"/>
+        </w:numPr>
+      </w:pPr>
+      <w:r>
+        <w:t>Stretch Goals:</w:t>
+      </w:r>
+    </w:p>
+    <w:p>
+      <w:pPr>
+        <w:pStyle w:val="ListParagraph"/>
+        <w:numPr>
+          <w:ilvl w:val="1"/>
+          <w:numId w:val="1"/>
+        </w:numPr>
+      </w:pPr>
+      <w:r>
+        <w:t>Upload video footage to track cars going in directions to accurately run simulation on real data</w:t>
+      </w:r>
+    </w:p>
+    <w:p>
+      <w:pPr>
+        <w:pStyle w:val="ListParagraph"/>
+        <w:numPr>
+          <w:ilvl w:val="1"/>
+          <w:numId w:val="1"/>
+        </w:numPr>
+      </w:pPr>
+      <w:r>
+        <w:t>AI iterate through many types of intersections to find the best one</w:t>
+      </w:r>
+    </w:p>
+    <w:p/>
+    <w:p>
+      <w:r>
+        <w:t>Will write more after meeting with Ashton Greer.</w:t>
+      </w:r>
+    </w:p>
+    <w:p>
+      <w:r>
+        <w:br w:type="page"/>
+      </w:r>
+    </w:p>
+    <w:p>
+      <w:pPr>
+        <w:pStyle w:val="Heading1"/>
+        <w:jc w:val="center"/>
+      </w:pPr>
+      <w:r>
+        <w:lastRenderedPageBreak/>
+        <w:t>AI Usage</w:t>
+      </w:r>
+    </w:p>
+    <w:p/>
+    <w:p>
+      <w:pPr>
+        <w:pStyle w:val="ListParagraph"/>
+        <w:numPr>
+          <w:ilvl w:val="0"/>
+          <w:numId w:val="2"/>
+        </w:numPr>
+      </w:pPr>
+      <w:r>
+        <w:t>Dependent on feature set</w:t>
+      </w:r>
+    </w:p>
+    <w:p>
+      <w:pPr>
+        <w:pStyle w:val="ListParagraph"/>
+        <w:numPr>
+          <w:ilvl w:val="0"/>
+          <w:numId w:val="2"/>
+        </w:numPr>
+      </w:pPr>
+      <w:r>
+        <w:t>Decent amount of AI usage would make stretch goals easier to achieve</w:t>
+      </w:r>
+    </w:p>
+    <w:p>
+      <w:pPr>
+        <w:pStyle w:val="ListParagraph"/>
+        <w:numPr>
+          <w:ilvl w:val="0"/>
+          <w:numId w:val="2"/>
+        </w:numPr>
+      </w:pPr>
+      <w:r>
+        <w:t>Will find out more after meeting with Ashton Greer</w:t>
+      </w:r>
+    </w:p>
+    <w:p>
+      <w:pPr>
+        <w:pStyle w:val="ListParagraph"/>
+      </w:pPr>
     </w:p>
     <w:sectPr>
       <w:pgSz w:w="12240" w:h="15840"/>
@@ -15,6 +166,243 @@
     </w:sectPr>
   </w:body>
 </w:document>
+</file>
+
+<file path=word/numbering.xml><?xml version="1.0" encoding="utf-8"?>
+<w:numbering xmlns:wpc="http://schemas.microsoft.com/office/word/2010/wordprocessingCanvas" xmlns:cx="http://schemas.microsoft.com/office/drawing/2014/chartex" xmlns:cx1="http://schemas.microsoft.com/office/drawing/2015/9/8/chartex" xmlns:cx2="http://schemas.microsoft.com/office/drawing/2015/10/21/chartex" xmlns:cx3="http://schemas.microsoft.com/office/drawing/2016/5/9/chartex" xmlns:cx4="http://schemas.microsoft.com/office/drawing/2016/5/10/chartex" xmlns:cx5="http://schemas.microsoft.com/office/drawing/2016/5/11/chartex" xmlns:cx6="http://schemas.microsoft.com/office/drawing/2016/5/12/chartex" xmlns:cx7="http://schemas.microsoft.com/office/drawing/2016/5/13/chartex" xmlns:cx8="http://schemas.microsoft.com/office/drawing/2016/5/14/chartex" xmlns:mc="http://schemas.openxmlformats.org/markup-compatibility/2006" xmlns:aink="http://schemas.microsoft.com/office/drawing/2016/ink" xmlns:am3d="http://schemas.microsoft.com/office/drawing/2017/model3d" xmlns:o="urn:schemas-microsoft-com:office:office" xmlns:oel="http://schemas.microsoft.com/office/2019/extlst" xmlns:r="http://schemas.openxmlformats.org/officeDocument/2006/relationships" xmlns:m="http://schemas.openxmlformats.org/officeDocument/2006/math" xmlns:v="urn:schemas-microsoft-com:vml" xmlns:wp14="http://schemas.microsoft.com/office/word/2010/wordprocessingDrawing" xmlns:wp="http://schemas.openxmlformats.org/drawingml/2006/wordprocessingDrawing" xmlns:w10="urn:schemas-microsoft-com:office:word" xmlns:w="http://schemas.openxmlformats.org/wordprocessingml/2006/main" xmlns:w14="http://schemas.microsoft.com/office/word/2010/wordml" xmlns:w15="http://schemas.microsoft.com/office/word/2012/wordml" xmlns:w16cex="http://schemas.microsoft.com/office/word/2018/wordml/cex" xmlns:w16cid="http://schemas.microsoft.com/office/word/2016/wordml/cid" xmlns:w16="http://schemas.microsoft.com/office/word/2018/wordml" xmlns:w16du="http://schemas.microsoft.com/office/word/2023/wordml/word16du" xmlns:w16sdtdh="http://schemas.microsoft.com/office/word/2020/wordml/sdtdatahash" xmlns:w16sdtfl="http://schemas.microsoft.com/office/word/2024/wordml/sdtformatlock" xmlns:w16se="http://schemas.microsoft.com/office/word/2015/wordml/symex" xmlns:wpg="http://schemas.microsoft.com/office/word/2010/wordprocessingGroup" xmlns:wpi="http://schemas.microsoft.com/office/word/2010/wordprocessingInk" xmlns:wne="http://schemas.microsoft.com/office/word/2006/wordml" xmlns:wps="http://schemas.microsoft.com/office/word/2010/wordprocessingShape" mc:Ignorable="w14 w15 w16se w16cid w16 w16cex w16sdtdh w16sdtfl w16du wp14">
+  <w:abstractNum w:abstractNumId="0" w15:restartNumberingAfterBreak="0">
+    <w:nsid w:val="733E6C0C"/>
+    <w:multiLevelType w:val="hybridMultilevel"/>
+    <w:tmpl w:val="AEB85F46"/>
+    <w:lvl w:ilvl="0" w:tplc="04090001">
+      <w:start w:val="1"/>
+      <w:numFmt w:val="bullet"/>
+      <w:lvlText w:val=""/>
+      <w:lvlJc w:val="left"/>
+      <w:pPr>
+        <w:ind w:left="720" w:hanging="360"/>
+      </w:pPr>
+      <w:rPr>
+        <w:rFonts w:ascii="Symbol" w:hAnsi="Symbol" w:hint="default"/>
+      </w:rPr>
+    </w:lvl>
+    <w:lvl w:ilvl="1" w:tplc="04090003">
+      <w:start w:val="1"/>
+      <w:numFmt w:val="bullet"/>
+      <w:lvlText w:val="o"/>
+      <w:lvlJc w:val="left"/>
+      <w:pPr>
+        <w:ind w:left="1440" w:hanging="360"/>
+      </w:pPr>
+      <w:rPr>
+        <w:rFonts w:ascii="Courier New" w:hAnsi="Courier New" w:cs="Courier New" w:hint="default"/>
+      </w:rPr>
+    </w:lvl>
+    <w:lvl w:ilvl="2" w:tplc="04090005">
+      <w:start w:val="1"/>
+      <w:numFmt w:val="bullet"/>
+      <w:lvlText w:val=""/>
+      <w:lvlJc w:val="left"/>
+      <w:pPr>
+        <w:ind w:left="2160" w:hanging="360"/>
+      </w:pPr>
+      <w:rPr>
+        <w:rFonts w:ascii="Wingdings" w:hAnsi="Wingdings" w:hint="default"/>
+      </w:rPr>
+    </w:lvl>
+    <w:lvl w:ilvl="3" w:tplc="04090001" w:tentative="1">
+      <w:start w:val="1"/>
+      <w:numFmt w:val="bullet"/>
+      <w:lvlText w:val=""/>
+      <w:lvlJc w:val="left"/>
+      <w:pPr>
+        <w:ind w:left="2880" w:hanging="360"/>
+      </w:pPr>
+      <w:rPr>
+        <w:rFonts w:ascii="Symbol" w:hAnsi="Symbol" w:hint="default"/>
+      </w:rPr>
+    </w:lvl>
+    <w:lvl w:ilvl="4" w:tplc="04090003" w:tentative="1">
+      <w:start w:val="1"/>
+      <w:numFmt w:val="bullet"/>
+      <w:lvlText w:val="o"/>
+      <w:lvlJc w:val="left"/>
+      <w:pPr>
+        <w:ind w:left="3600" w:hanging="360"/>
+      </w:pPr>
+      <w:rPr>
+        <w:rFonts w:ascii="Courier New" w:hAnsi="Courier New" w:cs="Courier New" w:hint="default"/>
+      </w:rPr>
+    </w:lvl>
+    <w:lvl w:ilvl="5" w:tplc="04090005" w:tentative="1">
+      <w:start w:val="1"/>
+      <w:numFmt w:val="bullet"/>
+      <w:lvlText w:val=""/>
+      <w:lvlJc w:val="left"/>
+      <w:pPr>
+        <w:ind w:left="4320" w:hanging="360"/>
+      </w:pPr>
+      <w:rPr>
+        <w:rFonts w:ascii="Wingdings" w:hAnsi="Wingdings" w:hint="default"/>
+      </w:rPr>
+    </w:lvl>
+    <w:lvl w:ilvl="6" w:tplc="04090001" w:tentative="1">
+      <w:start w:val="1"/>
+      <w:numFmt w:val="bullet"/>
+      <w:lvlText w:val=""/>
+      <w:lvlJc w:val="left"/>
+      <w:pPr>
+        <w:ind w:left="5040" w:hanging="360"/>
+      </w:pPr>
+      <w:rPr>
+        <w:rFonts w:ascii="Symbol" w:hAnsi="Symbol" w:hint="default"/>
+      </w:rPr>
+    </w:lvl>
+    <w:lvl w:ilvl="7" w:tplc="04090003" w:tentative="1">
+      <w:start w:val="1"/>
+      <w:numFmt w:val="bullet"/>
+      <w:lvlText w:val="o"/>
+      <w:lvlJc w:val="left"/>
+      <w:pPr>
+        <w:ind w:left="5760" w:hanging="360"/>
+      </w:pPr>
+      <w:rPr>
+        <w:rFonts w:ascii="Courier New" w:hAnsi="Courier New" w:cs="Courier New" w:hint="default"/>
+      </w:rPr>
+    </w:lvl>
+    <w:lvl w:ilvl="8" w:tplc="04090005" w:tentative="1">
+      <w:start w:val="1"/>
+      <w:numFmt w:val="bullet"/>
+      <w:lvlText w:val=""/>
+      <w:lvlJc w:val="left"/>
+      <w:pPr>
+        <w:ind w:left="6480" w:hanging="360"/>
+      </w:pPr>
+      <w:rPr>
+        <w:rFonts w:ascii="Wingdings" w:hAnsi="Wingdings" w:hint="default"/>
+      </w:rPr>
+    </w:lvl>
+  </w:abstractNum>
+  <w:abstractNum w:abstractNumId="1" w15:restartNumberingAfterBreak="0">
+    <w:nsid w:val="776E172A"/>
+    <w:multiLevelType w:val="hybridMultilevel"/>
+    <w:tmpl w:val="D21E8786"/>
+    <w:lvl w:ilvl="0" w:tplc="04090001">
+      <w:start w:val="1"/>
+      <w:numFmt w:val="bullet"/>
+      <w:lvlText w:val=""/>
+      <w:lvlJc w:val="left"/>
+      <w:pPr>
+        <w:ind w:left="720" w:hanging="360"/>
+      </w:pPr>
+      <w:rPr>
+        <w:rFonts w:ascii="Symbol" w:hAnsi="Symbol" w:hint="default"/>
+      </w:rPr>
+    </w:lvl>
+    <w:lvl w:ilvl="1" w:tplc="04090003" w:tentative="1">
+      <w:start w:val="1"/>
+      <w:numFmt w:val="bullet"/>
+      <w:lvlText w:val="o"/>
+      <w:lvlJc w:val="left"/>
+      <w:pPr>
+        <w:ind w:left="1440" w:hanging="360"/>
+      </w:pPr>
+      <w:rPr>
+        <w:rFonts w:ascii="Courier New" w:hAnsi="Courier New" w:cs="Courier New" w:hint="default"/>
+      </w:rPr>
+    </w:lvl>
+    <w:lvl w:ilvl="2" w:tplc="04090005" w:tentative="1">
+      <w:start w:val="1"/>
+      <w:numFmt w:val="bullet"/>
+      <w:lvlText w:val=""/>
+      <w:lvlJc w:val="left"/>
+      <w:pPr>
+        <w:ind w:left="2160" w:hanging="360"/>
+      </w:pPr>
+      <w:rPr>
+        <w:rFonts w:ascii="Wingdings" w:hAnsi="Wingdings" w:hint="default"/>
+      </w:rPr>
+    </w:lvl>
+    <w:lvl w:ilvl="3" w:tplc="04090001" w:tentative="1">
+      <w:start w:val="1"/>
+      <w:numFmt w:val="bullet"/>
+      <w:lvlText w:val=""/>
+      <w:lvlJc w:val="left"/>
+      <w:pPr>
+        <w:ind w:left="2880" w:hanging="360"/>
+      </w:pPr>
+      <w:rPr>
+        <w:rFonts w:ascii="Symbol" w:hAnsi="Symbol" w:hint="default"/>
+      </w:rPr>
+    </w:lvl>
+    <w:lvl w:ilvl="4" w:tplc="04090003" w:tentative="1">
+      <w:start w:val="1"/>
+      <w:numFmt w:val="bullet"/>
+      <w:lvlText w:val="o"/>
+      <w:lvlJc w:val="left"/>
+      <w:pPr>
+        <w:ind w:left="3600" w:hanging="360"/>
+      </w:pPr>
+      <w:rPr>
+        <w:rFonts w:ascii="Courier New" w:hAnsi="Courier New" w:cs="Courier New" w:hint="default"/>
+      </w:rPr>
+    </w:lvl>
+    <w:lvl w:ilvl="5" w:tplc="04090005" w:tentative="1">
+      <w:start w:val="1"/>
+      <w:numFmt w:val="bullet"/>
+      <w:lvlText w:val=""/>
+      <w:lvlJc w:val="left"/>
+      <w:pPr>
+        <w:ind w:left="4320" w:hanging="360"/>
+      </w:pPr>
+      <w:rPr>
+        <w:rFonts w:ascii="Wingdings" w:hAnsi="Wingdings" w:hint="default"/>
+      </w:rPr>
+    </w:lvl>
+    <w:lvl w:ilvl="6" w:tplc="04090001" w:tentative="1">
+      <w:start w:val="1"/>
+      <w:numFmt w:val="bullet"/>
+      <w:lvlText w:val=""/>
+      <w:lvlJc w:val="left"/>
+      <w:pPr>
+        <w:ind w:left="5040" w:hanging="360"/>
+      </w:pPr>
+      <w:rPr>
+        <w:rFonts w:ascii="Symbol" w:hAnsi="Symbol" w:hint="default"/>
+      </w:rPr>
+    </w:lvl>
+    <w:lvl w:ilvl="7" w:tplc="04090003" w:tentative="1">
+      <w:start w:val="1"/>
+      <w:numFmt w:val="bullet"/>
+      <w:lvlText w:val="o"/>
+      <w:lvlJc w:val="left"/>
+      <w:pPr>
+        <w:ind w:left="5760" w:hanging="360"/>
+      </w:pPr>
+      <w:rPr>
+        <w:rFonts w:ascii="Courier New" w:hAnsi="Courier New" w:cs="Courier New" w:hint="default"/>
+      </w:rPr>
+    </w:lvl>
+    <w:lvl w:ilvl="8" w:tplc="04090005" w:tentative="1">
+      <w:start w:val="1"/>
+      <w:numFmt w:val="bullet"/>
+      <w:lvlText w:val=""/>
+      <w:lvlJc w:val="left"/>
+      <w:pPr>
+        <w:ind w:left="6480" w:hanging="360"/>
+      </w:pPr>
+      <w:rPr>
+        <w:rFonts w:ascii="Wingdings" w:hAnsi="Wingdings" w:hint="default"/>
+      </w:rPr>
+    </w:lvl>
+  </w:abstractNum>
+  <w:num w:numId="1" w16cid:durableId="884100200">
+    <w:abstractNumId w:val="0"/>
+  </w:num>
+  <w:num w:numId="2" w16cid:durableId="394278394">
+    <w:abstractNumId w:val="1"/>
+  </w:num>
+</w:numbering>
 </file>
 
 <file path=word/styles.xml><?xml version="1.0" encoding="utf-8"?>

</xml_diff>

<commit_message>
Finished the rough draft of the scope section of the project proposal
</commit_message>
<xml_diff>
--- a/Traffic Sim.docx
+++ b/Traffic Sim.docx
@@ -4,6 +4,64 @@
   <w:body>
     <w:p>
       <w:pPr>
+        <w:pStyle w:val="Heading1"/>
+      </w:pPr>
+      <w:r>
+        <w:t>Scope</w:t>
+      </w:r>
+    </w:p>
+    <w:p>
+      <w:r>
+        <w:tab/>
+        <w:t>The scope of the project is to develop an intersection traffic control simulation system that allows the user to create, design, and evaluate different layouts for an intersection.  The simulation parameters are defined by the user through either manual inputs or an automatic system that deciphers the parameters from video footage.  We will also train an AI assistant for the user who can</w:t>
+      </w:r>
+      <w:r>
+        <w:t xml:space="preserve"> assist with trying to determine the optimal type of intersection.</w:t>
+      </w:r>
+      <w:r>
+        <w:t xml:space="preserve">  The program will collect and compare the different simulations data for the user.</w:t>
+      </w:r>
+    </w:p>
+    <w:p>
+      <w:r>
+        <w:tab/>
+        <w:t>The primary user base for our program will be professional</w:t>
+      </w:r>
+      <w:r>
+        <w:t>s.  The users intended to have some knowledge of intersections and some plans on what might be done to improve them.  The program’s purpose is to be used as a tool for professionals to do preliminary testing of an intersection in a virtual environment.  These professionals being Civil Engineers</w:t>
+      </w:r>
+      <w:r>
+        <w:t>, Highway Design Engineers, or City Traffic Departments.</w:t>
+      </w:r>
+    </w:p>
+    <w:p>
+      <w:r>
+        <w:tab/>
+        <w:t xml:space="preserve">The programs will have some limitations by design.  The biggest limitation will be using a </w:t>
+      </w:r>
+      <w:r>
+        <w:t>two-dimensional</w:t>
+      </w:r>
+      <w:r>
+        <w:t xml:space="preserve"> space for simulating how traffic will flow through </w:t>
+      </w:r>
+      <w:r>
+        <w:t>intersections</w:t>
+      </w:r>
+      <w:r>
+        <w:t xml:space="preserve">.  </w:t>
+      </w:r>
+      <w:r>
+        <w:t>Furthermore, our simulation won’t contain a comprehensive network of roads and intersections.  This program isn’t for simulating all the intersections in an entire town at once.  We also don’t currently have any plans for implementing a calculation for the cost of the intersection designed.</w:t>
+      </w:r>
+    </w:p>
+    <w:p>
+      <w:r>
+        <w:br w:type="page"/>
+      </w:r>
+    </w:p>
+    <w:p>
+      <w:pPr>
         <w:pStyle w:val="ListParagraph"/>
         <w:numPr>
           <w:ilvl w:val="0"/>
@@ -11,6 +69,7 @@
         </w:numPr>
       </w:pPr>
       <w:r>
+        <w:lastRenderedPageBreak/>
         <w:t>Scope</w:t>
       </w:r>
     </w:p>

</xml_diff>

<commit_message>
Completed half of the hurdles section of the project proposal rough draft
</commit_message>
<xml_diff>
--- a/Traffic Sim.docx
+++ b/Traffic Sim.docx
@@ -56,7 +56,47 @@
       </w:r>
     </w:p>
     <w:p>
-      <w:r>
+      <w:pPr>
+        <w:pStyle w:val="Heading1"/>
+      </w:pPr>
+      <w:r>
+        <w:t>Hurdles</w:t>
+      </w:r>
+    </w:p>
+    <w:p>
+      <w:r>
+        <w:tab/>
+        <w:t xml:space="preserve">The project concept has several potential hurdles we will need to overcome to accomplish our goals.  To start with, this project will require a robust </w:t>
+      </w:r>
+      <w:r>
+        <w:t xml:space="preserve">GUI that has the flexibility that allows users to design whatever kind of intersection they can imagine.  While also being easy enough to use that completing these designs in the program is likely.  </w:t>
+      </w:r>
+      <w:r>
+        <w:t xml:space="preserve">Our team doesn’t have anyone who has developed a GUI </w:t>
+      </w:r>
+      <w:proofErr w:type="gramStart"/>
+      <w:r>
+        <w:t>like this</w:t>
+      </w:r>
+      <w:proofErr w:type="gramEnd"/>
+      <w:r>
+        <w:t xml:space="preserve"> before, but we all have some basic GUI design knowledge.</w:t>
+      </w:r>
+    </w:p>
+    <w:p>
+      <w:r>
+        <w:tab/>
+      </w:r>
+      <w:r>
+        <w:t xml:space="preserve">Another hurdle for this project is the simulation itself.  This is a core aspect of the project.  Therefore, our program needs to be able to model realistic traffic behavior in simulations.  The struggle with </w:t>
+      </w:r>
+      <w:r>
+        <w:t>this is estimating human driving behavior which includes mistakes and bad decision making and accurately implementing this into our simulated drivers.  Overcoming this hurdle will require some extensive research on human behavior and cohesive algorithm designs for building our simulations.</w:t>
+      </w:r>
+    </w:p>
+    <w:p>
+      <w:r>
+        <w:lastRenderedPageBreak/>
         <w:br w:type="page"/>
       </w:r>
     </w:p>
@@ -409,7 +449,15 @@
         </w:numPr>
       </w:pPr>
       <w:r>
-        <w:t>Converting video footage to useful data</w:t>
+        <w:t xml:space="preserve">Converting video footage </w:t>
+      </w:r>
+      <w:proofErr w:type="gramStart"/>
+      <w:r>
+        <w:t>to</w:t>
+      </w:r>
+      <w:proofErr w:type="gramEnd"/>
+      <w:r>
+        <w:t xml:space="preserve"> useful data</w:t>
       </w:r>
     </w:p>
     <w:p>

</xml_diff>

<commit_message>
Completed the rest of the hurdles section of the project proposal rough draft
</commit_message>
<xml_diff>
--- a/Traffic Sim.docx
+++ b/Traffic Sim.docx
@@ -72,15 +72,7 @@
         <w:t xml:space="preserve">GUI that has the flexibility that allows users to design whatever kind of intersection they can imagine.  While also being easy enough to use that completing these designs in the program is likely.  </w:t>
       </w:r>
       <w:r>
-        <w:t xml:space="preserve">Our team doesn’t have anyone who has developed a GUI </w:t>
-      </w:r>
-      <w:proofErr w:type="gramStart"/>
-      <w:r>
-        <w:t>like this</w:t>
-      </w:r>
-      <w:proofErr w:type="gramEnd"/>
-      <w:r>
-        <w:t xml:space="preserve"> before, but we all have some basic GUI design knowledge.</w:t>
+        <w:t>Our team doesn’t have anyone who has developed a GUI like this before, but we all have some basic GUI design knowledge.</w:t>
       </w:r>
     </w:p>
     <w:p>
@@ -97,6 +89,41 @@
     <w:p>
       <w:r>
         <w:lastRenderedPageBreak/>
+        <w:tab/>
+        <w:t>Thirdly, decoding video footage in a way to acquire useful data for our program poses a challenge.  Our current concept is to utilize AI to track what lanes cars are coming from and which lanes they are traveling to.  It is important that this tracking is accurate otherwise the convenience this feature offers the user will be nullified.  This is likely to be the hardest feature to test since it will require video coverage of intersections</w:t>
+      </w:r>
+      <w:r>
+        <w:t xml:space="preserve"> that we don’t currently </w:t>
+      </w:r>
+      <w:r>
+        <w:t>possess</w:t>
+      </w:r>
+      <w:r>
+        <w:t>.</w:t>
+      </w:r>
+      <w:r>
+        <w:t xml:space="preserve">  Overcoming this hurdle will help how fast we can test other parts of the program.</w:t>
+      </w:r>
+    </w:p>
+    <w:p>
+      <w:r>
+        <w:tab/>
+      </w:r>
+      <w:r>
+        <w:t>The last big hurdle is the AI assistant.  We need to train it to look for efficiency and safety in the intersections it determines should be tested.  The AI needs to be capable of identifying safety concerns and providing potential implementations for overcoming them.  To ensure sufficient enough training for an AI assistant we will need access to a large quantity of proper safety data and a variety of intersection efficiency data.</w:t>
+      </w:r>
+      <w:r>
+        <w:t xml:space="preserve">  This feature has the biggest risk of needing </w:t>
+      </w:r>
+      <w:r>
+        <w:t>to be altered</w:t>
+      </w:r>
+      <w:r>
+        <w:t xml:space="preserve"> based on how much data we are able to acquire.</w:t>
+      </w:r>
+    </w:p>
+    <w:p>
+      <w:r>
         <w:br w:type="page"/>
       </w:r>
     </w:p>
@@ -449,15 +476,7 @@
         </w:numPr>
       </w:pPr>
       <w:r>
-        <w:t xml:space="preserve">Converting video footage </w:t>
-      </w:r>
-      <w:proofErr w:type="gramStart"/>
-      <w:r>
-        <w:t>to</w:t>
-      </w:r>
-      <w:proofErr w:type="gramEnd"/>
-      <w:r>
-        <w:t xml:space="preserve"> useful data</w:t>
+        <w:t>Converting video footage to useful data</w:t>
       </w:r>
     </w:p>
     <w:p>

</xml_diff>

<commit_message>
gitignore temp files,  ToC updated
</commit_message>
<xml_diff>
--- a/Traffic Sim.docx
+++ b/Traffic Sim.docx
@@ -54,7 +54,7 @@
           <w:r>
             <w:fldChar w:fldCharType="separate"/>
           </w:r>
-          <w:hyperlink w:anchor="_Toc243479579" w:history="1">
+          <w:hyperlink w:anchor="_Toc243555807" w:history="1">
             <w:r>
               <w:rPr>
                 <w:rStyle w:val="Hyperlink"/>
@@ -81,7 +81,7 @@
                 <w:noProof/>
                 <w:webHidden/>
               </w:rPr>
-              <w:instrText xml:space="preserve"> PAGEREF _Toc243479579 \h </w:instrText>
+              <w:instrText xml:space="preserve"> PAGEREF _Toc243555807 \h </w:instrText>
             </w:r>
             <w:r>
               <w:rPr>
@@ -122,13 +122,13 @@
               <w:noProof/>
             </w:rPr>
           </w:pPr>
-          <w:hyperlink w:anchor="_Toc243479580" w:history="1">
+          <w:hyperlink w:anchor="_Toc243555808" w:history="1">
             <w:r>
               <w:rPr>
                 <w:rStyle w:val="Hyperlink"/>
                 <w:noProof/>
               </w:rPr>
-              <w:t>Road network builder</w:t>
+              <w:t>Road Network Builder</w:t>
             </w:r>
             <w:r>
               <w:rPr>
@@ -149,7 +149,7 @@
                 <w:noProof/>
                 <w:webHidden/>
               </w:rPr>
-              <w:instrText xml:space="preserve"> PAGEREF _Toc243479580 \h </w:instrText>
+              <w:instrText xml:space="preserve"> PAGEREF _Toc243555808 \h </w:instrText>
             </w:r>
             <w:r>
               <w:rPr>
@@ -190,7 +190,7 @@
               <w:noProof/>
             </w:rPr>
           </w:pPr>
-          <w:hyperlink w:anchor="_Toc243479581" w:history="1">
+          <w:hyperlink w:anchor="_Toc243555809" w:history="1">
             <w:r>
               <w:rPr>
                 <w:rStyle w:val="Hyperlink"/>
@@ -217,7 +217,7 @@
                 <w:noProof/>
                 <w:webHidden/>
               </w:rPr>
-              <w:instrText xml:space="preserve"> PAGEREF _Toc243479581 \h </w:instrText>
+              <w:instrText xml:space="preserve"> PAGEREF _Toc243555809 \h </w:instrText>
             </w:r>
             <w:r>
               <w:rPr>
@@ -258,13 +258,13 @@
               <w:noProof/>
             </w:rPr>
           </w:pPr>
-          <w:hyperlink w:anchor="_Toc243479582" w:history="1">
+          <w:hyperlink w:anchor="_Toc243555810" w:history="1">
             <w:r>
               <w:rPr>
                 <w:rStyle w:val="Hyperlink"/>
                 <w:noProof/>
               </w:rPr>
-              <w:t>Adjustable traffic volume</w:t>
+              <w:t>Adjustable Traffic Volume</w:t>
             </w:r>
             <w:r>
               <w:rPr>
@@ -285,7 +285,7 @@
                 <w:noProof/>
                 <w:webHidden/>
               </w:rPr>
-              <w:instrText xml:space="preserve"> PAGEREF _Toc243479582 \h </w:instrText>
+              <w:instrText xml:space="preserve"> PAGEREF _Toc243555810 \h </w:instrText>
             </w:r>
             <w:r>
               <w:rPr>
@@ -326,7 +326,7 @@
               <w:noProof/>
             </w:rPr>
           </w:pPr>
-          <w:hyperlink w:anchor="_Toc243479583" w:history="1">
+          <w:hyperlink w:anchor="_Toc243555811" w:history="1">
             <w:r>
               <w:rPr>
                 <w:rStyle w:val="Hyperlink"/>
@@ -353,7 +353,7 @@
                 <w:noProof/>
                 <w:webHidden/>
               </w:rPr>
-              <w:instrText xml:space="preserve"> PAGEREF _Toc243479583 \h </w:instrText>
+              <w:instrText xml:space="preserve"> PAGEREF _Toc243555811 \h </w:instrText>
             </w:r>
             <w:r>
               <w:rPr>
@@ -394,7 +394,7 @@
               <w:noProof/>
             </w:rPr>
           </w:pPr>
-          <w:hyperlink w:anchor="_Toc243479584" w:history="1">
+          <w:hyperlink w:anchor="_Toc243555812" w:history="1">
             <w:r>
               <w:rPr>
                 <w:rStyle w:val="Hyperlink"/>
@@ -421,7 +421,7 @@
                 <w:noProof/>
                 <w:webHidden/>
               </w:rPr>
-              <w:instrText xml:space="preserve"> PAGEREF _Toc243479584 \h </w:instrText>
+              <w:instrText xml:space="preserve"> PAGEREF _Toc243555812 \h </w:instrText>
             </w:r>
             <w:r>
               <w:rPr>
@@ -462,7 +462,7 @@
               <w:noProof/>
             </w:rPr>
           </w:pPr>
-          <w:hyperlink w:anchor="_Toc243479585" w:history="1">
+          <w:hyperlink w:anchor="_Toc243555813" w:history="1">
             <w:r>
               <w:rPr>
                 <w:rStyle w:val="Hyperlink"/>
@@ -489,7 +489,7 @@
                 <w:noProof/>
                 <w:webHidden/>
               </w:rPr>
-              <w:instrText xml:space="preserve"> PAGEREF _Toc243479585 \h </w:instrText>
+              <w:instrText xml:space="preserve"> PAGEREF _Toc243555813 \h </w:instrText>
             </w:r>
             <w:r>
               <w:rPr>
@@ -536,7 +536,7 @@
       <w:pPr>
         <w:pStyle w:val="Heading1"/>
       </w:pPr>
-      <w:bookmarkStart w:id="0" w:name="_Toc243479579"/>
+      <w:bookmarkStart w:id="0" w:name="_Toc243555807"/>
       <w:r>
         <w:t>Solution</w:t>
       </w:r>
@@ -560,7 +560,7 @@
       <w:pPr>
         <w:pStyle w:val="Heading2"/>
       </w:pPr>
-      <w:bookmarkStart w:id="1" w:name="_Toc243479580"/>
+      <w:bookmarkStart w:id="1" w:name="_Toc243555808"/>
       <w:r>
         <w:t xml:space="preserve">Road </w:t>
       </w:r>
@@ -590,7 +590,7 @@
       <w:pPr>
         <w:pStyle w:val="Heading2"/>
       </w:pPr>
-      <w:bookmarkStart w:id="2" w:name="_Toc243479581"/>
+      <w:bookmarkStart w:id="2" w:name="_Toc243555809"/>
       <w:r>
         <w:t>Simulation</w:t>
       </w:r>
@@ -599,13 +599,16 @@
     <w:p>
       <w:r>
         <w:t xml:space="preserve">An intersection in the program can be tested using simulated traffic to determine its effectiveness. Simulations are visual, with individual </w:t>
+      </w:r>
+      <w:r>
+        <w:t>vehicles and pedestrians using the intersection.</w:t>
       </w:r>
     </w:p>
     <w:p>
       <w:pPr>
         <w:pStyle w:val="Heading2"/>
       </w:pPr>
-      <w:bookmarkStart w:id="3" w:name="_Toc243479582"/>
+      <w:bookmarkStart w:id="3" w:name="_Toc243555810"/>
       <w:r>
         <w:t xml:space="preserve">Adjustable </w:t>
       </w:r>
@@ -632,7 +635,7 @@
       <w:pPr>
         <w:pStyle w:val="Heading2"/>
       </w:pPr>
-      <w:bookmarkStart w:id="4" w:name="_Toc243479583"/>
+      <w:bookmarkStart w:id="4" w:name="_Toc243555811"/>
       <w:r>
         <w:t>Performance Metrics</w:t>
       </w:r>
@@ -647,7 +650,7 @@
       <w:pPr>
         <w:pStyle w:val="Heading2"/>
       </w:pPr>
-      <w:bookmarkStart w:id="5" w:name="_Toc243479584"/>
+      <w:bookmarkStart w:id="5" w:name="_Toc243555812"/>
       <w:r>
         <w:t>Simulation Comparison</w:t>
       </w:r>
@@ -662,7 +665,7 @@
       <w:pPr>
         <w:pStyle w:val="Heading2"/>
       </w:pPr>
-      <w:bookmarkStart w:id="6" w:name="_Toc243479585"/>
+      <w:bookmarkStart w:id="6" w:name="_Toc243555813"/>
       <w:r>
         <w:lastRenderedPageBreak/>
         <w:t>Suggested Intersection</w:t>
@@ -672,6 +675,9 @@
     <w:p>
       <w:r>
         <w:t>Given an intersection, the program may give alternative designs to assist the user.</w:t>
+      </w:r>
+      <w:r>
+        <w:t xml:space="preserve"> </w:t>
       </w:r>
     </w:p>
     <w:sectPr>

</xml_diff>

<commit_message>
Changed Header 1 settings
</commit_message>
<xml_diff>
--- a/Traffic Sim.docx
+++ b/Traffic Sim.docx
@@ -1,10 +1,11 @@
 
 <file path=word/document.xml><?xml version="1.0" encoding="utf-8"?>
-<w:document xmlns:wpc="http://schemas.microsoft.com/office/word/2010/wordprocessingCanvas" xmlns:cx="http://schemas.microsoft.com/office/drawing/2014/chartex" xmlns:cx1="http://schemas.microsoft.com/office/drawing/2015/9/8/chartex" xmlns:cx2="http://schemas.microsoft.com/office/drawing/2015/10/21/chartex" xmlns:cx3="http://schemas.microsoft.com/office/drawing/2016/5/9/chartex" xmlns:cx4="http://schemas.microsoft.com/office/drawing/2016/5/10/chartex" xmlns:cx5="http://schemas.microsoft.com/office/drawing/2016/5/11/chartex" xmlns:cx6="http://schemas.microsoft.com/office/drawing/2016/5/12/chartex" xmlns:cx7="http://schemas.microsoft.com/office/drawing/2016/5/13/chartex" xmlns:cx8="http://schemas.microsoft.com/office/drawing/2016/5/14/chartex" xmlns:mc="http://schemas.openxmlformats.org/markup-compatibility/2006" xmlns:aink="http://schemas.microsoft.com/office/drawing/2016/ink" xmlns:am3d="http://schemas.microsoft.com/office/drawing/2017/model3d" xmlns:o="urn:schemas-microsoft-com:office:office" xmlns:oel="http://schemas.microsoft.com/office/2019/extlst" xmlns:r="http://schemas.openxmlformats.org/officeDocument/2006/relationships" xmlns:m="http://schemas.openxmlformats.org/officeDocument/2006/math" xmlns:v="urn:schemas-microsoft-com:vml" xmlns:wp14="http://schemas.microsoft.com/office/word/2010/wordprocessingDrawing" xmlns:wp="http://schemas.openxmlformats.org/drawingml/2006/wordprocessingDrawing" xmlns:w10="urn:schemas-microsoft-com:office:word" xmlns:w="http://schemas.openxmlformats.org/wordprocessingml/2006/main" xmlns:w14="http://schemas.microsoft.com/office/word/2010/wordml" xmlns:w15="http://schemas.microsoft.com/office/word/2012/wordml" xmlns:w16cex="http://schemas.microsoft.com/office/word/2018/wordml/cex" xmlns:w16cid="http://schemas.microsoft.com/office/word/2016/wordml/cid" xmlns:w16="http://schemas.microsoft.com/office/word/2018/wordml" xmlns:w16du="http://schemas.microsoft.com/office/word/2023/wordml/word16du" xmlns:w16sdtdh="http://schemas.microsoft.com/office/word/2020/wordml/sdtdatahash" xmlns:w16sdtfl="http://schemas.microsoft.com/office/word/2024/wordml/sdtformatlock" xmlns:w16se="http://schemas.microsoft.com/office/word/2015/wordml/symex" xmlns:wpg="http://schemas.microsoft.com/office/word/2010/wordprocessingGroup" xmlns:wpi="http://schemas.microsoft.com/office/word/2010/wordprocessingInk" xmlns:wne="http://schemas.microsoft.com/office/word/2006/wordml" xmlns:wps="http://schemas.microsoft.com/office/word/2010/wordprocessingShape" mc:Ignorable="w14 w15 w16se w16cid w16 w16cex w16sdtdh w16sdtfl w16du wp14">
+<w:document xmlns:wpc="http://schemas.microsoft.com/office/word/2010/wordprocessingCanvas" xmlns:cx="http://schemas.microsoft.com/office/drawing/2014/chartex" xmlns:cx1="http://schemas.microsoft.com/office/drawing/2015/9/8/chartex" xmlns:cx2="http://schemas.microsoft.com/office/drawing/2015/10/21/chartex" xmlns:cx3="http://schemas.microsoft.com/office/drawing/2016/5/9/chartex" xmlns:cx4="http://schemas.microsoft.com/office/drawing/2016/5/10/chartex" xmlns:cx5="http://schemas.microsoft.com/office/drawing/2016/5/11/chartex" xmlns:cx6="http://schemas.microsoft.com/office/drawing/2016/5/12/chartex" xmlns:cx7="http://schemas.microsoft.com/office/drawing/2016/5/13/chartex" xmlns:cx8="http://schemas.microsoft.com/office/drawing/2016/5/14/chartex" xmlns:mc="http://schemas.openxmlformats.org/markup-compatibility/2006" xmlns:aink="http://schemas.microsoft.com/office/drawing/2016/ink" xmlns:am3d="http://schemas.microsoft.com/office/drawing/2017/model3d" xmlns:o="urn:schemas-microsoft-com:office:office" xmlns:oel="http://schemas.microsoft.com/office/2019/extlst" xmlns:r="http://schemas.openxmlformats.org/officeDocument/2006/relationships" xmlns:m="http://schemas.openxmlformats.org/officeDocument/2006/math" xmlns:v="urn:schemas-microsoft-com:vml" xmlns:wp14="http://schemas.microsoft.com/office/word/2010/wordprocessingDrawing" xmlns:wp="http://schemas.openxmlformats.org/drawingml/2006/wordprocessingDrawing" xmlns:w10="urn:schemas-microsoft-com:office:word" xmlns:w="http://schemas.openxmlformats.org/wordprocessingml/2006/main" xmlns:w14="http://schemas.microsoft.com/office/word/2010/wordml" xmlns:w15="http://schemas.microsoft.com/office/word/2012/wordml" xmlns:w16cex="http://schemas.microsoft.com/office/word/2018/wordml/cex" xmlns:w16cid="http://schemas.microsoft.com/office/word/2016/wordml/cid" xmlns:w16="http://schemas.microsoft.com/office/word/2018/wordml" xmlns:w16sdtdh="http://schemas.microsoft.com/office/word/2020/wordml/sdtdatahash" xmlns:w16se="http://schemas.microsoft.com/office/word/2015/wordml/symex" xmlns:wpg="http://schemas.microsoft.com/office/word/2010/wordprocessingGroup" xmlns:wpi="http://schemas.microsoft.com/office/word/2010/wordprocessingInk" xmlns:wne="http://schemas.microsoft.com/office/word/2006/wordml" xmlns:wps="http://schemas.microsoft.com/office/word/2010/wordprocessingShape" mc:Ignorable="w14 w15 w16se w16cid w16 w16cex w16sdtdh wp14">
   <w:body>
     <w:p>
       <w:pPr>
         <w:pStyle w:val="Heading1"/>
+        <w:jc w:val="center"/>
       </w:pPr>
       <w:r>
         <w:t>Scope</w:t>
@@ -58,6 +59,7 @@
     <w:p>
       <w:pPr>
         <w:pStyle w:val="Heading1"/>
+        <w:jc w:val="center"/>
       </w:pPr>
       <w:r>
         <w:t>Hurdles</w:t>
@@ -403,8 +405,13 @@
           <w:numId w:val="6"/>
         </w:numPr>
       </w:pPr>
-      <w:r>
-        <w:t>2 Dimensional Simulation</w:t>
+      <w:proofErr w:type="gramStart"/>
+      <w:r>
+        <w:t>2 Dimensional</w:t>
+      </w:r>
+      <w:proofErr w:type="gramEnd"/>
+      <w:r>
+        <w:t xml:space="preserve"> Simulation</w:t>
       </w:r>
     </w:p>
     <w:p>
@@ -586,7 +593,7 @@
 </file>
 
 <file path=word/numbering.xml><?xml version="1.0" encoding="utf-8"?>
-<w:numbering xmlns:wpc="http://schemas.microsoft.com/office/word/2010/wordprocessingCanvas" xmlns:cx="http://schemas.microsoft.com/office/drawing/2014/chartex" xmlns:cx1="http://schemas.microsoft.com/office/drawing/2015/9/8/chartex" xmlns:cx2="http://schemas.microsoft.com/office/drawing/2015/10/21/chartex" xmlns:cx3="http://schemas.microsoft.com/office/drawing/2016/5/9/chartex" xmlns:cx4="http://schemas.microsoft.com/office/drawing/2016/5/10/chartex" xmlns:cx5="http://schemas.microsoft.com/office/drawing/2016/5/11/chartex" xmlns:cx6="http://schemas.microsoft.com/office/drawing/2016/5/12/chartex" xmlns:cx7="http://schemas.microsoft.com/office/drawing/2016/5/13/chartex" xmlns:cx8="http://schemas.microsoft.com/office/drawing/2016/5/14/chartex" xmlns:mc="http://schemas.openxmlformats.org/markup-compatibility/2006" xmlns:aink="http://schemas.microsoft.com/office/drawing/2016/ink" xmlns:am3d="http://schemas.microsoft.com/office/drawing/2017/model3d" xmlns:o="urn:schemas-microsoft-com:office:office" xmlns:oel="http://schemas.microsoft.com/office/2019/extlst" xmlns:r="http://schemas.openxmlformats.org/officeDocument/2006/relationships" xmlns:m="http://schemas.openxmlformats.org/officeDocument/2006/math" xmlns:v="urn:schemas-microsoft-com:vml" xmlns:wp14="http://schemas.microsoft.com/office/word/2010/wordprocessingDrawing" xmlns:wp="http://schemas.openxmlformats.org/drawingml/2006/wordprocessingDrawing" xmlns:w10="urn:schemas-microsoft-com:office:word" xmlns:w="http://schemas.openxmlformats.org/wordprocessingml/2006/main" xmlns:w14="http://schemas.microsoft.com/office/word/2010/wordml" xmlns:w15="http://schemas.microsoft.com/office/word/2012/wordml" xmlns:w16cex="http://schemas.microsoft.com/office/word/2018/wordml/cex" xmlns:w16cid="http://schemas.microsoft.com/office/word/2016/wordml/cid" xmlns:w16="http://schemas.microsoft.com/office/word/2018/wordml" xmlns:w16du="http://schemas.microsoft.com/office/word/2023/wordml/word16du" xmlns:w16sdtdh="http://schemas.microsoft.com/office/word/2020/wordml/sdtdatahash" xmlns:w16sdtfl="http://schemas.microsoft.com/office/word/2024/wordml/sdtformatlock" xmlns:w16se="http://schemas.microsoft.com/office/word/2015/wordml/symex" xmlns:wpg="http://schemas.microsoft.com/office/word/2010/wordprocessingGroup" xmlns:wpi="http://schemas.microsoft.com/office/word/2010/wordprocessingInk" xmlns:wne="http://schemas.microsoft.com/office/word/2006/wordml" xmlns:wps="http://schemas.microsoft.com/office/word/2010/wordprocessingShape" mc:Ignorable="w14 w15 w16se w16cid w16 w16cex w16sdtdh w16sdtfl w16du wp14">
+<w:numbering xmlns:wpc="http://schemas.microsoft.com/office/word/2010/wordprocessingCanvas" xmlns:cx="http://schemas.microsoft.com/office/drawing/2014/chartex" xmlns:cx1="http://schemas.microsoft.com/office/drawing/2015/9/8/chartex" xmlns:cx2="http://schemas.microsoft.com/office/drawing/2015/10/21/chartex" xmlns:cx3="http://schemas.microsoft.com/office/drawing/2016/5/9/chartex" xmlns:cx4="http://schemas.microsoft.com/office/drawing/2016/5/10/chartex" xmlns:cx5="http://schemas.microsoft.com/office/drawing/2016/5/11/chartex" xmlns:cx6="http://schemas.microsoft.com/office/drawing/2016/5/12/chartex" xmlns:cx7="http://schemas.microsoft.com/office/drawing/2016/5/13/chartex" xmlns:cx8="http://schemas.microsoft.com/office/drawing/2016/5/14/chartex" xmlns:mc="http://schemas.openxmlformats.org/markup-compatibility/2006" xmlns:aink="http://schemas.microsoft.com/office/drawing/2016/ink" xmlns:am3d="http://schemas.microsoft.com/office/drawing/2017/model3d" xmlns:o="urn:schemas-microsoft-com:office:office" xmlns:oel="http://schemas.microsoft.com/office/2019/extlst" xmlns:r="http://schemas.openxmlformats.org/officeDocument/2006/relationships" xmlns:m="http://schemas.openxmlformats.org/officeDocument/2006/math" xmlns:v="urn:schemas-microsoft-com:vml" xmlns:wp14="http://schemas.microsoft.com/office/word/2010/wordprocessingDrawing" xmlns:wp="http://schemas.openxmlformats.org/drawingml/2006/wordprocessingDrawing" xmlns:w10="urn:schemas-microsoft-com:office:word" xmlns:w="http://schemas.openxmlformats.org/wordprocessingml/2006/main" xmlns:w14="http://schemas.microsoft.com/office/word/2010/wordml" xmlns:w15="http://schemas.microsoft.com/office/word/2012/wordml" xmlns:w16cex="http://schemas.microsoft.com/office/word/2018/wordml/cex" xmlns:w16cid="http://schemas.microsoft.com/office/word/2016/wordml/cid" xmlns:w16="http://schemas.microsoft.com/office/word/2018/wordml" xmlns:w16sdtdh="http://schemas.microsoft.com/office/word/2020/wordml/sdtdatahash" xmlns:w16se="http://schemas.microsoft.com/office/word/2015/wordml/symex" xmlns:wpg="http://schemas.microsoft.com/office/word/2010/wordprocessingGroup" xmlns:wpi="http://schemas.microsoft.com/office/word/2010/wordprocessingInk" xmlns:wne="http://schemas.microsoft.com/office/word/2006/wordml" xmlns:wps="http://schemas.microsoft.com/office/word/2010/wordprocessingShape" mc:Ignorable="w14 w15 w16se w16cid w16 w16cex w16sdtdh wp14">
   <w:abstractNum w:abstractNumId="0" w15:restartNumberingAfterBreak="0">
     <w:nsid w:val="099703F6"/>
     <w:multiLevelType w:val="hybridMultilevel"/>
@@ -1287,7 +1294,7 @@
 </file>
 
 <file path=word/styles.xml><?xml version="1.0" encoding="utf-8"?>
-<w:styles xmlns:mc="http://schemas.openxmlformats.org/markup-compatibility/2006" xmlns:r="http://schemas.openxmlformats.org/officeDocument/2006/relationships" xmlns:w="http://schemas.openxmlformats.org/wordprocessingml/2006/main" xmlns:w14="http://schemas.microsoft.com/office/word/2010/wordml" xmlns:w15="http://schemas.microsoft.com/office/word/2012/wordml" xmlns:w16cex="http://schemas.microsoft.com/office/word/2018/wordml/cex" xmlns:w16cid="http://schemas.microsoft.com/office/word/2016/wordml/cid" xmlns:w16="http://schemas.microsoft.com/office/word/2018/wordml" xmlns:w16du="http://schemas.microsoft.com/office/word/2023/wordml/word16du" xmlns:w16sdtdh="http://schemas.microsoft.com/office/word/2020/wordml/sdtdatahash" xmlns:w16sdtfl="http://schemas.microsoft.com/office/word/2024/wordml/sdtformatlock" xmlns:w16se="http://schemas.microsoft.com/office/word/2015/wordml/symex" mc:Ignorable="w14 w15 w16se w16cid w16 w16cex w16sdtdh w16sdtfl w16du">
+<w:styles xmlns:mc="http://schemas.openxmlformats.org/markup-compatibility/2006" xmlns:r="http://schemas.openxmlformats.org/officeDocument/2006/relationships" xmlns:w="http://schemas.openxmlformats.org/wordprocessingml/2006/main" xmlns:w14="http://schemas.microsoft.com/office/word/2010/wordml" xmlns:w15="http://schemas.microsoft.com/office/word/2012/wordml" xmlns:w16cex="http://schemas.microsoft.com/office/word/2018/wordml/cex" xmlns:w16cid="http://schemas.microsoft.com/office/word/2016/wordml/cid" xmlns:w16="http://schemas.microsoft.com/office/word/2018/wordml" xmlns:w16sdtdh="http://schemas.microsoft.com/office/word/2020/wordml/sdtdatahash" xmlns:w16se="http://schemas.microsoft.com/office/word/2015/wordml/symex" mc:Ignorable="w14 w15 w16se w16cid w16 w16cex w16sdtdh">
   <w:docDefaults>
     <w:rPrDefault>
       <w:rPr>
@@ -1694,7 +1701,7 @@
     <w:link w:val="Heading1Char"/>
     <w:uiPriority w:val="9"/>
     <w:qFormat/>
-    <w:rsid w:val="00937477"/>
+    <w:rsid w:val="009B5998"/>
     <w:pPr>
       <w:keepNext/>
       <w:keepLines/>
@@ -1703,8 +1710,9 @@
     </w:pPr>
     <w:rPr>
       <w:rFonts w:asciiTheme="majorHAnsi" w:eastAsiaTheme="majorEastAsia" w:hAnsiTheme="majorHAnsi" w:cstheme="majorBidi"/>
-      <w:color w:val="0F4761" w:themeColor="accent1" w:themeShade="BF"/>
-      <w:sz w:val="40"/>
+      <w:b/>
+      <w:color w:val="000000" w:themeColor="text1"/>
+      <w:sz w:val="32"/>
       <w:szCs w:val="40"/>
     </w:rPr>
   </w:style>
@@ -1918,11 +1926,12 @@
     <w:basedOn w:val="DefaultParagraphFont"/>
     <w:link w:val="Heading1"/>
     <w:uiPriority w:val="9"/>
-    <w:rsid w:val="00937477"/>
+    <w:rsid w:val="009B5998"/>
     <w:rPr>
       <w:rFonts w:asciiTheme="majorHAnsi" w:eastAsiaTheme="majorEastAsia" w:hAnsiTheme="majorHAnsi" w:cstheme="majorBidi"/>
-      <w:color w:val="0F4761" w:themeColor="accent1" w:themeShade="BF"/>
-      <w:sz w:val="40"/>
+      <w:b/>
+      <w:color w:val="000000" w:themeColor="text1"/>
+      <w:sz w:val="32"/>
       <w:szCs w:val="40"/>
     </w:rPr>
   </w:style>

</xml_diff>

<commit_message>
Catchup to draft merge
</commit_message>
<xml_diff>
--- a/Traffic Sim.docx
+++ b/Traffic Sim.docx
@@ -2,18 +2,101 @@
 <file path=word/document.xml><?xml version="1.0" encoding="utf-8"?>
 <w:document xmlns:wpc="http://schemas.microsoft.com/office/word/2010/wordprocessingCanvas" xmlns:cx="http://schemas.microsoft.com/office/drawing/2014/chartex" xmlns:cx1="http://schemas.microsoft.com/office/drawing/2015/9/8/chartex" xmlns:cx2="http://schemas.microsoft.com/office/drawing/2015/10/21/chartex" xmlns:cx3="http://schemas.microsoft.com/office/drawing/2016/5/9/chartex" xmlns:cx4="http://schemas.microsoft.com/office/drawing/2016/5/10/chartex" xmlns:cx5="http://schemas.microsoft.com/office/drawing/2016/5/11/chartex" xmlns:cx6="http://schemas.microsoft.com/office/drawing/2016/5/12/chartex" xmlns:cx7="http://schemas.microsoft.com/office/drawing/2016/5/13/chartex" xmlns:cx8="http://schemas.microsoft.com/office/drawing/2016/5/14/chartex" xmlns:mc="http://schemas.openxmlformats.org/markup-compatibility/2006" xmlns:aink="http://schemas.microsoft.com/office/drawing/2016/ink" xmlns:am3d="http://schemas.microsoft.com/office/drawing/2017/model3d" xmlns:o="urn:schemas-microsoft-com:office:office" xmlns:oel="http://schemas.microsoft.com/office/2019/extlst" xmlns:r="http://schemas.openxmlformats.org/officeDocument/2006/relationships" xmlns:m="http://schemas.openxmlformats.org/officeDocument/2006/math" xmlns:v="urn:schemas-microsoft-com:vml" xmlns:wp14="http://schemas.microsoft.com/office/word/2010/wordprocessingDrawing" xmlns:wp="http://schemas.openxmlformats.org/drawingml/2006/wordprocessingDrawing" xmlns:w10="urn:schemas-microsoft-com:office:word" xmlns:w="http://schemas.openxmlformats.org/wordprocessingml/2006/main" xmlns:w14="http://schemas.microsoft.com/office/word/2010/wordml" xmlns:w15="http://schemas.microsoft.com/office/word/2012/wordml" xmlns:w16cex="http://schemas.microsoft.com/office/word/2018/wordml/cex" xmlns:w16cid="http://schemas.microsoft.com/office/word/2016/wordml/cid" xmlns:w16="http://schemas.microsoft.com/office/word/2018/wordml" xmlns:w16du="http://schemas.microsoft.com/office/word/2023/wordml/word16du" xmlns:w16sdtdh="http://schemas.microsoft.com/office/word/2020/wordml/sdtdatahash" xmlns:w16sdtfl="http://schemas.microsoft.com/office/word/2024/wordml/sdtformatlock" xmlns:w16se="http://schemas.microsoft.com/office/word/2015/wordml/symex" xmlns:wpg="http://schemas.microsoft.com/office/word/2010/wordprocessingGroup" xmlns:wpi="http://schemas.microsoft.com/office/word/2010/wordprocessingInk" xmlns:wne="http://schemas.microsoft.com/office/word/2006/wordml" xmlns:wps="http://schemas.microsoft.com/office/word/2010/wordprocessingShape" mc:Ignorable="w14 w15 w16se w16cid w16 w16cex w16sdtdh w16sdtfl w16du wp14">
   <w:body>
+    <w:p>
+      <w:pPr>
+        <w:pStyle w:val="Heading1"/>
+      </w:pPr>
+    </w:p>
+    <w:p/>
+    <w:p/>
+    <w:p/>
+    <w:p/>
+    <w:p/>
+    <w:p/>
+    <w:p>
+      <w:pPr>
+        <w:pStyle w:val="Title"/>
+        <w:jc w:val="center"/>
+      </w:pPr>
+      <w:r>
+        <w:t>Team Gala Junior Project Proposal – Traffic Control Simulator</w:t>
+      </w:r>
+    </w:p>
+    <w:p>
+      <w:pPr>
+        <w:pStyle w:val="Heading1"/>
+        <w:rPr>
+          <w:rFonts w:asciiTheme="minorHAnsi" w:hAnsiTheme="minorHAnsi"/>
+          <w:b w:val="0"/>
+          <w:bCs/>
+          <w:sz w:val="24"/>
+          <w:szCs w:val="24"/>
+        </w:rPr>
+      </w:pPr>
+    </w:p>
+    <w:p/>
+    <w:p/>
+    <w:p/>
+    <w:p/>
+    <w:p/>
+    <w:p>
+      <w:pPr>
+        <w:jc w:val="center"/>
+        <w:rPr>
+          <w:b/>
+        </w:rPr>
+      </w:pPr>
+      <w:bookmarkStart w:id="0" w:name="_Toc243679455"/>
+      <w:r>
+        <w:t>Zane Dollarhide, Carson Page, Caden Palomares, Andrew Saigo</w:t>
+      </w:r>
+      <w:bookmarkEnd w:id="0"/>
+    </w:p>
+    <w:p>
+      <w:pPr>
+        <w:jc w:val="center"/>
+      </w:pPr>
+      <w:r>
+        <w:t>Computer Systems Engineering Technology Department</w:t>
+      </w:r>
+    </w:p>
+    <w:p>
+      <w:pPr>
+        <w:jc w:val="center"/>
+      </w:pPr>
+      <w:r>
+        <w:t>CST 316: Junior Project</w:t>
+      </w:r>
+    </w:p>
+    <w:p>
+      <w:pPr>
+        <w:jc w:val="center"/>
+      </w:pPr>
+      <w:r>
+        <w:t>Todd Breedlove</w:t>
+      </w:r>
+    </w:p>
+    <w:p>
+      <w:pPr>
+        <w:jc w:val="center"/>
+      </w:pPr>
+      <w:r>
+        <w:t>October 22, 2026</w:t>
+      </w:r>
+    </w:p>
+    <w:p>
+      <w:r>
+        <w:br w:type="page"/>
+      </w:r>
+    </w:p>
     <w:sdt>
       <w:sdtPr>
         <w:rPr>
-          <w:rFonts w:asciiTheme="minorHAnsi" w:eastAsiaTheme="minorEastAsia" w:hAnsiTheme="minorHAnsi" w:cstheme="minorBidi"/>
-          <w:color w:val="auto"/>
-          <w:kern w:val="2"/>
-          <w:sz w:val="24"/>
-          <w:szCs w:val="24"/>
-          <w:lang w:eastAsia="ja-JP"/>
-          <w14:ligatures w14:val="standardContextual"/>
+          <w:b/>
+          <w:bCs/>
+          <w:color w:val="000000" w:themeColor="text1"/>
         </w:rPr>
-        <w:id w:val="-1488470315"/>
+        <w:id w:val="252794440"/>
         <w:docPartObj>
           <w:docPartGallery w:val="Table of Contents"/>
           <w:docPartUnique/>
@@ -21,17 +104,27 @@
       </w:sdtPr>
       <w:sdtEndPr>
         <w:rPr>
-          <w:b/>
-          <w:bCs/>
           <w:noProof/>
+          <w:color w:val="auto"/>
         </w:rPr>
       </w:sdtEndPr>
       <w:sdtContent>
         <w:p>
           <w:pPr>
-            <w:pStyle w:val="TOCHeading"/>
+            <w:rPr>
+              <w:rFonts w:asciiTheme="majorHAnsi" w:eastAsiaTheme="majorEastAsia" w:hAnsiTheme="majorHAnsi" w:cstheme="majorBidi"/>
+              <w:b/>
+              <w:color w:val="000000" w:themeColor="text1"/>
+              <w:sz w:val="32"/>
+              <w:szCs w:val="40"/>
+            </w:rPr>
           </w:pPr>
           <w:r>
+            <w:rPr>
+              <w:b/>
+              <w:bCs/>
+              <w:color w:val="000000" w:themeColor="text1"/>
+            </w:rPr>
             <w:t>Table of Contents</w:t>
           </w:r>
         </w:p>
@@ -43,6 +136,7 @@
             </w:tabs>
             <w:rPr>
               <w:noProof/>
+              <w:lang w:eastAsia="en-US"/>
             </w:rPr>
           </w:pPr>
           <w:r>
@@ -54,13 +148,13 @@
           <w:r>
             <w:fldChar w:fldCharType="separate"/>
           </w:r>
-          <w:hyperlink w:anchor="_Toc243555807" w:history="1">
+          <w:hyperlink w:anchor="_Toc243679924" w:history="1">
             <w:r>
               <w:rPr>
                 <w:rStyle w:val="Hyperlink"/>
                 <w:noProof/>
               </w:rPr>
-              <w:t>Solution</w:t>
+              <w:t>Abstract Placeholder</w:t>
             </w:r>
             <w:r>
               <w:rPr>
@@ -81,7 +175,7 @@
                 <w:noProof/>
                 <w:webHidden/>
               </w:rPr>
-              <w:instrText xml:space="preserve"> PAGEREF _Toc243555807 \h </w:instrText>
+              <w:instrText xml:space="preserve"> PAGEREF _Toc243679924 \h </w:instrText>
             </w:r>
             <w:r>
               <w:rPr>
@@ -101,7 +195,76 @@
                 <w:noProof/>
                 <w:webHidden/>
               </w:rPr>
-              <w:t>1</w:t>
+              <w:t>3</w:t>
+            </w:r>
+            <w:r>
+              <w:rPr>
+                <w:noProof/>
+                <w:webHidden/>
+              </w:rPr>
+              <w:fldChar w:fldCharType="end"/>
+            </w:r>
+          </w:hyperlink>
+        </w:p>
+        <w:p>
+          <w:pPr>
+            <w:pStyle w:val="TOC1"/>
+            <w:tabs>
+              <w:tab w:val="right" w:leader="dot" w:pos="9350"/>
+            </w:tabs>
+            <w:rPr>
+              <w:noProof/>
+              <w:lang w:eastAsia="en-US"/>
+            </w:rPr>
+          </w:pPr>
+          <w:hyperlink w:anchor="_Toc243679925" w:history="1">
+            <w:r>
+              <w:rPr>
+                <w:rStyle w:val="Hyperlink"/>
+                <w:noProof/>
+              </w:rPr>
+              <w:t>Problem Statement</w:t>
+            </w:r>
+            <w:r>
+              <w:rPr>
+                <w:noProof/>
+                <w:webHidden/>
+              </w:rPr>
+              <w:tab/>
+            </w:r>
+            <w:r>
+              <w:rPr>
+                <w:noProof/>
+                <w:webHidden/>
+              </w:rPr>
+              <w:fldChar w:fldCharType="begin"/>
+            </w:r>
+            <w:r>
+              <w:rPr>
+                <w:noProof/>
+                <w:webHidden/>
+              </w:rPr>
+              <w:instrText xml:space="preserve"> PAGEREF _Toc243679925 \h </w:instrText>
+            </w:r>
+            <w:r>
+              <w:rPr>
+                <w:noProof/>
+                <w:webHidden/>
+              </w:rPr>
+            </w:r>
+            <w:r>
+              <w:rPr>
+                <w:noProof/>
+                <w:webHidden/>
+              </w:rPr>
+              <w:fldChar w:fldCharType="separate"/>
+            </w:r>
+            <w:r>
+              <w:rPr>
+                <w:noProof/>
+                <w:webHidden/>
+              </w:rPr>
+              <w:t>3</w:t>
             </w:r>
             <w:r>
               <w:rPr>
@@ -120,15 +283,16 @@
             </w:tabs>
             <w:rPr>
               <w:noProof/>
+              <w:lang w:eastAsia="en-US"/>
             </w:rPr>
           </w:pPr>
-          <w:hyperlink w:anchor="_Toc243555808" w:history="1">
+          <w:hyperlink w:anchor="_Toc243679926" w:history="1">
             <w:r>
               <w:rPr>
                 <w:rStyle w:val="Hyperlink"/>
                 <w:noProof/>
               </w:rPr>
-              <w:t>Road Network Builder</w:t>
+              <w:t>Real World Troubles</w:t>
             </w:r>
             <w:r>
               <w:rPr>
@@ -149,7 +313,7 @@
                 <w:noProof/>
                 <w:webHidden/>
               </w:rPr>
-              <w:instrText xml:space="preserve"> PAGEREF _Toc243555808 \h </w:instrText>
+              <w:instrText xml:space="preserve"> PAGEREF _Toc243679926 \h </w:instrText>
             </w:r>
             <w:r>
               <w:rPr>
@@ -169,7 +333,7 @@
                 <w:noProof/>
                 <w:webHidden/>
               </w:rPr>
-              <w:t>1</w:t>
+              <w:t>3</w:t>
             </w:r>
             <w:r>
               <w:rPr>
@@ -188,15 +352,16 @@
             </w:tabs>
             <w:rPr>
               <w:noProof/>
+              <w:lang w:eastAsia="en-US"/>
             </w:rPr>
           </w:pPr>
-          <w:hyperlink w:anchor="_Toc243555809" w:history="1">
+          <w:hyperlink w:anchor="_Toc243679927" w:history="1">
             <w:r>
               <w:rPr>
                 <w:rStyle w:val="Hyperlink"/>
                 <w:noProof/>
               </w:rPr>
-              <w:t>Simulation</w:t>
+              <w:t>Modern tools with flaws</w:t>
             </w:r>
             <w:r>
               <w:rPr>
@@ -217,7 +382,7 @@
                 <w:noProof/>
                 <w:webHidden/>
               </w:rPr>
-              <w:instrText xml:space="preserve"> PAGEREF _Toc243555809 \h </w:instrText>
+              <w:instrText xml:space="preserve"> PAGEREF _Toc243679927 \h </w:instrText>
             </w:r>
             <w:r>
               <w:rPr>
@@ -237,7 +402,7 @@
                 <w:noProof/>
                 <w:webHidden/>
               </w:rPr>
-              <w:t>1</w:t>
+              <w:t>4</w:t>
             </w:r>
             <w:r>
               <w:rPr>
@@ -256,15 +421,16 @@
             </w:tabs>
             <w:rPr>
               <w:noProof/>
+              <w:lang w:eastAsia="en-US"/>
             </w:rPr>
           </w:pPr>
-          <w:hyperlink w:anchor="_Toc243555810" w:history="1">
+          <w:hyperlink w:anchor="_Toc243679928" w:history="1">
             <w:r>
               <w:rPr>
                 <w:rStyle w:val="Hyperlink"/>
                 <w:noProof/>
               </w:rPr>
-              <w:t>Adjustable Traffic Volume</w:t>
+              <w:t>The Who</w:t>
             </w:r>
             <w:r>
               <w:rPr>
@@ -285,7 +451,7 @@
                 <w:noProof/>
                 <w:webHidden/>
               </w:rPr>
-              <w:instrText xml:space="preserve"> PAGEREF _Toc243555810 \h </w:instrText>
+              <w:instrText xml:space="preserve"> PAGEREF _Toc243679928 \h </w:instrText>
             </w:r>
             <w:r>
               <w:rPr>
@@ -305,7 +471,76 @@
                 <w:noProof/>
                 <w:webHidden/>
               </w:rPr>
-              <w:t>1</w:t>
+              <w:t>4</w:t>
+            </w:r>
+            <w:r>
+              <w:rPr>
+                <w:noProof/>
+                <w:webHidden/>
+              </w:rPr>
+              <w:fldChar w:fldCharType="end"/>
+            </w:r>
+          </w:hyperlink>
+        </w:p>
+        <w:p>
+          <w:pPr>
+            <w:pStyle w:val="TOC1"/>
+            <w:tabs>
+              <w:tab w:val="right" w:leader="dot" w:pos="9350"/>
+            </w:tabs>
+            <w:rPr>
+              <w:noProof/>
+              <w:lang w:eastAsia="en-US"/>
+            </w:rPr>
+          </w:pPr>
+          <w:hyperlink w:anchor="_Toc243679929" w:history="1">
+            <w:r>
+              <w:rPr>
+                <w:rStyle w:val="Hyperlink"/>
+                <w:noProof/>
+              </w:rPr>
+              <w:t>Solution</w:t>
+            </w:r>
+            <w:r>
+              <w:rPr>
+                <w:noProof/>
+                <w:webHidden/>
+              </w:rPr>
+              <w:tab/>
+            </w:r>
+            <w:r>
+              <w:rPr>
+                <w:noProof/>
+                <w:webHidden/>
+              </w:rPr>
+              <w:fldChar w:fldCharType="begin"/>
+            </w:r>
+            <w:r>
+              <w:rPr>
+                <w:noProof/>
+                <w:webHidden/>
+              </w:rPr>
+              <w:instrText xml:space="preserve"> PAGEREF _Toc243679929 \h </w:instrText>
+            </w:r>
+            <w:r>
+              <w:rPr>
+                <w:noProof/>
+                <w:webHidden/>
+              </w:rPr>
+            </w:r>
+            <w:r>
+              <w:rPr>
+                <w:noProof/>
+                <w:webHidden/>
+              </w:rPr>
+              <w:fldChar w:fldCharType="separate"/>
+            </w:r>
+            <w:r>
+              <w:rPr>
+                <w:noProof/>
+                <w:webHidden/>
+              </w:rPr>
+              <w:t>4</w:t>
             </w:r>
             <w:r>
               <w:rPr>
@@ -324,15 +559,16 @@
             </w:tabs>
             <w:rPr>
               <w:noProof/>
+              <w:lang w:eastAsia="en-US"/>
             </w:rPr>
           </w:pPr>
-          <w:hyperlink w:anchor="_Toc243555811" w:history="1">
+          <w:hyperlink w:anchor="_Toc243679930" w:history="1">
             <w:r>
               <w:rPr>
                 <w:rStyle w:val="Hyperlink"/>
                 <w:noProof/>
               </w:rPr>
-              <w:t>Performance Metrics</w:t>
+              <w:t>Road Network Builder</w:t>
             </w:r>
             <w:r>
               <w:rPr>
@@ -353,7 +589,7 @@
                 <w:noProof/>
                 <w:webHidden/>
               </w:rPr>
-              <w:instrText xml:space="preserve"> PAGEREF _Toc243555811 \h </w:instrText>
+              <w:instrText xml:space="preserve"> PAGEREF _Toc243679930 \h </w:instrText>
             </w:r>
             <w:r>
               <w:rPr>
@@ -373,7 +609,7 @@
                 <w:noProof/>
                 <w:webHidden/>
               </w:rPr>
-              <w:t>1</w:t>
+              <w:t>4</w:t>
             </w:r>
             <w:r>
               <w:rPr>
@@ -392,15 +628,16 @@
             </w:tabs>
             <w:rPr>
               <w:noProof/>
+              <w:lang w:eastAsia="en-US"/>
             </w:rPr>
           </w:pPr>
-          <w:hyperlink w:anchor="_Toc243555812" w:history="1">
+          <w:hyperlink w:anchor="_Toc243679931" w:history="1">
             <w:r>
               <w:rPr>
                 <w:rStyle w:val="Hyperlink"/>
                 <w:noProof/>
               </w:rPr>
-              <w:t>Simulation Comparison</w:t>
+              <w:t>Simulation</w:t>
             </w:r>
             <w:r>
               <w:rPr>
@@ -421,7 +658,7 @@
                 <w:noProof/>
                 <w:webHidden/>
               </w:rPr>
-              <w:instrText xml:space="preserve"> PAGEREF _Toc243555812 \h </w:instrText>
+              <w:instrText xml:space="preserve"> PAGEREF _Toc243679931 \h </w:instrText>
             </w:r>
             <w:r>
               <w:rPr>
@@ -441,7 +678,7 @@
                 <w:noProof/>
                 <w:webHidden/>
               </w:rPr>
-              <w:t>1</w:t>
+              <w:t>4</w:t>
             </w:r>
             <w:r>
               <w:rPr>
@@ -460,14 +697,222 @@
             </w:tabs>
             <w:rPr>
               <w:noProof/>
+              <w:lang w:eastAsia="en-US"/>
             </w:rPr>
           </w:pPr>
-          <w:hyperlink w:anchor="_Toc243555813" w:history="1">
+          <w:hyperlink w:anchor="_Toc243679932" w:history="1">
             <w:r>
               <w:rPr>
                 <w:rStyle w:val="Hyperlink"/>
                 <w:noProof/>
               </w:rPr>
+              <w:t>Adjustable Traffic Volume</w:t>
+            </w:r>
+            <w:r>
+              <w:rPr>
+                <w:noProof/>
+                <w:webHidden/>
+              </w:rPr>
+              <w:tab/>
+            </w:r>
+            <w:r>
+              <w:rPr>
+                <w:noProof/>
+                <w:webHidden/>
+              </w:rPr>
+              <w:fldChar w:fldCharType="begin"/>
+            </w:r>
+            <w:r>
+              <w:rPr>
+                <w:noProof/>
+                <w:webHidden/>
+              </w:rPr>
+              <w:instrText xml:space="preserve"> PAGEREF _Toc243679932 \h </w:instrText>
+            </w:r>
+            <w:r>
+              <w:rPr>
+                <w:noProof/>
+                <w:webHidden/>
+              </w:rPr>
+            </w:r>
+            <w:r>
+              <w:rPr>
+                <w:noProof/>
+                <w:webHidden/>
+              </w:rPr>
+              <w:fldChar w:fldCharType="separate"/>
+            </w:r>
+            <w:r>
+              <w:rPr>
+                <w:noProof/>
+                <w:webHidden/>
+              </w:rPr>
+              <w:t>4</w:t>
+            </w:r>
+            <w:r>
+              <w:rPr>
+                <w:noProof/>
+                <w:webHidden/>
+              </w:rPr>
+              <w:fldChar w:fldCharType="end"/>
+            </w:r>
+          </w:hyperlink>
+        </w:p>
+        <w:p>
+          <w:pPr>
+            <w:pStyle w:val="TOC2"/>
+            <w:tabs>
+              <w:tab w:val="right" w:leader="dot" w:pos="9350"/>
+            </w:tabs>
+            <w:rPr>
+              <w:noProof/>
+              <w:lang w:eastAsia="en-US"/>
+            </w:rPr>
+          </w:pPr>
+          <w:hyperlink w:anchor="_Toc243679933" w:history="1">
+            <w:r>
+              <w:rPr>
+                <w:rStyle w:val="Hyperlink"/>
+                <w:noProof/>
+              </w:rPr>
+              <w:t>Performance Metrics</w:t>
+            </w:r>
+            <w:r>
+              <w:rPr>
+                <w:noProof/>
+                <w:webHidden/>
+              </w:rPr>
+              <w:tab/>
+            </w:r>
+            <w:r>
+              <w:rPr>
+                <w:noProof/>
+                <w:webHidden/>
+              </w:rPr>
+              <w:fldChar w:fldCharType="begin"/>
+            </w:r>
+            <w:r>
+              <w:rPr>
+                <w:noProof/>
+                <w:webHidden/>
+              </w:rPr>
+              <w:instrText xml:space="preserve"> PAGEREF _Toc243679933 \h </w:instrText>
+            </w:r>
+            <w:r>
+              <w:rPr>
+                <w:noProof/>
+                <w:webHidden/>
+              </w:rPr>
+            </w:r>
+            <w:r>
+              <w:rPr>
+                <w:noProof/>
+                <w:webHidden/>
+              </w:rPr>
+              <w:fldChar w:fldCharType="separate"/>
+            </w:r>
+            <w:r>
+              <w:rPr>
+                <w:noProof/>
+                <w:webHidden/>
+              </w:rPr>
+              <w:t>4</w:t>
+            </w:r>
+            <w:r>
+              <w:rPr>
+                <w:noProof/>
+                <w:webHidden/>
+              </w:rPr>
+              <w:fldChar w:fldCharType="end"/>
+            </w:r>
+          </w:hyperlink>
+        </w:p>
+        <w:p>
+          <w:pPr>
+            <w:pStyle w:val="TOC2"/>
+            <w:tabs>
+              <w:tab w:val="right" w:leader="dot" w:pos="9350"/>
+            </w:tabs>
+            <w:rPr>
+              <w:noProof/>
+              <w:lang w:eastAsia="en-US"/>
+            </w:rPr>
+          </w:pPr>
+          <w:hyperlink w:anchor="_Toc243679934" w:history="1">
+            <w:r>
+              <w:rPr>
+                <w:rStyle w:val="Hyperlink"/>
+                <w:noProof/>
+              </w:rPr>
+              <w:t>Simulation Comparison</w:t>
+            </w:r>
+            <w:r>
+              <w:rPr>
+                <w:noProof/>
+                <w:webHidden/>
+              </w:rPr>
+              <w:tab/>
+            </w:r>
+            <w:r>
+              <w:rPr>
+                <w:noProof/>
+                <w:webHidden/>
+              </w:rPr>
+              <w:fldChar w:fldCharType="begin"/>
+            </w:r>
+            <w:r>
+              <w:rPr>
+                <w:noProof/>
+                <w:webHidden/>
+              </w:rPr>
+              <w:instrText xml:space="preserve"> PAGEREF _Toc243679934 \h </w:instrText>
+            </w:r>
+            <w:r>
+              <w:rPr>
+                <w:noProof/>
+                <w:webHidden/>
+              </w:rPr>
+            </w:r>
+            <w:r>
+              <w:rPr>
+                <w:noProof/>
+                <w:webHidden/>
+              </w:rPr>
+              <w:fldChar w:fldCharType="separate"/>
+            </w:r>
+            <w:r>
+              <w:rPr>
+                <w:noProof/>
+                <w:webHidden/>
+              </w:rPr>
+              <w:t>4</w:t>
+            </w:r>
+            <w:r>
+              <w:rPr>
+                <w:noProof/>
+                <w:webHidden/>
+              </w:rPr>
+              <w:fldChar w:fldCharType="end"/>
+            </w:r>
+          </w:hyperlink>
+        </w:p>
+        <w:p>
+          <w:pPr>
+            <w:pStyle w:val="TOC2"/>
+            <w:tabs>
+              <w:tab w:val="right" w:leader="dot" w:pos="9350"/>
+            </w:tabs>
+            <w:rPr>
+              <w:noProof/>
+              <w:lang w:eastAsia="en-US"/>
+            </w:rPr>
+          </w:pPr>
+          <w:hyperlink w:anchor="_Toc243679935" w:history="1">
+            <w:r>
+              <w:rPr>
+                <w:rStyle w:val="Hyperlink"/>
+                <w:noProof/>
+              </w:rPr>
               <w:t>Suggested Intersection</w:t>
             </w:r>
             <w:r>
@@ -489,7 +934,7 @@
                 <w:noProof/>
                 <w:webHidden/>
               </w:rPr>
-              <w:instrText xml:space="preserve"> PAGEREF _Toc243555813 \h </w:instrText>
+              <w:instrText xml:space="preserve"> PAGEREF _Toc243679935 \h </w:instrText>
             </w:r>
             <w:r>
               <w:rPr>
@@ -509,7 +954,283 @@
                 <w:noProof/>
                 <w:webHidden/>
               </w:rPr>
-              <w:t>2</w:t>
+              <w:t>5</w:t>
+            </w:r>
+            <w:r>
+              <w:rPr>
+                <w:noProof/>
+                <w:webHidden/>
+              </w:rPr>
+              <w:fldChar w:fldCharType="end"/>
+            </w:r>
+          </w:hyperlink>
+        </w:p>
+        <w:p>
+          <w:pPr>
+            <w:pStyle w:val="TOC1"/>
+            <w:tabs>
+              <w:tab w:val="right" w:leader="dot" w:pos="9350"/>
+            </w:tabs>
+            <w:rPr>
+              <w:noProof/>
+              <w:lang w:eastAsia="en-US"/>
+            </w:rPr>
+          </w:pPr>
+          <w:hyperlink w:anchor="_Toc243679936" w:history="1">
+            <w:r>
+              <w:rPr>
+                <w:rStyle w:val="Hyperlink"/>
+                <w:noProof/>
+              </w:rPr>
+              <w:t>Features</w:t>
+            </w:r>
+            <w:r>
+              <w:rPr>
+                <w:noProof/>
+                <w:webHidden/>
+              </w:rPr>
+              <w:tab/>
+            </w:r>
+            <w:r>
+              <w:rPr>
+                <w:noProof/>
+                <w:webHidden/>
+              </w:rPr>
+              <w:fldChar w:fldCharType="begin"/>
+            </w:r>
+            <w:r>
+              <w:rPr>
+                <w:noProof/>
+                <w:webHidden/>
+              </w:rPr>
+              <w:instrText xml:space="preserve"> PAGEREF _Toc243679936 \h </w:instrText>
+            </w:r>
+            <w:r>
+              <w:rPr>
+                <w:noProof/>
+                <w:webHidden/>
+              </w:rPr>
+            </w:r>
+            <w:r>
+              <w:rPr>
+                <w:noProof/>
+                <w:webHidden/>
+              </w:rPr>
+              <w:fldChar w:fldCharType="separate"/>
+            </w:r>
+            <w:r>
+              <w:rPr>
+                <w:noProof/>
+                <w:webHidden/>
+              </w:rPr>
+              <w:t>5</w:t>
+            </w:r>
+            <w:r>
+              <w:rPr>
+                <w:noProof/>
+                <w:webHidden/>
+              </w:rPr>
+              <w:fldChar w:fldCharType="end"/>
+            </w:r>
+          </w:hyperlink>
+        </w:p>
+        <w:p>
+          <w:pPr>
+            <w:pStyle w:val="TOC1"/>
+            <w:tabs>
+              <w:tab w:val="right" w:leader="dot" w:pos="9350"/>
+            </w:tabs>
+            <w:rPr>
+              <w:noProof/>
+              <w:lang w:eastAsia="en-US"/>
+            </w:rPr>
+          </w:pPr>
+          <w:hyperlink w:anchor="_Toc243679937" w:history="1">
+            <w:r>
+              <w:rPr>
+                <w:rStyle w:val="Hyperlink"/>
+                <w:noProof/>
+              </w:rPr>
+              <w:t>Scope</w:t>
+            </w:r>
+            <w:r>
+              <w:rPr>
+                <w:noProof/>
+                <w:webHidden/>
+              </w:rPr>
+              <w:tab/>
+            </w:r>
+            <w:r>
+              <w:rPr>
+                <w:noProof/>
+                <w:webHidden/>
+              </w:rPr>
+              <w:fldChar w:fldCharType="begin"/>
+            </w:r>
+            <w:r>
+              <w:rPr>
+                <w:noProof/>
+                <w:webHidden/>
+              </w:rPr>
+              <w:instrText xml:space="preserve"> PAGEREF _Toc243679937 \h </w:instrText>
+            </w:r>
+            <w:r>
+              <w:rPr>
+                <w:noProof/>
+                <w:webHidden/>
+              </w:rPr>
+            </w:r>
+            <w:r>
+              <w:rPr>
+                <w:noProof/>
+                <w:webHidden/>
+              </w:rPr>
+              <w:fldChar w:fldCharType="separate"/>
+            </w:r>
+            <w:r>
+              <w:rPr>
+                <w:noProof/>
+                <w:webHidden/>
+              </w:rPr>
+              <w:t>6</w:t>
+            </w:r>
+            <w:r>
+              <w:rPr>
+                <w:noProof/>
+                <w:webHidden/>
+              </w:rPr>
+              <w:fldChar w:fldCharType="end"/>
+            </w:r>
+          </w:hyperlink>
+        </w:p>
+        <w:p>
+          <w:pPr>
+            <w:pStyle w:val="TOC1"/>
+            <w:tabs>
+              <w:tab w:val="right" w:leader="dot" w:pos="9350"/>
+            </w:tabs>
+            <w:rPr>
+              <w:noProof/>
+              <w:lang w:eastAsia="en-US"/>
+            </w:rPr>
+          </w:pPr>
+          <w:hyperlink w:anchor="_Toc243679938" w:history="1">
+            <w:r>
+              <w:rPr>
+                <w:rStyle w:val="Hyperlink"/>
+                <w:noProof/>
+              </w:rPr>
+              <w:t>Hurdles</w:t>
+            </w:r>
+            <w:r>
+              <w:rPr>
+                <w:noProof/>
+                <w:webHidden/>
+              </w:rPr>
+              <w:tab/>
+            </w:r>
+            <w:r>
+              <w:rPr>
+                <w:noProof/>
+                <w:webHidden/>
+              </w:rPr>
+              <w:fldChar w:fldCharType="begin"/>
+            </w:r>
+            <w:r>
+              <w:rPr>
+                <w:noProof/>
+                <w:webHidden/>
+              </w:rPr>
+              <w:instrText xml:space="preserve"> PAGEREF _Toc243679938 \h </w:instrText>
+            </w:r>
+            <w:r>
+              <w:rPr>
+                <w:noProof/>
+                <w:webHidden/>
+              </w:rPr>
+            </w:r>
+            <w:r>
+              <w:rPr>
+                <w:noProof/>
+                <w:webHidden/>
+              </w:rPr>
+              <w:fldChar w:fldCharType="separate"/>
+            </w:r>
+            <w:r>
+              <w:rPr>
+                <w:noProof/>
+                <w:webHidden/>
+              </w:rPr>
+              <w:t>6</w:t>
+            </w:r>
+            <w:r>
+              <w:rPr>
+                <w:noProof/>
+                <w:webHidden/>
+              </w:rPr>
+              <w:fldChar w:fldCharType="end"/>
+            </w:r>
+          </w:hyperlink>
+        </w:p>
+        <w:p>
+          <w:pPr>
+            <w:pStyle w:val="TOC1"/>
+            <w:tabs>
+              <w:tab w:val="right" w:leader="dot" w:pos="9350"/>
+            </w:tabs>
+            <w:rPr>
+              <w:noProof/>
+              <w:lang w:eastAsia="en-US"/>
+            </w:rPr>
+          </w:pPr>
+          <w:hyperlink w:anchor="_Toc243679939" w:history="1">
+            <w:r>
+              <w:rPr>
+                <w:rStyle w:val="Hyperlink"/>
+                <w:noProof/>
+              </w:rPr>
+              <w:t>AI Usage</w:t>
+            </w:r>
+            <w:r>
+              <w:rPr>
+                <w:noProof/>
+                <w:webHidden/>
+              </w:rPr>
+              <w:tab/>
+            </w:r>
+            <w:r>
+              <w:rPr>
+                <w:noProof/>
+                <w:webHidden/>
+              </w:rPr>
+              <w:fldChar w:fldCharType="begin"/>
+            </w:r>
+            <w:r>
+              <w:rPr>
+                <w:noProof/>
+                <w:webHidden/>
+              </w:rPr>
+              <w:instrText xml:space="preserve"> PAGEREF _Toc243679939 \h </w:instrText>
+            </w:r>
+            <w:r>
+              <w:rPr>
+                <w:noProof/>
+                <w:webHidden/>
+              </w:rPr>
+            </w:r>
+            <w:r>
+              <w:rPr>
+                <w:noProof/>
+                <w:webHidden/>
+              </w:rPr>
+              <w:fldChar w:fldCharType="separate"/>
+            </w:r>
+            <w:r>
+              <w:rPr>
+                <w:noProof/>
+                <w:webHidden/>
+              </w:rPr>
+              <w:t>7</w:t>
             </w:r>
             <w:r>
               <w:rPr>
@@ -534,97 +1255,239 @@
     </w:sdt>
     <w:p>
       <w:pPr>
+        <w:rPr>
+          <w:rFonts w:asciiTheme="majorHAnsi" w:eastAsiaTheme="majorEastAsia" w:hAnsiTheme="majorHAnsi" w:cstheme="majorBidi"/>
+          <w:b/>
+          <w:color w:val="000000" w:themeColor="text1"/>
+          <w:sz w:val="32"/>
+          <w:szCs w:val="40"/>
+        </w:rPr>
+      </w:pPr>
+      <w:r>
+        <w:br w:type="page"/>
+      </w:r>
+    </w:p>
+    <w:p>
+      <w:pPr>
         <w:pStyle w:val="Heading1"/>
       </w:pPr>
-      <w:bookmarkStart w:id="0" w:name="_Toc243555807"/>
+      <w:bookmarkStart w:id="1" w:name="_Toc243679924"/>
+      <w:r>
+        <w:lastRenderedPageBreak/>
+        <w:t>Abstract Placeholder</w:t>
+      </w:r>
+      <w:bookmarkEnd w:id="1"/>
+    </w:p>
+    <w:p>
+      <w:pPr>
+        <w:pStyle w:val="Heading1"/>
+      </w:pPr>
+    </w:p>
+    <w:p/>
+    <w:p/>
+    <w:p>
+      <w:pPr>
+        <w:pStyle w:val="Heading1"/>
+      </w:pPr>
+      <w:bookmarkStart w:id="2" w:name="_Toc243679925"/>
+      <w:r>
+        <w:t>Problem Statement</w:t>
+      </w:r>
+      <w:bookmarkEnd w:id="2"/>
+    </w:p>
+    <w:p>
+      <w:pPr>
+        <w:pStyle w:val="Heading2"/>
+      </w:pPr>
+      <w:bookmarkStart w:id="3" w:name="_Toc243679926"/>
+      <w:r>
+        <w:t>Real World Troubles</w:t>
+      </w:r>
+      <w:bookmarkEnd w:id="3"/>
+    </w:p>
+    <w:p>
+      <w:r>
+        <w:t xml:space="preserve">Traffic congestion of one of the most widespread problems in urban life, influencing city residents every day. Drivers lose significant time each year sitting in traffic, burning up fuel, and contributing to rising air pollution. Congestion can also take an economic toll. Congested roads lead to higher stress and frustration, raising the likelihood of accidents, and discouraging people from traveling altogether. Researchers have noted that traffic congestion cause large cities to deliver less than they should given their size and resources </w:t>
+      </w:r>
+      <w:r>
+        <w:t>(Andrew, 2025)</w:t>
+      </w:r>
+      <w:r>
+        <w:t>.</w:t>
+      </w:r>
+    </w:p>
+    <w:p/>
+    <w:p>
+      <w:r>
+        <w:t xml:space="preserve">Intersections are one of the most dangerous points in any road network. Traffic fatalities involving an intersection took up 28% of all traffic fatalities in 2022 </w:t>
+      </w:r>
+      <w:r>
+        <w:t>(Federal Highway Administration, 2</w:t>
+      </w:r>
+      <w:r>
+        <w:t>026). Four-way intersections are the most common place for deadly collisions, accounting for nearly 62% of all intersection related fatal crashes, this goes beyond drivers, 26% of pedestrian fatalities and 40% of cyclist fatalities in 2018 happened at intersections. Intersection design has a direct impact on public safety. Signal time, lane configuration, and turn sequences are all part of a system that determines when and if people go home. A simulation tool that allows engineers to test these design choices before construction would play a role in reducing these statistics.</w:t>
+      </w:r>
+    </w:p>
+    <w:p/>
+    <w:p>
+      <w:r>
+        <w:t xml:space="preserve">Infrastructure has vastly changed to accommodate dense population and destinations. Modern intersections are hardly uniform, varying in geometry, visibility, and traffic density. Traffic complexity is measured by combing static geometry such as number of approach legs, road width, sight distance, and presence of islands or medians. With dynamic environments such as traffic volume, pedestrian crossing, and bicycle lanes. More complexity of intersections has shown an increase in the mental workload of drivers </w:t>
+      </w:r>
+      <w:r>
+        <w:t>(Hannes Weinreuter et al., 2022)</w:t>
+      </w:r>
+      <w:r>
+        <w:t xml:space="preserve">. </w:t>
+      </w:r>
+    </w:p>
+    <w:p/>
+    <w:p>
+      <w:pPr>
+        <w:pStyle w:val="Heading2"/>
+      </w:pPr>
+      <w:bookmarkStart w:id="4" w:name="_Toc243679927"/>
+      <w:r>
+        <w:t>Modern tools with flaws</w:t>
+      </w:r>
+      <w:bookmarkEnd w:id="4"/>
+    </w:p>
+    <w:p>
+      <w:pPr>
+        <w:pStyle w:val="ListParagraph"/>
+        <w:numPr>
+          <w:ilvl w:val="0"/>
+          <w:numId w:val="1"/>
+        </w:numPr>
+      </w:pPr>
+      <w:r>
+        <w:t>Available commercial software</w:t>
+      </w:r>
+    </w:p>
+    <w:p>
+      <w:pPr>
+        <w:pStyle w:val="ListParagraph"/>
+        <w:numPr>
+          <w:ilvl w:val="0"/>
+          <w:numId w:val="1"/>
+        </w:numPr>
+      </w:pPr>
+      <w:r>
+        <w:t>Complexity</w:t>
+      </w:r>
+    </w:p>
+    <w:p>
+      <w:pPr>
+        <w:pStyle w:val="ListParagraph"/>
+        <w:numPr>
+          <w:ilvl w:val="0"/>
+          <w:numId w:val="1"/>
+        </w:numPr>
+      </w:pPr>
+      <w:r>
+        <w:t>Drawbacks</w:t>
+      </w:r>
+    </w:p>
+    <w:p>
+      <w:pPr>
+        <w:pStyle w:val="Heading2"/>
+      </w:pPr>
+      <w:bookmarkStart w:id="5" w:name="_Toc243679928"/>
+      <w:r>
+        <w:t>The Who</w:t>
+      </w:r>
+      <w:bookmarkEnd w:id="5"/>
+    </w:p>
+    <w:p>
+      <w:pPr>
+        <w:pStyle w:val="ListParagraph"/>
+        <w:numPr>
+          <w:ilvl w:val="0"/>
+          <w:numId w:val="1"/>
+        </w:numPr>
+      </w:pPr>
+      <w:r>
+        <w:t>Good software not available to the public</w:t>
+      </w:r>
+    </w:p>
+    <w:p>
+      <w:pPr>
+        <w:pStyle w:val="ListParagraph"/>
+        <w:numPr>
+          <w:ilvl w:val="0"/>
+          <w:numId w:val="1"/>
+        </w:numPr>
+      </w:pPr>
+      <w:r>
+        <w:t>Students lack hands on tools</w:t>
+      </w:r>
+    </w:p>
+    <w:p>
+      <w:pPr>
+        <w:pStyle w:val="ListParagraph"/>
+        <w:numPr>
+          <w:ilvl w:val="0"/>
+          <w:numId w:val="1"/>
+        </w:numPr>
+      </w:pPr>
+      <w:r>
+        <w:t>Results understood by engineers and businessmen</w:t>
+      </w:r>
+    </w:p>
+    <w:p/>
+    <w:p>
+      <w:pPr>
+        <w:pStyle w:val="Heading1"/>
+      </w:pPr>
+      <w:bookmarkStart w:id="6" w:name="_Toc243679929"/>
       <w:r>
         <w:t>Solution</w:t>
       </w:r>
-      <w:bookmarkEnd w:id="0"/>
-    </w:p>
-    <w:p>
-      <w:r>
-        <w:t>Properly addressing design requirements involves a streamlined, comprehensive approach.</w:t>
-      </w:r>
-      <w:r>
-        <w:t xml:space="preserve"> The design workflow will be </w:t>
-      </w:r>
-      <w:r>
-        <w:t>included</w:t>
-      </w:r>
-      <w:r>
-        <w:t xml:space="preserve"> in the same program. </w:t>
+      <w:bookmarkEnd w:id="6"/>
+    </w:p>
+    <w:p>
+      <w:r>
+        <w:t xml:space="preserve">Properly addressing design requirements involves a streamlined, comprehensive approach. The design workflow will be included in the same program. </w:t>
       </w:r>
     </w:p>
     <w:p>
       <w:pPr>
         <w:pStyle w:val="Heading2"/>
       </w:pPr>
-      <w:bookmarkStart w:id="1" w:name="_Toc243555808"/>
-      <w:r>
-        <w:t xml:space="preserve">Road </w:t>
-      </w:r>
-      <w:r>
-        <w:t>N</w:t>
-      </w:r>
-      <w:r>
-        <w:t xml:space="preserve">etwork </w:t>
-      </w:r>
-      <w:r>
-        <w:t>B</w:t>
-      </w:r>
-      <w:r>
-        <w:t>uilder</w:t>
-      </w:r>
-      <w:bookmarkEnd w:id="1"/>
-    </w:p>
-    <w:p>
-      <w:r>
-        <w:t>Entrances and exits from the intersection can be defined and configured for traffic density, and the entire intersection can be assembled from a reference photo.</w:t>
-      </w:r>
-      <w:r>
-        <w:t xml:space="preserve"> Overpasses and underpasses can be built with a layer system to separate the intersection into vertical slices.</w:t>
+      <w:bookmarkStart w:id="7" w:name="_Toc243679930"/>
+      <w:r>
+        <w:t>Road Network Builder</w:t>
+      </w:r>
+      <w:bookmarkEnd w:id="7"/>
+    </w:p>
+    <w:p>
+      <w:r>
+        <w:t>Entrances and exits from the intersection can be defined and configured for traffic density, and the entire intersection can be assembled from a reference photo. Overpasses and underpasses can be built with a layer system to separate the intersection into vertical slices.</w:t>
       </w:r>
     </w:p>
     <w:p>
       <w:pPr>
         <w:pStyle w:val="Heading2"/>
       </w:pPr>
-      <w:bookmarkStart w:id="2" w:name="_Toc243555809"/>
+      <w:bookmarkStart w:id="8" w:name="_Toc243679931"/>
       <w:r>
         <w:t>Simulation</w:t>
       </w:r>
-      <w:bookmarkEnd w:id="2"/>
-    </w:p>
-    <w:p>
-      <w:r>
-        <w:t xml:space="preserve">An intersection in the program can be tested using simulated traffic to determine its effectiveness. Simulations are visual, with individual </w:t>
-      </w:r>
-      <w:r>
-        <w:t>vehicles and pedestrians using the intersection.</w:t>
+      <w:bookmarkEnd w:id="8"/>
+    </w:p>
+    <w:p>
+      <w:r>
+        <w:t>An intersection in the program can be tested using simulated traffic to determine its effectiveness. Simulations are visual, with individual vehicles and pedestrians using the intersection.</w:t>
       </w:r>
     </w:p>
     <w:p>
       <w:pPr>
         <w:pStyle w:val="Heading2"/>
       </w:pPr>
-      <w:bookmarkStart w:id="3" w:name="_Toc243555810"/>
-      <w:r>
-        <w:t xml:space="preserve">Adjustable </w:t>
-      </w:r>
-      <w:r>
-        <w:t>T</w:t>
-      </w:r>
-      <w:r>
-        <w:t xml:space="preserve">raffic </w:t>
-      </w:r>
-      <w:r>
-        <w:t>V</w:t>
-      </w:r>
-      <w:r>
-        <w:t>olume</w:t>
-      </w:r>
-      <w:bookmarkEnd w:id="3"/>
+      <w:bookmarkStart w:id="9" w:name="_Toc243679932"/>
+      <w:r>
+        <w:t>Adjustable Traffic Volume</w:t>
+      </w:r>
+      <w:bookmarkEnd w:id="9"/>
     </w:p>
     <w:p>
       <w:r>
@@ -635,26 +1498,34 @@
       <w:pPr>
         <w:pStyle w:val="Heading2"/>
       </w:pPr>
-      <w:bookmarkStart w:id="4" w:name="_Toc243555811"/>
+      <w:bookmarkStart w:id="10" w:name="_Toc243679933"/>
       <w:r>
         <w:t>Performance Metrics</w:t>
       </w:r>
-      <w:bookmarkEnd w:id="4"/>
-    </w:p>
-    <w:p>
-      <w:r>
-        <w:t>Simulations will return stats of time waited, average speed and amount of traffic that made it through.</w:t>
+      <w:bookmarkEnd w:id="10"/>
+    </w:p>
+    <w:p>
+      <w:r>
+        <w:t xml:space="preserve">Simulations will </w:t>
+      </w:r>
+      <w:proofErr w:type="gramStart"/>
+      <w:r>
+        <w:t>return</w:t>
+      </w:r>
+      <w:proofErr w:type="gramEnd"/>
+      <w:r>
+        <w:t xml:space="preserve"> stats of time waiting, average speed and amount of traffic that made it through.</w:t>
       </w:r>
     </w:p>
     <w:p>
       <w:pPr>
         <w:pStyle w:val="Heading2"/>
       </w:pPr>
-      <w:bookmarkStart w:id="5" w:name="_Toc243555812"/>
+      <w:bookmarkStart w:id="11" w:name="_Toc243679934"/>
       <w:r>
         <w:t>Simulation Comparison</w:t>
       </w:r>
-      <w:bookmarkEnd w:id="5"/>
+      <w:bookmarkEnd w:id="11"/>
     </w:p>
     <w:p>
       <w:r>
@@ -665,19 +1536,380 @@
       <w:pPr>
         <w:pStyle w:val="Heading2"/>
       </w:pPr>
-      <w:bookmarkStart w:id="6" w:name="_Toc243555813"/>
+      <w:bookmarkStart w:id="12" w:name="_Toc243679935"/>
       <w:r>
         <w:lastRenderedPageBreak/>
         <w:t>Suggested Intersection</w:t>
       </w:r>
-      <w:bookmarkEnd w:id="6"/>
-    </w:p>
-    <w:p>
-      <w:r>
-        <w:t>Given an intersection, the program may give alternative designs to assist the user.</w:t>
-      </w:r>
-      <w:r>
-        <w:t xml:space="preserve"> </w:t>
+      <w:bookmarkEnd w:id="12"/>
+    </w:p>
+    <w:p>
+      <w:r>
+        <w:t xml:space="preserve">Given an intersection, the program may give alternative designs to assist the user. </w:t>
+      </w:r>
+    </w:p>
+    <w:p/>
+    <w:p/>
+    <w:p>
+      <w:pPr>
+        <w:pStyle w:val="Heading1"/>
+      </w:pPr>
+      <w:bookmarkStart w:id="13" w:name="_Toc243679936"/>
+      <w:r>
+        <w:t>Features</w:t>
+      </w:r>
+      <w:bookmarkEnd w:id="13"/>
+    </w:p>
+    <w:p>
+      <w:pPr>
+        <w:pStyle w:val="ListParagraph"/>
+        <w:numPr>
+          <w:ilvl w:val="0"/>
+          <w:numId w:val="2"/>
+        </w:numPr>
+      </w:pPr>
+      <w:r>
+        <w:t>Base features:</w:t>
+      </w:r>
+    </w:p>
+    <w:p>
+      <w:pPr>
+        <w:pStyle w:val="ListParagraph"/>
+        <w:numPr>
+          <w:ilvl w:val="1"/>
+          <w:numId w:val="2"/>
+        </w:numPr>
+      </w:pPr>
+      <w:r>
+        <w:t>Ability to draw intersections</w:t>
+      </w:r>
+    </w:p>
+    <w:p>
+      <w:pPr>
+        <w:pStyle w:val="ListParagraph"/>
+        <w:numPr>
+          <w:ilvl w:val="2"/>
+          <w:numId w:val="2"/>
+        </w:numPr>
+      </w:pPr>
+      <w:r>
+        <w:t>Drag and drop intersection types</w:t>
+      </w:r>
+    </w:p>
+    <w:p>
+      <w:pPr>
+        <w:pStyle w:val="ListParagraph"/>
+        <w:numPr>
+          <w:ilvl w:val="2"/>
+          <w:numId w:val="2"/>
+        </w:numPr>
+      </w:pPr>
+      <w:r>
+        <w:t>Click select road connections</w:t>
+      </w:r>
+    </w:p>
+    <w:p>
+      <w:pPr>
+        <w:pStyle w:val="ListParagraph"/>
+        <w:numPr>
+          <w:ilvl w:val="2"/>
+          <w:numId w:val="2"/>
+        </w:numPr>
+      </w:pPr>
+      <w:r>
+        <w:t>Change stoplight intervals</w:t>
+      </w:r>
+    </w:p>
+    <w:p>
+      <w:pPr>
+        <w:pStyle w:val="ListParagraph"/>
+        <w:numPr>
+          <w:ilvl w:val="1"/>
+          <w:numId w:val="2"/>
+        </w:numPr>
+      </w:pPr>
+      <w:r>
+        <w:t>Run simulations on created intersections</w:t>
+      </w:r>
+    </w:p>
+    <w:p>
+      <w:pPr>
+        <w:pStyle w:val="ListParagraph"/>
+        <w:numPr>
+          <w:ilvl w:val="2"/>
+          <w:numId w:val="2"/>
+        </w:numPr>
+      </w:pPr>
+      <w:r>
+        <w:t xml:space="preserve">Change </w:t>
+      </w:r>
+      <w:proofErr w:type="gramStart"/>
+      <w:r>
+        <w:t>amount</w:t>
+      </w:r>
+      <w:proofErr w:type="gramEnd"/>
+      <w:r>
+        <w:t xml:space="preserve"> of cars going through intersection from each direction</w:t>
+      </w:r>
+    </w:p>
+    <w:p>
+      <w:pPr>
+        <w:pStyle w:val="ListParagraph"/>
+        <w:numPr>
+          <w:ilvl w:val="2"/>
+          <w:numId w:val="2"/>
+        </w:numPr>
+      </w:pPr>
+      <w:r>
+        <w:t>Add traffic intensity</w:t>
+      </w:r>
+    </w:p>
+    <w:p>
+      <w:pPr>
+        <w:pStyle w:val="ListParagraph"/>
+        <w:numPr>
+          <w:ilvl w:val="1"/>
+          <w:numId w:val="2"/>
+        </w:numPr>
+      </w:pPr>
+      <w:r>
+        <w:t>Get data back from simulation</w:t>
+      </w:r>
+    </w:p>
+    <w:p>
+      <w:pPr>
+        <w:pStyle w:val="ListParagraph"/>
+        <w:numPr>
+          <w:ilvl w:val="2"/>
+          <w:numId w:val="2"/>
+        </w:numPr>
+      </w:pPr>
+      <w:r>
+        <w:t>Wait time</w:t>
+      </w:r>
+    </w:p>
+    <w:p>
+      <w:pPr>
+        <w:pStyle w:val="ListParagraph"/>
+        <w:numPr>
+          <w:ilvl w:val="2"/>
+          <w:numId w:val="2"/>
+        </w:numPr>
+      </w:pPr>
+      <w:r>
+        <w:t>Time in intersection</w:t>
+      </w:r>
+    </w:p>
+    <w:p>
+      <w:pPr>
+        <w:pStyle w:val="ListParagraph"/>
+        <w:numPr>
+          <w:ilvl w:val="1"/>
+          <w:numId w:val="2"/>
+        </w:numPr>
+      </w:pPr>
+      <w:r>
+        <w:t>Draw intersection over top of satellite image of intersection</w:t>
+      </w:r>
+    </w:p>
+    <w:p>
+      <w:pPr>
+        <w:pStyle w:val="ListParagraph"/>
+        <w:numPr>
+          <w:ilvl w:val="0"/>
+          <w:numId w:val="2"/>
+        </w:numPr>
+      </w:pPr>
+      <w:r>
+        <w:t>Stretch Goals:</w:t>
+      </w:r>
+    </w:p>
+    <w:p>
+      <w:pPr>
+        <w:pStyle w:val="ListParagraph"/>
+        <w:numPr>
+          <w:ilvl w:val="1"/>
+          <w:numId w:val="2"/>
+        </w:numPr>
+      </w:pPr>
+      <w:r>
+        <w:t>Upload video footage to track cars going in directions to accurately run simulation on real data</w:t>
+      </w:r>
+    </w:p>
+    <w:p>
+      <w:pPr>
+        <w:pStyle w:val="ListParagraph"/>
+        <w:numPr>
+          <w:ilvl w:val="1"/>
+          <w:numId w:val="2"/>
+        </w:numPr>
+      </w:pPr>
+      <w:r>
+        <w:t>AI iterates through many types of intersections to find the best one</w:t>
+      </w:r>
+    </w:p>
+    <w:p/>
+    <w:p>
+      <w:r>
+        <w:t>Will write more after meeting with Ashton Greer.</w:t>
+      </w:r>
+    </w:p>
+    <w:p>
+      <w:r>
+        <w:br w:type="page"/>
+      </w:r>
+    </w:p>
+    <w:p/>
+    <w:p>
+      <w:pPr>
+        <w:pStyle w:val="Heading1"/>
+      </w:pPr>
+      <w:bookmarkStart w:id="14" w:name="_Toc243679937"/>
+      <w:r>
+        <w:t>Scope</w:t>
+      </w:r>
+      <w:bookmarkEnd w:id="14"/>
+    </w:p>
+    <w:p>
+      <w:r>
+        <w:tab/>
+        <w:t>The scope of the project is to develop an intersection traffic control simulation system that allows the user to create, design, and evaluate different layouts for an intersection.  The simulation parameters are defined by the user through either manual inputs or an automatic system that deciphers the parameters from video footage.  We will also train an AI assistant for the user who can assist with trying to determine the optimal type of intersection.  The program will collect and compare the different simulations data for the user.</w:t>
+      </w:r>
+    </w:p>
+    <w:p>
+      <w:r>
+        <w:tab/>
+        <w:t>The primary user base for our program will be professionals.  The users intended to have some knowledge of intersections and some plans on what might be done to improve them.  The program’s purpose is to be used as a tool for professionals to do preliminary testing of an intersection in a virtual environment.  These professionals being Civil Engineers, Highway Design Engineers, or City Traffic Departments.</w:t>
+      </w:r>
+    </w:p>
+    <w:p>
+      <w:r>
+        <w:tab/>
+        <w:t>The programs will have some limitations by design.  The biggest limitation will be using a two-dimensional space for simulating how traffic will flow through intersections.  Furthermore, our simulation won’t contain a comprehensive network of roads and intersections.  This program isn’t for simulating all the intersections in an entire town at once.  We also don’t currently have any plans for implementing a calculation for the cost of the intersection designed.</w:t>
+      </w:r>
+    </w:p>
+    <w:p>
+      <w:pPr>
+        <w:pStyle w:val="Heading1"/>
+      </w:pPr>
+      <w:bookmarkStart w:id="15" w:name="_Toc243679938"/>
+      <w:r>
+        <w:t>Hurdles</w:t>
+      </w:r>
+      <w:bookmarkEnd w:id="15"/>
+    </w:p>
+    <w:p>
+      <w:r>
+        <w:tab/>
+        <w:t>The project concept has several potential hurdles we will need to overcome to accomplish our goals.  To start with, this project will require a robust GUI that has the flexibility that allows users to design whatever kind of intersection they can imagine.  While also being easy enough to use that completing these designs in the program is likely.  Our team doesn’t have anyone who has developed a GUI like this before, but we all have some basic GUI design knowledge.</w:t>
+      </w:r>
+    </w:p>
+    <w:p>
+      <w:r>
+        <w:tab/>
+        <w:t>Another hurdle for this project is the simulation itself.  This is a core aspect of the project.  Therefore, our program needs to be able to model realistic traffic behavior in simulations.  The struggle with this is estimating human driving behavior which includes mistakes and bad decision making and accurately implementing this into our simulated drivers.  Overcoming this hurdle will require some extensive research on human behavior and cohesive algorithm designs for building our simulations.</w:t>
+      </w:r>
+    </w:p>
+    <w:p>
+      <w:r>
+        <w:lastRenderedPageBreak/>
+        <w:tab/>
+        <w:t>Thirdly, decoding video footage in a way to acquire useful data for our program poses a challenge.  Our current concept is to utilize AI to track what lanes cars are coming from and which lanes they are traveling to.  It is important that this tracking is accurate otherwise the convenience this feature offers the user will be nullified.  This is likely to be the hardest feature to test since it will require video coverage of intersections that we don’t currently possess.  Overcoming this hurdle will help how fast we can test other parts of the program.</w:t>
+      </w:r>
+    </w:p>
+    <w:p>
+      <w:r>
+        <w:tab/>
+        <w:t>The last big hurdle is the AI assistant.  We need to train it to look for efficiency and safety in the intersections it determines should be tested.  The AI needs to be capable of identifying safety concerns and providing potential implementations for overcoming them.  To ensure sufficient enough training for an AI assistant we will need access to a large quantity of proper safety data and a variety of intersection efficiency data.  This feature has the biggest risk of needing to be altered based on how much data we are able to acquire.</w:t>
+      </w:r>
+    </w:p>
+    <w:p/>
+    <w:p>
+      <w:pPr>
+        <w:pStyle w:val="Heading1"/>
+      </w:pPr>
+      <w:bookmarkStart w:id="16" w:name="_Toc243679939"/>
+      <w:r>
+        <w:t>AI Usage</w:t>
+      </w:r>
+      <w:bookmarkEnd w:id="16"/>
+    </w:p>
+    <w:p/>
+    <w:p>
+      <w:pPr>
+        <w:pStyle w:val="ListParagraph"/>
+        <w:numPr>
+          <w:ilvl w:val="0"/>
+          <w:numId w:val="3"/>
+        </w:numPr>
+      </w:pPr>
+      <w:r>
+        <w:t>Dependent on feature set</w:t>
+      </w:r>
+    </w:p>
+    <w:p>
+      <w:pPr>
+        <w:pStyle w:val="ListParagraph"/>
+        <w:numPr>
+          <w:ilvl w:val="0"/>
+          <w:numId w:val="3"/>
+        </w:numPr>
+      </w:pPr>
+      <w:r>
+        <w:t xml:space="preserve">Decent amount of AI usage would make </w:t>
+      </w:r>
+      <w:proofErr w:type="gramStart"/>
+      <w:r>
+        <w:t>stretch</w:t>
+      </w:r>
+      <w:proofErr w:type="gramEnd"/>
+      <w:r>
+        <w:t xml:space="preserve"> goals easier to achieve</w:t>
+      </w:r>
+    </w:p>
+    <w:p>
+      <w:pPr>
+        <w:pStyle w:val="ListParagraph"/>
+        <w:numPr>
+          <w:ilvl w:val="0"/>
+          <w:numId w:val="3"/>
+        </w:numPr>
+      </w:pPr>
+      <w:r>
+        <w:t>Will find out more after meeting with Ashton Greer</w:t>
+      </w:r>
+    </w:p>
+    <w:p>
+      <w:pPr>
+        <w:pStyle w:val="ListParagraph"/>
+      </w:pPr>
+    </w:p>
+    <w:p>
+      <w:pPr>
+        <w:pStyle w:val="ListParagraph"/>
+      </w:pPr>
+    </w:p>
+    <w:p>
+      <w:pPr>
+        <w:pStyle w:val="ListParagraph"/>
+      </w:pPr>
+    </w:p>
+    <w:p>
+      <w:pPr>
+        <w:pStyle w:val="Heading1"/>
+      </w:pPr>
+      <w:r>
+        <w:t>Conclusion</w:t>
+      </w:r>
+    </w:p>
+    <w:p/>
+    <w:p/>
+    <w:p>
+      <w:pPr>
+        <w:pStyle w:val="Heading1"/>
+      </w:pPr>
+      <w:r>
+        <w:t>References</w:t>
       </w:r>
     </w:p>
     <w:sectPr>
@@ -690,16 +1922,484 @@
 </w:document>
 </file>
 
+<file path=word/numbering.xml><?xml version="1.0" encoding="utf-8"?>
+<w:numbering xmlns:wpc="http://schemas.microsoft.com/office/word/2010/wordprocessingCanvas" xmlns:cx="http://schemas.microsoft.com/office/drawing/2014/chartex" xmlns:cx1="http://schemas.microsoft.com/office/drawing/2015/9/8/chartex" xmlns:cx2="http://schemas.microsoft.com/office/drawing/2015/10/21/chartex" xmlns:cx3="http://schemas.microsoft.com/office/drawing/2016/5/9/chartex" xmlns:cx4="http://schemas.microsoft.com/office/drawing/2016/5/10/chartex" xmlns:cx5="http://schemas.microsoft.com/office/drawing/2016/5/11/chartex" xmlns:cx6="http://schemas.microsoft.com/office/drawing/2016/5/12/chartex" xmlns:cx7="http://schemas.microsoft.com/office/drawing/2016/5/13/chartex" xmlns:cx8="http://schemas.microsoft.com/office/drawing/2016/5/14/chartex" xmlns:mc="http://schemas.openxmlformats.org/markup-compatibility/2006" xmlns:aink="http://schemas.microsoft.com/office/drawing/2016/ink" xmlns:am3d="http://schemas.microsoft.com/office/drawing/2017/model3d" xmlns:o="urn:schemas-microsoft-com:office:office" xmlns:oel="http://schemas.microsoft.com/office/2019/extlst" xmlns:r="http://schemas.openxmlformats.org/officeDocument/2006/relationships" xmlns:m="http://schemas.openxmlformats.org/officeDocument/2006/math" xmlns:v="urn:schemas-microsoft-com:vml" xmlns:wp14="http://schemas.microsoft.com/office/word/2010/wordprocessingDrawing" xmlns:wp="http://schemas.openxmlformats.org/drawingml/2006/wordprocessingDrawing" xmlns:w10="urn:schemas-microsoft-com:office:word" xmlns:w="http://schemas.openxmlformats.org/wordprocessingml/2006/main" xmlns:w14="http://schemas.microsoft.com/office/word/2010/wordml" xmlns:w15="http://schemas.microsoft.com/office/word/2012/wordml" xmlns:w16cex="http://schemas.microsoft.com/office/word/2018/wordml/cex" xmlns:w16cid="http://schemas.microsoft.com/office/word/2016/wordml/cid" xmlns:w16="http://schemas.microsoft.com/office/word/2018/wordml" xmlns:w16du="http://schemas.microsoft.com/office/word/2023/wordml/word16du" xmlns:w16sdtdh="http://schemas.microsoft.com/office/word/2020/wordml/sdtdatahash" xmlns:w16sdtfl="http://schemas.microsoft.com/office/word/2024/wordml/sdtformatlock" xmlns:w16se="http://schemas.microsoft.com/office/word/2015/wordml/symex" xmlns:wpg="http://schemas.microsoft.com/office/word/2010/wordprocessingGroup" xmlns:wpi="http://schemas.microsoft.com/office/word/2010/wordprocessingInk" xmlns:wne="http://schemas.microsoft.com/office/word/2006/wordml" xmlns:wps="http://schemas.microsoft.com/office/word/2010/wordprocessingShape" mc:Ignorable="w14 w15 w16se w16cid w16 w16cex w16sdtdh w16sdtfl w16du wp14">
+  <w:abstractNum w:abstractNumId="0" w15:restartNumberingAfterBreak="0">
+    <w:nsid w:val="099703F6"/>
+    <w:multiLevelType w:val="hybridMultilevel"/>
+    <w:tmpl w:val="4998AC54"/>
+    <w:lvl w:ilvl="0" w:tplc="04090001">
+      <w:start w:val="1"/>
+      <w:numFmt w:val="bullet"/>
+      <w:lvlText w:val=""/>
+      <w:lvlJc w:val="left"/>
+      <w:pPr>
+        <w:ind w:left="720" w:hanging="360"/>
+      </w:pPr>
+      <w:rPr>
+        <w:rFonts w:ascii="Symbol" w:hAnsi="Symbol" w:hint="default"/>
+      </w:rPr>
+    </w:lvl>
+    <w:lvl w:ilvl="1" w:tplc="04090003">
+      <w:start w:val="1"/>
+      <w:numFmt w:val="bullet"/>
+      <w:lvlText w:val="o"/>
+      <w:lvlJc w:val="left"/>
+      <w:pPr>
+        <w:ind w:left="1440" w:hanging="360"/>
+      </w:pPr>
+      <w:rPr>
+        <w:rFonts w:ascii="Courier New" w:hAnsi="Courier New" w:cs="Courier New" w:hint="default"/>
+      </w:rPr>
+    </w:lvl>
+    <w:lvl w:ilvl="2" w:tplc="04090005">
+      <w:start w:val="1"/>
+      <w:numFmt w:val="bullet"/>
+      <w:lvlText w:val=""/>
+      <w:lvlJc w:val="left"/>
+      <w:pPr>
+        <w:ind w:left="2160" w:hanging="360"/>
+      </w:pPr>
+      <w:rPr>
+        <w:rFonts w:ascii="Wingdings" w:hAnsi="Wingdings" w:hint="default"/>
+      </w:rPr>
+    </w:lvl>
+    <w:lvl w:ilvl="3" w:tplc="04090001">
+      <w:start w:val="1"/>
+      <w:numFmt w:val="bullet"/>
+      <w:lvlText w:val=""/>
+      <w:lvlJc w:val="left"/>
+      <w:pPr>
+        <w:ind w:left="2880" w:hanging="360"/>
+      </w:pPr>
+      <w:rPr>
+        <w:rFonts w:ascii="Symbol" w:hAnsi="Symbol" w:hint="default"/>
+      </w:rPr>
+    </w:lvl>
+    <w:lvl w:ilvl="4" w:tplc="04090003">
+      <w:start w:val="1"/>
+      <w:numFmt w:val="bullet"/>
+      <w:lvlText w:val="o"/>
+      <w:lvlJc w:val="left"/>
+      <w:pPr>
+        <w:ind w:left="3600" w:hanging="360"/>
+      </w:pPr>
+      <w:rPr>
+        <w:rFonts w:ascii="Courier New" w:hAnsi="Courier New" w:cs="Courier New" w:hint="default"/>
+      </w:rPr>
+    </w:lvl>
+    <w:lvl w:ilvl="5" w:tplc="04090005" w:tentative="1">
+      <w:start w:val="1"/>
+      <w:numFmt w:val="bullet"/>
+      <w:lvlText w:val=""/>
+      <w:lvlJc w:val="left"/>
+      <w:pPr>
+        <w:ind w:left="4320" w:hanging="360"/>
+      </w:pPr>
+      <w:rPr>
+        <w:rFonts w:ascii="Wingdings" w:hAnsi="Wingdings" w:hint="default"/>
+      </w:rPr>
+    </w:lvl>
+    <w:lvl w:ilvl="6" w:tplc="04090001" w:tentative="1">
+      <w:start w:val="1"/>
+      <w:numFmt w:val="bullet"/>
+      <w:lvlText w:val=""/>
+      <w:lvlJc w:val="left"/>
+      <w:pPr>
+        <w:ind w:left="5040" w:hanging="360"/>
+      </w:pPr>
+      <w:rPr>
+        <w:rFonts w:ascii="Symbol" w:hAnsi="Symbol" w:hint="default"/>
+      </w:rPr>
+    </w:lvl>
+    <w:lvl w:ilvl="7" w:tplc="04090003" w:tentative="1">
+      <w:start w:val="1"/>
+      <w:numFmt w:val="bullet"/>
+      <w:lvlText w:val="o"/>
+      <w:lvlJc w:val="left"/>
+      <w:pPr>
+        <w:ind w:left="5760" w:hanging="360"/>
+      </w:pPr>
+      <w:rPr>
+        <w:rFonts w:ascii="Courier New" w:hAnsi="Courier New" w:cs="Courier New" w:hint="default"/>
+      </w:rPr>
+    </w:lvl>
+    <w:lvl w:ilvl="8" w:tplc="04090005" w:tentative="1">
+      <w:start w:val="1"/>
+      <w:numFmt w:val="bullet"/>
+      <w:lvlText w:val=""/>
+      <w:lvlJc w:val="left"/>
+      <w:pPr>
+        <w:ind w:left="6480" w:hanging="360"/>
+      </w:pPr>
+      <w:rPr>
+        <w:rFonts w:ascii="Wingdings" w:hAnsi="Wingdings" w:hint="default"/>
+      </w:rPr>
+    </w:lvl>
+  </w:abstractNum>
+  <w:abstractNum w:abstractNumId="1" w15:restartNumberingAfterBreak="0">
+    <w:nsid w:val="1F4128A9"/>
+    <w:multiLevelType w:val="hybridMultilevel"/>
+    <w:tmpl w:val="7070E57A"/>
+    <w:lvl w:ilvl="0" w:tplc="3328DCC8">
+      <w:numFmt w:val="bullet"/>
+      <w:lvlText w:val="-"/>
+      <w:lvlJc w:val="left"/>
+      <w:pPr>
+        <w:ind w:left="720" w:hanging="360"/>
+      </w:pPr>
+      <w:rPr>
+        <w:rFonts w:ascii="Aptos" w:eastAsiaTheme="minorHAnsi" w:hAnsi="Aptos" w:cstheme="minorBidi" w:hint="default"/>
+      </w:rPr>
+    </w:lvl>
+    <w:lvl w:ilvl="1" w:tplc="04090003" w:tentative="1">
+      <w:start w:val="1"/>
+      <w:numFmt w:val="bullet"/>
+      <w:lvlText w:val="o"/>
+      <w:lvlJc w:val="left"/>
+      <w:pPr>
+        <w:ind w:left="1440" w:hanging="360"/>
+      </w:pPr>
+      <w:rPr>
+        <w:rFonts w:ascii="Courier New" w:hAnsi="Courier New" w:cs="Courier New" w:hint="default"/>
+      </w:rPr>
+    </w:lvl>
+    <w:lvl w:ilvl="2" w:tplc="04090005" w:tentative="1">
+      <w:start w:val="1"/>
+      <w:numFmt w:val="bullet"/>
+      <w:lvlText w:val=""/>
+      <w:lvlJc w:val="left"/>
+      <w:pPr>
+        <w:ind w:left="2160" w:hanging="360"/>
+      </w:pPr>
+      <w:rPr>
+        <w:rFonts w:ascii="Wingdings" w:hAnsi="Wingdings" w:hint="default"/>
+      </w:rPr>
+    </w:lvl>
+    <w:lvl w:ilvl="3" w:tplc="04090001" w:tentative="1">
+      <w:start w:val="1"/>
+      <w:numFmt w:val="bullet"/>
+      <w:lvlText w:val=""/>
+      <w:lvlJc w:val="left"/>
+      <w:pPr>
+        <w:ind w:left="2880" w:hanging="360"/>
+      </w:pPr>
+      <w:rPr>
+        <w:rFonts w:ascii="Symbol" w:hAnsi="Symbol" w:hint="default"/>
+      </w:rPr>
+    </w:lvl>
+    <w:lvl w:ilvl="4" w:tplc="04090003" w:tentative="1">
+      <w:start w:val="1"/>
+      <w:numFmt w:val="bullet"/>
+      <w:lvlText w:val="o"/>
+      <w:lvlJc w:val="left"/>
+      <w:pPr>
+        <w:ind w:left="3600" w:hanging="360"/>
+      </w:pPr>
+      <w:rPr>
+        <w:rFonts w:ascii="Courier New" w:hAnsi="Courier New" w:cs="Courier New" w:hint="default"/>
+      </w:rPr>
+    </w:lvl>
+    <w:lvl w:ilvl="5" w:tplc="04090005" w:tentative="1">
+      <w:start w:val="1"/>
+      <w:numFmt w:val="bullet"/>
+      <w:lvlText w:val=""/>
+      <w:lvlJc w:val="left"/>
+      <w:pPr>
+        <w:ind w:left="4320" w:hanging="360"/>
+      </w:pPr>
+      <w:rPr>
+        <w:rFonts w:ascii="Wingdings" w:hAnsi="Wingdings" w:hint="default"/>
+      </w:rPr>
+    </w:lvl>
+    <w:lvl w:ilvl="6" w:tplc="04090001" w:tentative="1">
+      <w:start w:val="1"/>
+      <w:numFmt w:val="bullet"/>
+      <w:lvlText w:val=""/>
+      <w:lvlJc w:val="left"/>
+      <w:pPr>
+        <w:ind w:left="5040" w:hanging="360"/>
+      </w:pPr>
+      <w:rPr>
+        <w:rFonts w:ascii="Symbol" w:hAnsi="Symbol" w:hint="default"/>
+      </w:rPr>
+    </w:lvl>
+    <w:lvl w:ilvl="7" w:tplc="04090003" w:tentative="1">
+      <w:start w:val="1"/>
+      <w:numFmt w:val="bullet"/>
+      <w:lvlText w:val="o"/>
+      <w:lvlJc w:val="left"/>
+      <w:pPr>
+        <w:ind w:left="5760" w:hanging="360"/>
+      </w:pPr>
+      <w:rPr>
+        <w:rFonts w:ascii="Courier New" w:hAnsi="Courier New" w:cs="Courier New" w:hint="default"/>
+      </w:rPr>
+    </w:lvl>
+    <w:lvl w:ilvl="8" w:tplc="04090005" w:tentative="1">
+      <w:start w:val="1"/>
+      <w:numFmt w:val="bullet"/>
+      <w:lvlText w:val=""/>
+      <w:lvlJc w:val="left"/>
+      <w:pPr>
+        <w:ind w:left="6480" w:hanging="360"/>
+      </w:pPr>
+      <w:rPr>
+        <w:rFonts w:ascii="Wingdings" w:hAnsi="Wingdings" w:hint="default"/>
+      </w:rPr>
+    </w:lvl>
+  </w:abstractNum>
+  <w:abstractNum w:abstractNumId="2" w15:restartNumberingAfterBreak="0">
+    <w:nsid w:val="733E6C0C"/>
+    <w:multiLevelType w:val="hybridMultilevel"/>
+    <w:tmpl w:val="AEB85F46"/>
+    <w:lvl w:ilvl="0" w:tplc="04090001">
+      <w:start w:val="1"/>
+      <w:numFmt w:val="bullet"/>
+      <w:lvlText w:val=""/>
+      <w:lvlJc w:val="left"/>
+      <w:pPr>
+        <w:ind w:left="720" w:hanging="360"/>
+      </w:pPr>
+      <w:rPr>
+        <w:rFonts w:ascii="Symbol" w:hAnsi="Symbol" w:hint="default"/>
+      </w:rPr>
+    </w:lvl>
+    <w:lvl w:ilvl="1" w:tplc="04090003">
+      <w:start w:val="1"/>
+      <w:numFmt w:val="bullet"/>
+      <w:lvlText w:val="o"/>
+      <w:lvlJc w:val="left"/>
+      <w:pPr>
+        <w:ind w:left="1440" w:hanging="360"/>
+      </w:pPr>
+      <w:rPr>
+        <w:rFonts w:ascii="Courier New" w:hAnsi="Courier New" w:cs="Courier New" w:hint="default"/>
+      </w:rPr>
+    </w:lvl>
+    <w:lvl w:ilvl="2" w:tplc="04090005">
+      <w:start w:val="1"/>
+      <w:numFmt w:val="bullet"/>
+      <w:lvlText w:val=""/>
+      <w:lvlJc w:val="left"/>
+      <w:pPr>
+        <w:ind w:left="2160" w:hanging="360"/>
+      </w:pPr>
+      <w:rPr>
+        <w:rFonts w:ascii="Wingdings" w:hAnsi="Wingdings" w:hint="default"/>
+      </w:rPr>
+    </w:lvl>
+    <w:lvl w:ilvl="3" w:tplc="04090001">
+      <w:start w:val="1"/>
+      <w:numFmt w:val="bullet"/>
+      <w:lvlText w:val=""/>
+      <w:lvlJc w:val="left"/>
+      <w:pPr>
+        <w:ind w:left="2880" w:hanging="360"/>
+      </w:pPr>
+      <w:rPr>
+        <w:rFonts w:ascii="Symbol" w:hAnsi="Symbol" w:hint="default"/>
+      </w:rPr>
+    </w:lvl>
+    <w:lvl w:ilvl="4" w:tplc="04090003">
+      <w:start w:val="1"/>
+      <w:numFmt w:val="bullet"/>
+      <w:lvlText w:val="o"/>
+      <w:lvlJc w:val="left"/>
+      <w:pPr>
+        <w:ind w:left="3600" w:hanging="360"/>
+      </w:pPr>
+      <w:rPr>
+        <w:rFonts w:ascii="Courier New" w:hAnsi="Courier New" w:cs="Courier New" w:hint="default"/>
+      </w:rPr>
+    </w:lvl>
+    <w:lvl w:ilvl="5" w:tplc="04090005">
+      <w:start w:val="1"/>
+      <w:numFmt w:val="bullet"/>
+      <w:lvlText w:val=""/>
+      <w:lvlJc w:val="left"/>
+      <w:pPr>
+        <w:ind w:left="4320" w:hanging="360"/>
+      </w:pPr>
+      <w:rPr>
+        <w:rFonts w:ascii="Wingdings" w:hAnsi="Wingdings" w:hint="default"/>
+      </w:rPr>
+    </w:lvl>
+    <w:lvl w:ilvl="6" w:tplc="04090001">
+      <w:start w:val="1"/>
+      <w:numFmt w:val="bullet"/>
+      <w:lvlText w:val=""/>
+      <w:lvlJc w:val="left"/>
+      <w:pPr>
+        <w:ind w:left="5040" w:hanging="360"/>
+      </w:pPr>
+      <w:rPr>
+        <w:rFonts w:ascii="Symbol" w:hAnsi="Symbol" w:hint="default"/>
+      </w:rPr>
+    </w:lvl>
+    <w:lvl w:ilvl="7" w:tplc="04090003">
+      <w:start w:val="1"/>
+      <w:numFmt w:val="bullet"/>
+      <w:lvlText w:val="o"/>
+      <w:lvlJc w:val="left"/>
+      <w:pPr>
+        <w:ind w:left="5760" w:hanging="360"/>
+      </w:pPr>
+      <w:rPr>
+        <w:rFonts w:ascii="Courier New" w:hAnsi="Courier New" w:cs="Courier New" w:hint="default"/>
+      </w:rPr>
+    </w:lvl>
+    <w:lvl w:ilvl="8" w:tplc="04090005">
+      <w:start w:val="1"/>
+      <w:numFmt w:val="bullet"/>
+      <w:lvlText w:val=""/>
+      <w:lvlJc w:val="left"/>
+      <w:pPr>
+        <w:ind w:left="6480" w:hanging="360"/>
+      </w:pPr>
+      <w:rPr>
+        <w:rFonts w:ascii="Wingdings" w:hAnsi="Wingdings" w:hint="default"/>
+      </w:rPr>
+    </w:lvl>
+  </w:abstractNum>
+  <w:abstractNum w:abstractNumId="3" w15:restartNumberingAfterBreak="0">
+    <w:nsid w:val="776E172A"/>
+    <w:multiLevelType w:val="hybridMultilevel"/>
+    <w:tmpl w:val="D21E8786"/>
+    <w:lvl w:ilvl="0" w:tplc="04090001">
+      <w:start w:val="1"/>
+      <w:numFmt w:val="bullet"/>
+      <w:lvlText w:val=""/>
+      <w:lvlJc w:val="left"/>
+      <w:pPr>
+        <w:ind w:left="720" w:hanging="360"/>
+      </w:pPr>
+      <w:rPr>
+        <w:rFonts w:ascii="Symbol" w:hAnsi="Symbol" w:hint="default"/>
+      </w:rPr>
+    </w:lvl>
+    <w:lvl w:ilvl="1" w:tplc="04090003" w:tentative="1">
+      <w:start w:val="1"/>
+      <w:numFmt w:val="bullet"/>
+      <w:lvlText w:val="o"/>
+      <w:lvlJc w:val="left"/>
+      <w:pPr>
+        <w:ind w:left="1440" w:hanging="360"/>
+      </w:pPr>
+      <w:rPr>
+        <w:rFonts w:ascii="Courier New" w:hAnsi="Courier New" w:cs="Courier New" w:hint="default"/>
+      </w:rPr>
+    </w:lvl>
+    <w:lvl w:ilvl="2" w:tplc="04090005" w:tentative="1">
+      <w:start w:val="1"/>
+      <w:numFmt w:val="bullet"/>
+      <w:lvlText w:val=""/>
+      <w:lvlJc w:val="left"/>
+      <w:pPr>
+        <w:ind w:left="2160" w:hanging="360"/>
+      </w:pPr>
+      <w:rPr>
+        <w:rFonts w:ascii="Wingdings" w:hAnsi="Wingdings" w:hint="default"/>
+      </w:rPr>
+    </w:lvl>
+    <w:lvl w:ilvl="3" w:tplc="04090001" w:tentative="1">
+      <w:start w:val="1"/>
+      <w:numFmt w:val="bullet"/>
+      <w:lvlText w:val=""/>
+      <w:lvlJc w:val="left"/>
+      <w:pPr>
+        <w:ind w:left="2880" w:hanging="360"/>
+      </w:pPr>
+      <w:rPr>
+        <w:rFonts w:ascii="Symbol" w:hAnsi="Symbol" w:hint="default"/>
+      </w:rPr>
+    </w:lvl>
+    <w:lvl w:ilvl="4" w:tplc="04090003" w:tentative="1">
+      <w:start w:val="1"/>
+      <w:numFmt w:val="bullet"/>
+      <w:lvlText w:val="o"/>
+      <w:lvlJc w:val="left"/>
+      <w:pPr>
+        <w:ind w:left="3600" w:hanging="360"/>
+      </w:pPr>
+      <w:rPr>
+        <w:rFonts w:ascii="Courier New" w:hAnsi="Courier New" w:cs="Courier New" w:hint="default"/>
+      </w:rPr>
+    </w:lvl>
+    <w:lvl w:ilvl="5" w:tplc="04090005" w:tentative="1">
+      <w:start w:val="1"/>
+      <w:numFmt w:val="bullet"/>
+      <w:lvlText w:val=""/>
+      <w:lvlJc w:val="left"/>
+      <w:pPr>
+        <w:ind w:left="4320" w:hanging="360"/>
+      </w:pPr>
+      <w:rPr>
+        <w:rFonts w:ascii="Wingdings" w:hAnsi="Wingdings" w:hint="default"/>
+      </w:rPr>
+    </w:lvl>
+    <w:lvl w:ilvl="6" w:tplc="04090001" w:tentative="1">
+      <w:start w:val="1"/>
+      <w:numFmt w:val="bullet"/>
+      <w:lvlText w:val=""/>
+      <w:lvlJc w:val="left"/>
+      <w:pPr>
+        <w:ind w:left="5040" w:hanging="360"/>
+      </w:pPr>
+      <w:rPr>
+        <w:rFonts w:ascii="Symbol" w:hAnsi="Symbol" w:hint="default"/>
+      </w:rPr>
+    </w:lvl>
+    <w:lvl w:ilvl="7" w:tplc="04090003" w:tentative="1">
+      <w:start w:val="1"/>
+      <w:numFmt w:val="bullet"/>
+      <w:lvlText w:val="o"/>
+      <w:lvlJc w:val="left"/>
+      <w:pPr>
+        <w:ind w:left="5760" w:hanging="360"/>
+      </w:pPr>
+      <w:rPr>
+        <w:rFonts w:ascii="Courier New" w:hAnsi="Courier New" w:cs="Courier New" w:hint="default"/>
+      </w:rPr>
+    </w:lvl>
+    <w:lvl w:ilvl="8" w:tplc="04090005" w:tentative="1">
+      <w:start w:val="1"/>
+      <w:numFmt w:val="bullet"/>
+      <w:lvlText w:val=""/>
+      <w:lvlJc w:val="left"/>
+      <w:pPr>
+        <w:ind w:left="6480" w:hanging="360"/>
+      </w:pPr>
+      <w:rPr>
+        <w:rFonts w:ascii="Wingdings" w:hAnsi="Wingdings" w:hint="default"/>
+      </w:rPr>
+    </w:lvl>
+  </w:abstractNum>
+  <w:num w:numId="1" w16cid:durableId="252980790">
+    <w:abstractNumId w:val="1"/>
+  </w:num>
+  <w:num w:numId="2" w16cid:durableId="884100200">
+    <w:abstractNumId w:val="2"/>
+  </w:num>
+  <w:num w:numId="3" w16cid:durableId="394278394">
+    <w:abstractNumId w:val="3"/>
+  </w:num>
+  <w:num w:numId="4" w16cid:durableId="339893344">
+    <w:abstractNumId w:val="0"/>
+  </w:num>
+</w:numbering>
+</file>
+
 <file path=word/styles.xml><?xml version="1.0" encoding="utf-8"?>
 <w:styles xmlns:mc="http://schemas.openxmlformats.org/markup-compatibility/2006" xmlns:r="http://schemas.openxmlformats.org/officeDocument/2006/relationships" xmlns:w="http://schemas.openxmlformats.org/wordprocessingml/2006/main" xmlns:w14="http://schemas.microsoft.com/office/word/2010/wordml" xmlns:w15="http://schemas.microsoft.com/office/word/2012/wordml" xmlns:w16cex="http://schemas.microsoft.com/office/word/2018/wordml/cex" xmlns:w16cid="http://schemas.microsoft.com/office/word/2016/wordml/cid" xmlns:w16="http://schemas.microsoft.com/office/word/2018/wordml" xmlns:w16du="http://schemas.microsoft.com/office/word/2023/wordml/word16du" xmlns:w16sdtdh="http://schemas.microsoft.com/office/word/2020/wordml/sdtdatahash" xmlns:w16sdtfl="http://schemas.microsoft.com/office/word/2024/wordml/sdtformatlock" xmlns:w16se="http://schemas.microsoft.com/office/word/2015/wordml/symex" mc:Ignorable="w14 w15 w16se w16cid w16 w16cex w16sdtdh w16sdtfl w16du">
   <w:docDefaults>
     <w:rPrDefault>
       <w:rPr>
-        <w:rFonts w:asciiTheme="minorHAnsi" w:eastAsiaTheme="minorEastAsia" w:hAnsiTheme="minorHAnsi" w:cstheme="minorBidi"/>
+        <w:rFonts w:asciiTheme="minorHAnsi" w:eastAsiaTheme="minorHAnsi" w:hAnsiTheme="minorHAnsi" w:cstheme="minorBidi"/>
         <w:kern w:val="2"/>
         <w:sz w:val="24"/>
         <w:szCs w:val="24"/>
-        <w:lang w:val="en-US" w:eastAsia="ja-JP" w:bidi="ar-SA"/>
+        <w:lang w:val="en-US" w:eastAsia="en-US" w:bidi="ar-SA"/>
         <w14:ligatures w14:val="standardContextual"/>
       </w:rPr>
     </w:rPrDefault>
@@ -1090,7 +2790,6 @@
   <w:style w:type="paragraph" w:default="1" w:styleId="Normal">
     <w:name w:val="Normal"/>
     <w:qFormat/>
-    <w:rsid w:val="00071D24"/>
   </w:style>
   <w:style w:type="paragraph" w:styleId="Heading1">
     <w:name w:val="heading 1"/>
@@ -1099,7 +2798,7 @@
     <w:link w:val="Heading1Char"/>
     <w:uiPriority w:val="9"/>
     <w:qFormat/>
-    <w:rsid w:val="00310D70"/>
+    <w:rsid w:val="00940EF3"/>
     <w:pPr>
       <w:keepNext/>
       <w:keepLines/>
@@ -1108,8 +2807,9 @@
     </w:pPr>
     <w:rPr>
       <w:rFonts w:asciiTheme="majorHAnsi" w:eastAsiaTheme="majorEastAsia" w:hAnsiTheme="majorHAnsi" w:cstheme="majorBidi"/>
-      <w:color w:val="2F5496" w:themeColor="accent1" w:themeShade="BF"/>
-      <w:sz w:val="40"/>
+      <w:b/>
+      <w:color w:val="000000" w:themeColor="text1"/>
+      <w:sz w:val="32"/>
       <w:szCs w:val="40"/>
     </w:rPr>
   </w:style>
@@ -1121,7 +2821,7 @@
     <w:uiPriority w:val="9"/>
     <w:unhideWhenUsed/>
     <w:qFormat/>
-    <w:rsid w:val="00310D70"/>
+    <w:rsid w:val="00940EF3"/>
     <w:pPr>
       <w:keepNext/>
       <w:keepLines/>
@@ -1130,8 +2830,9 @@
     </w:pPr>
     <w:rPr>
       <w:rFonts w:asciiTheme="majorHAnsi" w:eastAsiaTheme="majorEastAsia" w:hAnsiTheme="majorHAnsi" w:cstheme="majorBidi"/>
-      <w:color w:val="2F5496" w:themeColor="accent1" w:themeShade="BF"/>
-      <w:sz w:val="32"/>
+      <w:b/>
+      <w:color w:val="000000" w:themeColor="text1"/>
+      <w:sz w:val="28"/>
       <w:szCs w:val="32"/>
     </w:rPr>
   </w:style>
@@ -1141,10 +2842,9 @@
     <w:next w:val="Normal"/>
     <w:link w:val="Heading3Char"/>
     <w:uiPriority w:val="9"/>
-    <w:semiHidden/>
     <w:unhideWhenUsed/>
     <w:qFormat/>
-    <w:rsid w:val="00310D70"/>
+    <w:rsid w:val="00940EF3"/>
     <w:pPr>
       <w:keepNext/>
       <w:keepLines/>
@@ -1153,8 +2853,8 @@
     </w:pPr>
     <w:rPr>
       <w:rFonts w:eastAsiaTheme="majorEastAsia" w:cstheme="majorBidi"/>
-      <w:color w:val="2F5496" w:themeColor="accent1" w:themeShade="BF"/>
-      <w:sz w:val="28"/>
+      <w:b/>
+      <w:color w:val="000000" w:themeColor="text1"/>
       <w:szCs w:val="28"/>
     </w:rPr>
   </w:style>
@@ -1167,7 +2867,7 @@
     <w:semiHidden/>
     <w:unhideWhenUsed/>
     <w:qFormat/>
-    <w:rsid w:val="00310D70"/>
+    <w:rsid w:val="00675798"/>
     <w:pPr>
       <w:keepNext/>
       <w:keepLines/>
@@ -1178,7 +2878,7 @@
       <w:rFonts w:eastAsiaTheme="majorEastAsia" w:cstheme="majorBidi"/>
       <w:i/>
       <w:iCs/>
-      <w:color w:val="2F5496" w:themeColor="accent1" w:themeShade="BF"/>
+      <w:color w:val="0F4761" w:themeColor="accent1" w:themeShade="BF"/>
     </w:rPr>
   </w:style>
   <w:style w:type="paragraph" w:styleId="Heading5">
@@ -1190,7 +2890,7 @@
     <w:semiHidden/>
     <w:unhideWhenUsed/>
     <w:qFormat/>
-    <w:rsid w:val="00310D70"/>
+    <w:rsid w:val="00675798"/>
     <w:pPr>
       <w:keepNext/>
       <w:keepLines/>
@@ -1199,7 +2899,7 @@
     </w:pPr>
     <w:rPr>
       <w:rFonts w:eastAsiaTheme="majorEastAsia" w:cstheme="majorBidi"/>
-      <w:color w:val="2F5496" w:themeColor="accent1" w:themeShade="BF"/>
+      <w:color w:val="0F4761" w:themeColor="accent1" w:themeShade="BF"/>
     </w:rPr>
   </w:style>
   <w:style w:type="paragraph" w:styleId="Heading6">
@@ -1211,7 +2911,7 @@
     <w:semiHidden/>
     <w:unhideWhenUsed/>
     <w:qFormat/>
-    <w:rsid w:val="00310D70"/>
+    <w:rsid w:val="00675798"/>
     <w:pPr>
       <w:keepNext/>
       <w:keepLines/>
@@ -1234,7 +2934,7 @@
     <w:semiHidden/>
     <w:unhideWhenUsed/>
     <w:qFormat/>
-    <w:rsid w:val="00310D70"/>
+    <w:rsid w:val="00675798"/>
     <w:pPr>
       <w:keepNext/>
       <w:keepLines/>
@@ -1255,7 +2955,7 @@
     <w:semiHidden/>
     <w:unhideWhenUsed/>
     <w:qFormat/>
-    <w:rsid w:val="00310D70"/>
+    <w:rsid w:val="00675798"/>
     <w:pPr>
       <w:keepNext/>
       <w:keepLines/>
@@ -1278,7 +2978,7 @@
     <w:semiHidden/>
     <w:unhideWhenUsed/>
     <w:qFormat/>
-    <w:rsid w:val="00310D70"/>
+    <w:rsid w:val="00675798"/>
     <w:pPr>
       <w:keepNext/>
       <w:keepLines/>
@@ -1322,11 +3022,12 @@
     <w:basedOn w:val="DefaultParagraphFont"/>
     <w:link w:val="Heading1"/>
     <w:uiPriority w:val="9"/>
-    <w:rsid w:val="00310D70"/>
+    <w:rsid w:val="00940EF3"/>
     <w:rPr>
       <w:rFonts w:asciiTheme="majorHAnsi" w:eastAsiaTheme="majorEastAsia" w:hAnsiTheme="majorHAnsi" w:cstheme="majorBidi"/>
-      <w:color w:val="2F5496" w:themeColor="accent1" w:themeShade="BF"/>
-      <w:sz w:val="40"/>
+      <w:b/>
+      <w:color w:val="000000" w:themeColor="text1"/>
+      <w:sz w:val="32"/>
       <w:szCs w:val="40"/>
     </w:rPr>
   </w:style>
@@ -1335,11 +3036,12 @@
     <w:basedOn w:val="DefaultParagraphFont"/>
     <w:link w:val="Heading2"/>
     <w:uiPriority w:val="9"/>
-    <w:rsid w:val="00310D70"/>
+    <w:rsid w:val="00940EF3"/>
     <w:rPr>
       <w:rFonts w:asciiTheme="majorHAnsi" w:eastAsiaTheme="majorEastAsia" w:hAnsiTheme="majorHAnsi" w:cstheme="majorBidi"/>
-      <w:color w:val="2F5496" w:themeColor="accent1" w:themeShade="BF"/>
-      <w:sz w:val="32"/>
+      <w:b/>
+      <w:color w:val="000000" w:themeColor="text1"/>
+      <w:sz w:val="28"/>
       <w:szCs w:val="32"/>
     </w:rPr>
   </w:style>
@@ -1348,12 +3050,11 @@
     <w:basedOn w:val="DefaultParagraphFont"/>
     <w:link w:val="Heading3"/>
     <w:uiPriority w:val="9"/>
-    <w:semiHidden/>
-    <w:rsid w:val="00310D70"/>
+    <w:rsid w:val="00940EF3"/>
     <w:rPr>
       <w:rFonts w:eastAsiaTheme="majorEastAsia" w:cstheme="majorBidi"/>
-      <w:color w:val="2F5496" w:themeColor="accent1" w:themeShade="BF"/>
-      <w:sz w:val="28"/>
+      <w:b/>
+      <w:color w:val="000000" w:themeColor="text1"/>
       <w:szCs w:val="28"/>
     </w:rPr>
   </w:style>
@@ -1363,12 +3064,12 @@
     <w:link w:val="Heading4"/>
     <w:uiPriority w:val="9"/>
     <w:semiHidden/>
-    <w:rsid w:val="00310D70"/>
+    <w:rsid w:val="00675798"/>
     <w:rPr>
       <w:rFonts w:eastAsiaTheme="majorEastAsia" w:cstheme="majorBidi"/>
       <w:i/>
       <w:iCs/>
-      <w:color w:val="2F5496" w:themeColor="accent1" w:themeShade="BF"/>
+      <w:color w:val="0F4761" w:themeColor="accent1" w:themeShade="BF"/>
     </w:rPr>
   </w:style>
   <w:style w:type="character" w:customStyle="1" w:styleId="Heading5Char">
@@ -1377,10 +3078,10 @@
     <w:link w:val="Heading5"/>
     <w:uiPriority w:val="9"/>
     <w:semiHidden/>
-    <w:rsid w:val="00310D70"/>
+    <w:rsid w:val="00675798"/>
     <w:rPr>
       <w:rFonts w:eastAsiaTheme="majorEastAsia" w:cstheme="majorBidi"/>
-      <w:color w:val="2F5496" w:themeColor="accent1" w:themeShade="BF"/>
+      <w:color w:val="0F4761" w:themeColor="accent1" w:themeShade="BF"/>
     </w:rPr>
   </w:style>
   <w:style w:type="character" w:customStyle="1" w:styleId="Heading6Char">
@@ -1389,7 +3090,7 @@
     <w:link w:val="Heading6"/>
     <w:uiPriority w:val="9"/>
     <w:semiHidden/>
-    <w:rsid w:val="00310D70"/>
+    <w:rsid w:val="00675798"/>
     <w:rPr>
       <w:rFonts w:eastAsiaTheme="majorEastAsia" w:cstheme="majorBidi"/>
       <w:i/>
@@ -1403,7 +3104,7 @@
     <w:link w:val="Heading7"/>
     <w:uiPriority w:val="9"/>
     <w:semiHidden/>
-    <w:rsid w:val="00310D70"/>
+    <w:rsid w:val="00675798"/>
     <w:rPr>
       <w:rFonts w:eastAsiaTheme="majorEastAsia" w:cstheme="majorBidi"/>
       <w:color w:val="595959" w:themeColor="text1" w:themeTint="A6"/>
@@ -1415,7 +3116,7 @@
     <w:link w:val="Heading8"/>
     <w:uiPriority w:val="9"/>
     <w:semiHidden/>
-    <w:rsid w:val="00310D70"/>
+    <w:rsid w:val="00675798"/>
     <w:rPr>
       <w:rFonts w:eastAsiaTheme="majorEastAsia" w:cstheme="majorBidi"/>
       <w:i/>
@@ -1429,7 +3130,7 @@
     <w:link w:val="Heading9"/>
     <w:uiPriority w:val="9"/>
     <w:semiHidden/>
-    <w:rsid w:val="00310D70"/>
+    <w:rsid w:val="00675798"/>
     <w:rPr>
       <w:rFonts w:eastAsiaTheme="majorEastAsia" w:cstheme="majorBidi"/>
       <w:color w:val="272727" w:themeColor="text1" w:themeTint="D8"/>
@@ -1442,13 +3143,14 @@
     <w:link w:val="TitleChar"/>
     <w:uiPriority w:val="10"/>
     <w:qFormat/>
-    <w:rsid w:val="00310D70"/>
+    <w:rsid w:val="00940EF3"/>
     <w:pPr>
       <w:spacing w:after="80" w:line="240" w:lineRule="auto"/>
       <w:contextualSpacing/>
     </w:pPr>
     <w:rPr>
       <w:rFonts w:asciiTheme="majorHAnsi" w:eastAsiaTheme="majorEastAsia" w:hAnsiTheme="majorHAnsi" w:cstheme="majorBidi"/>
+      <w:b/>
       <w:spacing w:val="-10"/>
       <w:kern w:val="28"/>
       <w:sz w:val="56"/>
@@ -1460,9 +3162,10 @@
     <w:basedOn w:val="DefaultParagraphFont"/>
     <w:link w:val="Title"/>
     <w:uiPriority w:val="10"/>
-    <w:rsid w:val="00310D70"/>
+    <w:rsid w:val="00940EF3"/>
     <w:rPr>
       <w:rFonts w:asciiTheme="majorHAnsi" w:eastAsiaTheme="majorEastAsia" w:hAnsiTheme="majorHAnsi" w:cstheme="majorBidi"/>
+      <w:b/>
       <w:spacing w:val="-10"/>
       <w:kern w:val="28"/>
       <w:sz w:val="56"/>
@@ -1476,7 +3179,7 @@
     <w:link w:val="SubtitleChar"/>
     <w:uiPriority w:val="11"/>
     <w:qFormat/>
-    <w:rsid w:val="00310D70"/>
+    <w:rsid w:val="00675798"/>
     <w:pPr>
       <w:numPr>
         <w:ilvl w:val="1"/>
@@ -1495,7 +3198,7 @@
     <w:basedOn w:val="DefaultParagraphFont"/>
     <w:link w:val="Subtitle"/>
     <w:uiPriority w:val="11"/>
-    <w:rsid w:val="00310D70"/>
+    <w:rsid w:val="00675798"/>
     <w:rPr>
       <w:rFonts w:eastAsiaTheme="majorEastAsia" w:cstheme="majorBidi"/>
       <w:color w:val="595959" w:themeColor="text1" w:themeTint="A6"/>
@@ -1511,7 +3214,7 @@
     <w:link w:val="QuoteChar"/>
     <w:uiPriority w:val="29"/>
     <w:qFormat/>
-    <w:rsid w:val="00310D70"/>
+    <w:rsid w:val="00675798"/>
     <w:pPr>
       <w:spacing w:before="160"/>
       <w:jc w:val="center"/>
@@ -1527,7 +3230,7 @@
     <w:basedOn w:val="DefaultParagraphFont"/>
     <w:link w:val="Quote"/>
     <w:uiPriority w:val="29"/>
-    <w:rsid w:val="00310D70"/>
+    <w:rsid w:val="00675798"/>
     <w:rPr>
       <w:i/>
       <w:iCs/>
@@ -1539,7 +3242,7 @@
     <w:basedOn w:val="Normal"/>
     <w:uiPriority w:val="34"/>
     <w:qFormat/>
-    <w:rsid w:val="00310D70"/>
+    <w:rsid w:val="00675798"/>
     <w:pPr>
       <w:ind w:left="720"/>
       <w:contextualSpacing/>
@@ -1550,11 +3253,11 @@
     <w:basedOn w:val="DefaultParagraphFont"/>
     <w:uiPriority w:val="21"/>
     <w:qFormat/>
-    <w:rsid w:val="00310D70"/>
+    <w:rsid w:val="00675798"/>
     <w:rPr>
       <w:i/>
       <w:iCs/>
-      <w:color w:val="2F5496" w:themeColor="accent1" w:themeShade="BF"/>
+      <w:color w:val="0F4761" w:themeColor="accent1" w:themeShade="BF"/>
     </w:rPr>
   </w:style>
   <w:style w:type="paragraph" w:styleId="IntenseQuote">
@@ -1564,11 +3267,11 @@
     <w:link w:val="IntenseQuoteChar"/>
     <w:uiPriority w:val="30"/>
     <w:qFormat/>
-    <w:rsid w:val="00310D70"/>
+    <w:rsid w:val="00675798"/>
     <w:pPr>
       <w:pBdr>
-        <w:top w:val="single" w:sz="4" w:space="10" w:color="2F5496" w:themeColor="accent1" w:themeShade="BF"/>
-        <w:bottom w:val="single" w:sz="4" w:space="10" w:color="2F5496" w:themeColor="accent1" w:themeShade="BF"/>
+        <w:top w:val="single" w:sz="4" w:space="10" w:color="0F4761" w:themeColor="accent1" w:themeShade="BF"/>
+        <w:bottom w:val="single" w:sz="4" w:space="10" w:color="0F4761" w:themeColor="accent1" w:themeShade="BF"/>
       </w:pBdr>
       <w:spacing w:before="360" w:after="360"/>
       <w:ind w:left="864" w:right="864"/>
@@ -1577,7 +3280,7 @@
     <w:rPr>
       <w:i/>
       <w:iCs/>
-      <w:color w:val="2F5496" w:themeColor="accent1" w:themeShade="BF"/>
+      <w:color w:val="0F4761" w:themeColor="accent1" w:themeShade="BF"/>
     </w:rPr>
   </w:style>
   <w:style w:type="character" w:customStyle="1" w:styleId="IntenseQuoteChar">
@@ -1585,11 +3288,11 @@
     <w:basedOn w:val="DefaultParagraphFont"/>
     <w:link w:val="IntenseQuote"/>
     <w:uiPriority w:val="30"/>
-    <w:rsid w:val="00310D70"/>
+    <w:rsid w:val="00675798"/>
     <w:rPr>
       <w:i/>
       <w:iCs/>
-      <w:color w:val="2F5496" w:themeColor="accent1" w:themeShade="BF"/>
+      <w:color w:val="0F4761" w:themeColor="accent1" w:themeShade="BF"/>
     </w:rPr>
   </w:style>
   <w:style w:type="character" w:styleId="IntenseReference">
@@ -1597,12 +3300,12 @@
     <w:basedOn w:val="DefaultParagraphFont"/>
     <w:uiPriority w:val="32"/>
     <w:qFormat/>
-    <w:rsid w:val="00310D70"/>
+    <w:rsid w:val="00675798"/>
     <w:rPr>
       <w:b/>
       <w:bCs/>
       <w:smallCaps/>
-      <w:color w:val="2F5496" w:themeColor="accent1" w:themeShade="BF"/>
+      <w:color w:val="0F4761" w:themeColor="accent1" w:themeShade="BF"/>
       <w:spacing w:val="5"/>
     </w:rPr>
   </w:style>
@@ -1613,16 +3316,16 @@
     <w:uiPriority w:val="39"/>
     <w:unhideWhenUsed/>
     <w:qFormat/>
-    <w:rsid w:val="002965A0"/>
+    <w:rsid w:val="00940EF3"/>
     <w:pPr>
       <w:spacing w:before="240" w:after="0" w:line="259" w:lineRule="auto"/>
       <w:outlineLvl w:val="9"/>
     </w:pPr>
     <w:rPr>
+      <w:b w:val="0"/>
+      <w:color w:val="0F4761" w:themeColor="accent1" w:themeShade="BF"/>
       <w:kern w:val="0"/>
-      <w:sz w:val="32"/>
       <w:szCs w:val="32"/>
-      <w:lang w:eastAsia="en-US"/>
       <w14:ligatures w14:val="none"/>
     </w:rPr>
   </w:style>
@@ -1633,19 +3336,23 @@
     <w:autoRedefine/>
     <w:uiPriority w:val="39"/>
     <w:unhideWhenUsed/>
-    <w:rsid w:val="002965A0"/>
+    <w:rsid w:val="00940EF3"/>
     <w:pPr>
       <w:spacing w:after="100"/>
     </w:pPr>
+    <w:rPr>
+      <w:rFonts w:eastAsiaTheme="minorEastAsia"/>
+      <w:lang w:eastAsia="ja-JP"/>
+    </w:rPr>
   </w:style>
   <w:style w:type="character" w:styleId="Hyperlink">
     <w:name w:val="Hyperlink"/>
     <w:basedOn w:val="DefaultParagraphFont"/>
     <w:uiPriority w:val="99"/>
     <w:unhideWhenUsed/>
-    <w:rsid w:val="002965A0"/>
+    <w:rsid w:val="00940EF3"/>
     <w:rPr>
-      <w:color w:val="0563C1" w:themeColor="hyperlink"/>
+      <w:color w:val="467886" w:themeColor="hyperlink"/>
       <w:u w:val="single"/>
     </w:rPr>
   </w:style>
@@ -1656,10 +3363,27 @@
     <w:autoRedefine/>
     <w:uiPriority w:val="39"/>
     <w:unhideWhenUsed/>
-    <w:rsid w:val="00A8575A"/>
+    <w:rsid w:val="00940EF3"/>
     <w:pPr>
       <w:spacing w:after="100"/>
       <w:ind w:left="240"/>
+    </w:pPr>
+    <w:rPr>
+      <w:rFonts w:eastAsiaTheme="minorEastAsia"/>
+      <w:lang w:eastAsia="ja-JP"/>
+    </w:rPr>
+  </w:style>
+  <w:style w:type="paragraph" w:styleId="TOC3">
+    <w:name w:val="toc 3"/>
+    <w:basedOn w:val="Normal"/>
+    <w:next w:val="Normal"/>
+    <w:autoRedefine/>
+    <w:uiPriority w:val="39"/>
+    <w:unhideWhenUsed/>
+    <w:rsid w:val="00940EF3"/>
+    <w:pPr>
+      <w:spacing w:after="100"/>
+      <w:ind w:left="480"/>
     </w:pPr>
   </w:style>
 </w:styles>
@@ -1676,39 +3400,39 @@
         <a:sysClr val="window" lastClr="FFFFFF"/>
       </a:lt1>
       <a:dk2>
-        <a:srgbClr val="44546A"/>
+        <a:srgbClr val="0E2841"/>
       </a:dk2>
       <a:lt2>
-        <a:srgbClr val="E7E6E6"/>
+        <a:srgbClr val="E8E8E8"/>
       </a:lt2>
       <a:accent1>
-        <a:srgbClr val="4472C4"/>
+        <a:srgbClr val="156082"/>
       </a:accent1>
       <a:accent2>
-        <a:srgbClr val="ED7D31"/>
+        <a:srgbClr val="E97132"/>
       </a:accent2>
       <a:accent3>
-        <a:srgbClr val="A5A5A5"/>
+        <a:srgbClr val="196B24"/>
       </a:accent3>
       <a:accent4>
-        <a:srgbClr val="FFC000"/>
+        <a:srgbClr val="0F9ED5"/>
       </a:accent4>
       <a:accent5>
-        <a:srgbClr val="5B9BD5"/>
+        <a:srgbClr val="A02B93"/>
       </a:accent5>
       <a:accent6>
-        <a:srgbClr val="70AD47"/>
+        <a:srgbClr val="4EA72E"/>
       </a:accent6>
       <a:hlink>
-        <a:srgbClr val="0563C1"/>
+        <a:srgbClr val="467886"/>
       </a:hlink>
       <a:folHlink>
-        <a:srgbClr val="954F72"/>
+        <a:srgbClr val="96607D"/>
       </a:folHlink>
     </a:clrScheme>
     <a:fontScheme name="Office">
       <a:majorFont>
-        <a:latin typeface="Calibri Light" panose="020F0302020204030204"/>
+        <a:latin typeface="Aptos Display" panose="02110004020202020204"/>
         <a:ea typeface=""/>
         <a:cs typeface=""/>
         <a:font script="Jpan" typeface="游ゴシック Light"/>
@@ -1760,10 +3484,10 @@
         <a:font script="Tfng" typeface="Ebrima"/>
       </a:majorFont>
       <a:minorFont>
-        <a:latin typeface="Calibri" panose="020F0502020204030204"/>
+        <a:latin typeface="Aptos" panose="02110004020202020204"/>
         <a:ea typeface=""/>
         <a:cs typeface=""/>
-        <a:font script="Jpan" typeface="游ゴシック"/>
+        <a:font script="Jpan" typeface="游明朝"/>
         <a:font script="Hang" typeface="맑은 고딕"/>
         <a:font script="Hans" typeface="等线"/>
         <a:font script="Hant" typeface="新細明體"/>
@@ -1954,20 +3678,8 @@
   <a:extraClrSchemeLst/>
   <a:extLst>
     <a:ext uri="{05A4C25C-085E-4340-85A3-A5531E510DB2}">
-      <thm15:themeFamily xmlns:thm15="http://schemas.microsoft.com/office/thememl/2012/main" name="Office Theme" id="{62F939B6-93AF-4DB8-9C6B-D6C7DFDC589F}" vid="{4A3C46E8-61CC-4603-A589-7422A47A8E4A}"/>
+      <thm15:themeFamily xmlns:thm15="http://schemas.microsoft.com/office/thememl/2012/main" name="Office Theme" id="{2E142A2C-CD16-42D6-873A-C26D2A0506FA}" vid="{1BDDFF52-6CD6-40A5-AB3C-68EB2F1E4D0A}"/>
     </a:ext>
   </a:extLst>
 </a:theme>
-</file>
-
-<file path=customXml/item1.xml><?xml version="1.0" encoding="utf-8"?>
-<b:Sources xmlns:b="http://schemas.openxmlformats.org/officeDocument/2006/bibliography" xmlns="http://schemas.openxmlformats.org/officeDocument/2006/bibliography" SelectedStyle="\APASixthEditionOfficeOnline.xsl" StyleName="APA" Version="6"/>
-</file>
-
-<file path=customXml/itemProps1.xml><?xml version="1.0" encoding="utf-8"?>
-<ds:datastoreItem xmlns:ds="http://schemas.openxmlformats.org/officeDocument/2006/customXml" ds:itemID="{662452FB-33FF-4D42-B383-0E7E0844F241}">
-  <ds:schemaRefs>
-    <ds:schemaRef ds:uri="http://schemas.openxmlformats.org/officeDocument/2006/bibliography"/>
-  </ds:schemaRefs>
-</ds:datastoreItem>
 </file>
</xml_diff>

<commit_message>
Added to the Problem section under the modern tools with flaws subheading
</commit_message>
<xml_diff>
--- a/Traffic Sim.docx
+++ b/Traffic Sim.docx
@@ -1345,9 +1345,48 @@
       <w:pPr>
         <w:pStyle w:val="Heading2"/>
       </w:pPr>
-      <w:bookmarkStart w:id="4" w:name="_Toc243679927"/>
+      <w:bookmarkStart w:id="4" w:name="_Toc243679928"/>
+      <w:bookmarkStart w:id="5" w:name="_Toc243679927"/>
       <w:r>
         <w:t>Modern tools with flaws</w:t>
+      </w:r>
+      <w:bookmarkEnd w:id="5"/>
+    </w:p>
+    <w:p>
+      <w:r>
+        <w:t xml:space="preserve">There are many traffic simulation programs used for transportation. PTV Vissim and Aimsun Next are two leading simulators, which model the movement of vehicles and pedestrians in a road network. These have proven to be powerful tools, but they are very expensive. Aimsun’s most basic “lite” model is </w:t>
+      </w:r>
+      <w:r>
+        <w:t>€2,000</w:t>
+      </w:r>
+      <w:r>
+        <w:t xml:space="preserve"> ($2,244.60) / year and limited to 20 intersections, while PTV Vissim’s pricing is only available upon request, but price goes up as you add more junctions and modules.</w:t>
+      </w:r>
+    </w:p>
+    <w:p/>
+    <w:p>
+      <w:r>
+        <w:t xml:space="preserve">These programs are built for experts in their field, with even a simple project that takes a lot of effort. The Federal Highway Administration warns that microsimulation can be “time-consuming and resource-intensive activity” (Dowling et al. 2004). Models need huge amounts of data and must be calibrated before results become viable. The PTV group suggests a 16-hour course just to learn the basics of using their software </w:t>
+      </w:r>
+      <w:r>
+        <w:t xml:space="preserve">(PTV Planung Transport Verkehr GmbH, </w:t>
+      </w:r>
+      <w:r>
+        <w:t>2026</w:t>
+      </w:r>
+      <w:r>
+        <w:t>)</w:t>
+      </w:r>
+      <w:r>
+        <w:t>.</w:t>
+      </w:r>
+    </w:p>
+    <w:p>
+      <w:pPr>
+        <w:pStyle w:val="Heading2"/>
+      </w:pPr>
+      <w:r>
+        <w:t>The Who</w:t>
       </w:r>
       <w:bookmarkEnd w:id="4"/>
     </w:p>
@@ -1360,7 +1399,7 @@
         </w:numPr>
       </w:pPr>
       <w:r>
-        <w:t>Available commercial software</w:t>
+        <w:t>Good software not available to the public</w:t>
       </w:r>
     </w:p>
     <w:p>
@@ -1372,7 +1411,7 @@
         </w:numPr>
       </w:pPr>
       <w:r>
-        <w:t>Complexity</w:t>
+        <w:t>Students lack hands on tools</w:t>
       </w:r>
     </w:p>
     <w:p>
@@ -1384,161 +1423,115 @@
         </w:numPr>
       </w:pPr>
       <w:r>
-        <w:t>Drawbacks</w:t>
+        <w:t>Results understood by engineers and businessmen</w:t>
+      </w:r>
+    </w:p>
+    <w:p/>
+    <w:p>
+      <w:pPr>
+        <w:pStyle w:val="Heading1"/>
+      </w:pPr>
+      <w:bookmarkStart w:id="6" w:name="_Toc243679929"/>
+      <w:r>
+        <w:t>Solution</w:t>
+      </w:r>
+      <w:bookmarkEnd w:id="6"/>
+    </w:p>
+    <w:p>
+      <w:r>
+        <w:t xml:space="preserve">Properly addressing design requirements involves a streamlined, comprehensive approach. The design workflow will be included in the same program. </w:t>
       </w:r>
     </w:p>
     <w:p>
       <w:pPr>
         <w:pStyle w:val="Heading2"/>
       </w:pPr>
-      <w:bookmarkStart w:id="5" w:name="_Toc243679928"/>
-      <w:r>
-        <w:t>The Who</w:t>
-      </w:r>
-      <w:bookmarkEnd w:id="5"/>
-    </w:p>
-    <w:p>
-      <w:pPr>
-        <w:pStyle w:val="ListParagraph"/>
-        <w:numPr>
-          <w:ilvl w:val="0"/>
-          <w:numId w:val="1"/>
-        </w:numPr>
-      </w:pPr>
-      <w:r>
-        <w:t>Good software not available to the public</w:t>
-      </w:r>
-    </w:p>
-    <w:p>
-      <w:pPr>
-        <w:pStyle w:val="ListParagraph"/>
-        <w:numPr>
-          <w:ilvl w:val="0"/>
-          <w:numId w:val="1"/>
-        </w:numPr>
-      </w:pPr>
-      <w:r>
-        <w:t>Students lack hands on tools</w:t>
-      </w:r>
-    </w:p>
-    <w:p>
-      <w:pPr>
-        <w:pStyle w:val="ListParagraph"/>
-        <w:numPr>
-          <w:ilvl w:val="0"/>
-          <w:numId w:val="1"/>
-        </w:numPr>
-      </w:pPr>
-      <w:r>
-        <w:t>Results understood by engineers and businessmen</w:t>
-      </w:r>
-    </w:p>
-    <w:p/>
-    <w:p>
-      <w:pPr>
-        <w:pStyle w:val="Heading1"/>
-      </w:pPr>
-      <w:bookmarkStart w:id="6" w:name="_Toc243679929"/>
-      <w:r>
-        <w:t>Solution</w:t>
-      </w:r>
-      <w:bookmarkEnd w:id="6"/>
-    </w:p>
-    <w:p>
-      <w:r>
-        <w:t xml:space="preserve">Properly addressing design requirements involves a streamlined, comprehensive approach. The design workflow will be included in the same program. </w:t>
+      <w:bookmarkStart w:id="7" w:name="_Toc243679930"/>
+      <w:r>
+        <w:t>Road Network Builder</w:t>
+      </w:r>
+      <w:bookmarkEnd w:id="7"/>
+    </w:p>
+    <w:p>
+      <w:r>
+        <w:t>Entrances and exits from the intersection can be defined and configured for traffic density, and the entire intersection can be assembled from a reference photo. Overpasses and underpasses can be built with a layer system to separate the intersection into vertical slices.</w:t>
       </w:r>
     </w:p>
     <w:p>
       <w:pPr>
         <w:pStyle w:val="Heading2"/>
       </w:pPr>
-      <w:bookmarkStart w:id="7" w:name="_Toc243679930"/>
-      <w:r>
-        <w:t>Road Network Builder</w:t>
-      </w:r>
-      <w:bookmarkEnd w:id="7"/>
-    </w:p>
-    <w:p>
-      <w:r>
-        <w:t>Entrances and exits from the intersection can be defined and configured for traffic density, and the entire intersection can be assembled from a reference photo. Overpasses and underpasses can be built with a layer system to separate the intersection into vertical slices.</w:t>
+      <w:bookmarkStart w:id="8" w:name="_Toc243679931"/>
+      <w:r>
+        <w:lastRenderedPageBreak/>
+        <w:t>Simulation</w:t>
+      </w:r>
+      <w:bookmarkEnd w:id="8"/>
+    </w:p>
+    <w:p>
+      <w:r>
+        <w:t>An intersection in the program can be tested using simulated traffic to determine its effectiveness. Simulations are visual, with individual vehicles and pedestrians using the intersection.</w:t>
       </w:r>
     </w:p>
     <w:p>
       <w:pPr>
         <w:pStyle w:val="Heading2"/>
       </w:pPr>
-      <w:bookmarkStart w:id="8" w:name="_Toc243679931"/>
-      <w:r>
-        <w:t>Simulation</w:t>
-      </w:r>
-      <w:bookmarkEnd w:id="8"/>
-    </w:p>
-    <w:p>
-      <w:r>
-        <w:t>An intersection in the program can be tested using simulated traffic to determine its effectiveness. Simulations are visual, with individual vehicles and pedestrians using the intersection.</w:t>
+      <w:bookmarkStart w:id="9" w:name="_Toc243679932"/>
+      <w:r>
+        <w:t>Adjustable Traffic Volume</w:t>
+      </w:r>
+      <w:bookmarkEnd w:id="9"/>
+    </w:p>
+    <w:p>
+      <w:r>
+        <w:t>Volume can be adjusted manually and be balanced to simulate the needs of the real thing.</w:t>
       </w:r>
     </w:p>
     <w:p>
       <w:pPr>
         <w:pStyle w:val="Heading2"/>
       </w:pPr>
-      <w:bookmarkStart w:id="9" w:name="_Toc243679932"/>
-      <w:r>
-        <w:t>Adjustable Traffic Volume</w:t>
-      </w:r>
-      <w:bookmarkEnd w:id="9"/>
-    </w:p>
-    <w:p>
-      <w:r>
-        <w:t>Volume can be adjusted manually and be balanced to simulate the needs of the real thing.</w:t>
+      <w:bookmarkStart w:id="10" w:name="_Toc243679933"/>
+      <w:r>
+        <w:t>Performance Metrics</w:t>
+      </w:r>
+      <w:bookmarkEnd w:id="10"/>
+    </w:p>
+    <w:p>
+      <w:r>
+        <w:t xml:space="preserve">Simulations will </w:t>
+      </w:r>
+      <w:proofErr w:type="gramStart"/>
+      <w:r>
+        <w:t>return</w:t>
+      </w:r>
+      <w:proofErr w:type="gramEnd"/>
+      <w:r>
+        <w:t xml:space="preserve"> stats of time waiting, average speed and amount of traffic that made it through.</w:t>
       </w:r>
     </w:p>
     <w:p>
       <w:pPr>
         <w:pStyle w:val="Heading2"/>
       </w:pPr>
-      <w:bookmarkStart w:id="10" w:name="_Toc243679933"/>
-      <w:r>
-        <w:t>Performance Metrics</w:t>
-      </w:r>
-      <w:bookmarkEnd w:id="10"/>
-    </w:p>
-    <w:p>
-      <w:r>
-        <w:t xml:space="preserve">Simulations will </w:t>
-      </w:r>
-      <w:proofErr w:type="gramStart"/>
-      <w:r>
-        <w:t>return</w:t>
-      </w:r>
-      <w:proofErr w:type="gramEnd"/>
-      <w:r>
-        <w:t xml:space="preserve"> stats of time waiting, average speed and amount of traffic that made it through.</w:t>
+      <w:bookmarkStart w:id="11" w:name="_Toc243679934"/>
+      <w:r>
+        <w:t>Simulation Comparison</w:t>
+      </w:r>
+      <w:bookmarkEnd w:id="11"/>
+    </w:p>
+    <w:p>
+      <w:r>
+        <w:t>Store data of prior simulations and compare different designs and effectiveness under different conditions.</w:t>
       </w:r>
     </w:p>
     <w:p>
       <w:pPr>
         <w:pStyle w:val="Heading2"/>
       </w:pPr>
-      <w:bookmarkStart w:id="11" w:name="_Toc243679934"/>
-      <w:r>
-        <w:t>Simulation Comparison</w:t>
-      </w:r>
-      <w:bookmarkEnd w:id="11"/>
-    </w:p>
-    <w:p>
-      <w:r>
-        <w:t>Store data of prior simulations and compare different designs and effectiveness under different conditions.</w:t>
-      </w:r>
-    </w:p>
-    <w:p>
-      <w:pPr>
-        <w:pStyle w:val="Heading2"/>
-      </w:pPr>
       <w:bookmarkStart w:id="12" w:name="_Toc243679935"/>
       <w:r>
-        <w:lastRenderedPageBreak/>
         <w:t>Suggested Intersection</w:t>
       </w:r>
       <w:bookmarkEnd w:id="12"/>
@@ -1733,6 +1726,7 @@
         </w:numPr>
       </w:pPr>
       <w:r>
+        <w:lastRenderedPageBreak/>
         <w:t>Upload video footage to track cars going in directions to accurately run simulation on real data</w:t>
       </w:r>
     </w:p>

</xml_diff>

<commit_message>
More solution subsection content
</commit_message>
<xml_diff>
--- a/Traffic Sim.docx
+++ b/Traffic Sim.docx
@@ -1307,7 +1307,15 @@
     </w:p>
     <w:p>
       <w:r>
-        <w:t xml:space="preserve">Traffic congestion of one of the most widespread problems in urban life, influencing city residents every day. Drivers lose significant time each year sitting in traffic, burning up fuel, and contributing to rising air pollution. Congestion can also take an economic toll. Congested roads lead to higher stress and frustration, raising the likelihood of accidents, and discouraging people from traveling altogether. Researchers have noted that traffic congestion cause large cities to deliver less than they should given their size and resources </w:t>
+        <w:t xml:space="preserve">Traffic congestion of one of the most widespread problems in urban life, influencing city residents every day. Drivers lose significant time each year sitting in traffic, burning up fuel, and contributing to rising air pollution. Congestion can also take an economic toll. Congested roads lead to higher stress and frustration, raising the likelihood of accidents, and discouraging people from traveling altogether. Researchers have noted that traffic congestion cause large cities to deliver less than they should </w:t>
+      </w:r>
+      <w:proofErr w:type="spellStart"/>
+      <w:r>
+        <w:t>given</w:t>
+      </w:r>
+      <w:proofErr w:type="spellEnd"/>
+      <w:r>
+        <w:t xml:space="preserve"> their size and resources </w:t>
       </w:r>
       <w:r>
         <w:t>(Andrew, 2025)</w:t>
@@ -1334,7 +1342,15 @@
         <w:t xml:space="preserve">Infrastructure has vastly changed to accommodate dense population and destinations. Modern intersections are hardly uniform, varying in geometry, visibility, and traffic density. Traffic complexity is measured by combing static geometry such as number of approach legs, road width, sight distance, and presence of islands or medians. With dynamic environments such as traffic volume, pedestrian crossing, and bicycle lanes. More complexity of intersections has shown an increase in the mental workload of drivers </w:t>
       </w:r>
       <w:r>
-        <w:t>(Hannes Weinreuter et al., 2022)</w:t>
+        <w:t xml:space="preserve">(Hannes </w:t>
+      </w:r>
+      <w:proofErr w:type="spellStart"/>
+      <w:r>
+        <w:t>Weinreuter</w:t>
+      </w:r>
+      <w:proofErr w:type="spellEnd"/>
+      <w:r>
+        <w:t xml:space="preserve"> et al., 2022)</w:t>
       </w:r>
       <w:r>
         <w:t xml:space="preserve">. </w:t>
@@ -1438,92 +1454,56 @@
       <w:pPr>
         <w:pStyle w:val="Heading1"/>
       </w:pPr>
-      <w:bookmarkStart w:id="6" w:name="_Toc243679929"/>
+      <w:bookmarkStart w:id="6" w:name="_Toc243679936"/>
+      <w:bookmarkStart w:id="7" w:name="_Toc243679929"/>
       <w:r>
         <w:t>Solution</w:t>
       </w:r>
+      <w:bookmarkEnd w:id="7"/>
+    </w:p>
+    <w:p>
+      <w:r>
+        <w:t>The proposed program will be a tool to improve the design process of intersections by integrating traffic simulations with a workflow for designing intersections. Reducing the time spent testing and iterating on designs by streamlining the process.</w:t>
+      </w:r>
+    </w:p>
+    <w:p>
+      <w:pPr>
+        <w:pStyle w:val="Heading2"/>
+      </w:pPr>
+      <w:bookmarkStart w:id="8" w:name="_Toc243679930"/>
+      <w:r>
+        <w:t>Road Network Builder</w:t>
+      </w:r>
+      <w:bookmarkEnd w:id="8"/>
+    </w:p>
+    <w:p>
+      <w:r>
+        <w:t xml:space="preserve">Building an intersection will be done visually to make the process intuitive both for creating one standalone or from an existing layout. Current workflows for this use case are split into multiple, separately developed tools. A system to combine these functions with a single toolset will make the process smoother and more intuitive. </w:t>
+      </w:r>
+    </w:p>
+    <w:p>
+      <w:pPr>
+        <w:pStyle w:val="Heading2"/>
+      </w:pPr>
+      <w:bookmarkStart w:id="9" w:name="_Toc243679931"/>
+      <w:r>
+        <w:t>Simulation</w:t>
+      </w:r>
+      <w:bookmarkEnd w:id="9"/>
+    </w:p>
+    <w:p>
+      <w:r>
+        <w:t>An intersection in the program can be tested using simulated traffic to determine its effectiveness. Simulations are visual, with individual vehicles and pedestrians using the intersection. Including this with design tools makes adjustments quick and prototyping fast.</w:t>
+      </w:r>
+    </w:p>
+    <w:p>
+      <w:pPr>
+        <w:pStyle w:val="Heading1"/>
+      </w:pPr>
+      <w:r>
+        <w:t>Features</w:t>
+      </w:r>
       <w:bookmarkEnd w:id="6"/>
-    </w:p>
-    <w:p>
-      <w:r>
-        <w:t xml:space="preserve">The proposed program will be a tool to improve the design process of intersections by integrating </w:t>
-      </w:r>
-      <w:r>
-        <w:t>traffic simulations</w:t>
-      </w:r>
-      <w:r>
-        <w:t xml:space="preserve"> with </w:t>
-      </w:r>
-      <w:r>
-        <w:t>a workflow</w:t>
-      </w:r>
-      <w:r>
-        <w:t xml:space="preserve"> for designing intersections. Reducing the time </w:t>
-      </w:r>
-      <w:r>
-        <w:t>spent</w:t>
-      </w:r>
-      <w:r>
-        <w:t xml:space="preserve"> test</w:t>
-      </w:r>
-      <w:r>
-        <w:t xml:space="preserve">ing </w:t>
-      </w:r>
-      <w:r>
-        <w:t xml:space="preserve">and </w:t>
-      </w:r>
-      <w:r>
-        <w:t xml:space="preserve">iterating </w:t>
-      </w:r>
-      <w:r>
-        <w:t>on designs</w:t>
-      </w:r>
-      <w:r>
-        <w:t xml:space="preserve"> by streamlining the process</w:t>
-      </w:r>
-      <w:r>
-        <w:t>.</w:t>
-      </w:r>
-    </w:p>
-    <w:p>
-      <w:pPr>
-        <w:pStyle w:val="Heading2"/>
-      </w:pPr>
-      <w:bookmarkStart w:id="7" w:name="_Toc243679930"/>
-      <w:r>
-        <w:t>Road Network Builder</w:t>
-      </w:r>
-      <w:bookmarkEnd w:id="7"/>
-    </w:p>
-    <w:p>
-      <w:r>
-        <w:t xml:space="preserve">Building an intersection will be done visually to make the process intuitive both for creating one standalone or from an existing layout. </w:t>
-      </w:r>
-    </w:p>
-    <w:p>
-      <w:pPr>
-        <w:pStyle w:val="Heading2"/>
-      </w:pPr>
-      <w:bookmarkStart w:id="8" w:name="_Toc243679931"/>
-      <w:r>
-        <w:t>Simulation</w:t>
-      </w:r>
-      <w:bookmarkEnd w:id="8"/>
-    </w:p>
-    <w:p>
-      <w:r>
-        <w:t>An intersection in the program can be tested using simulated traffic to determine its effectiveness. Simulations are visual, with individual vehicles and pedestrians using the intersection.</w:t>
-      </w:r>
-    </w:p>
-    <w:p>
-      <w:pPr>
-        <w:pStyle w:val="Heading1"/>
-      </w:pPr>
-      <w:bookmarkStart w:id="9" w:name="_Toc243679936"/>
-      <w:r>
-        <w:t>Features</w:t>
-      </w:r>
-      <w:bookmarkEnd w:id="9"/>
     </w:p>
     <w:p>
       <w:pPr>
@@ -1606,6 +1586,7 @@
         </w:numPr>
       </w:pPr>
       <w:r>
+        <w:lastRenderedPageBreak/>
         <w:t>Change amount of cars going through intersection from each direction</w:t>
       </w:r>
     </w:p>
@@ -1630,7 +1611,6 @@
         </w:numPr>
       </w:pPr>
       <w:r>
-        <w:lastRenderedPageBreak/>
         <w:t>Get data back from simulation</w:t>
       </w:r>
     </w:p>

</xml_diff>

<commit_message>
Merge in Feature content
</commit_message>
<xml_diff>
--- a/Traffic Sim.docx
+++ b/Traffic Sim.docx
@@ -1307,15 +1307,7 @@
     </w:p>
     <w:p>
       <w:r>
-        <w:t xml:space="preserve">Traffic congestion of one of the most widespread problems in urban life, influencing city residents every day. Drivers lose significant time each year sitting in traffic, burning up fuel, and contributing to rising air pollution. Congestion can also take an economic toll. Congested roads lead to higher stress and frustration, raising the likelihood of accidents, and discouraging people from traveling altogether. Researchers have noted that traffic congestion cause large cities to deliver less than they should </w:t>
-      </w:r>
-      <w:proofErr w:type="spellStart"/>
-      <w:r>
-        <w:t>given</w:t>
-      </w:r>
-      <w:proofErr w:type="spellEnd"/>
-      <w:r>
-        <w:t xml:space="preserve"> their size and resources </w:t>
+        <w:t xml:space="preserve">Traffic congestion of one of the most widespread problems in urban life, influencing city residents every day. Drivers lose significant time each year sitting in traffic, burning up fuel, and contributing to rising air pollution. Congestion can also take an economic toll. Congested roads lead to higher stress and frustration, raising the likelihood of accidents, and discouraging people from traveling altogether. Researchers have noted that traffic congestion cause large cities to deliver less than they should given their size and resources </w:t>
       </w:r>
       <w:r>
         <w:t>(Andrew, 2025)</w:t>
@@ -1342,15 +1334,7 @@
         <w:t xml:space="preserve">Infrastructure has vastly changed to accommodate dense population and destinations. Modern intersections are hardly uniform, varying in geometry, visibility, and traffic density. Traffic complexity is measured by combing static geometry such as number of approach legs, road width, sight distance, and presence of islands or medians. With dynamic environments such as traffic volume, pedestrian crossing, and bicycle lanes. More complexity of intersections has shown an increase in the mental workload of drivers </w:t>
       </w:r>
       <w:r>
-        <w:t xml:space="preserve">(Hannes </w:t>
-      </w:r>
-      <w:proofErr w:type="spellStart"/>
-      <w:r>
-        <w:t>Weinreuter</w:t>
-      </w:r>
-      <w:proofErr w:type="spellEnd"/>
-      <w:r>
-        <w:t xml:space="preserve"> et al., 2022)</w:t>
+        <w:t>(Hannes Weinreuter et al., 2022)</w:t>
       </w:r>
       <w:r>
         <w:t xml:space="preserve">. </w:t>
@@ -1362,10 +1346,49 @@
         <w:pStyle w:val="Heading2"/>
       </w:pPr>
       <w:bookmarkStart w:id="4" w:name="_Toc243679927"/>
+      <w:bookmarkStart w:id="5" w:name="_Toc243679928"/>
       <w:r>
         <w:t>Modern tools with flaws</w:t>
       </w:r>
       <w:bookmarkEnd w:id="4"/>
+    </w:p>
+    <w:p>
+      <w:r>
+        <w:t xml:space="preserve">There are many traffic simulation programs used for transportation. PTV Vissim and Aimsun Next are two leading simulators, which model the movement of vehicles and pedestrians in a road network. These have proven to be powerful tools, but they are very expensive. Aimsun’s most basic “lite” model is </w:t>
+      </w:r>
+      <w:r>
+        <w:t>€2,000</w:t>
+      </w:r>
+      <w:r>
+        <w:t xml:space="preserve"> ($2,244.60) / year and limited to 20 intersections, while PTV Vissim’s pricing is only available upon request, but price goes up as you add more junctions and modules.</w:t>
+      </w:r>
+    </w:p>
+    <w:p/>
+    <w:p>
+      <w:r>
+        <w:t xml:space="preserve">These programs are built for experts in their field, with even a simple project that takes a lot of effort. The Federal Highway Administration warns that microsimulation can be “time-consuming and resource-intensive activity” (Dowling et al. 2004). Models need huge amounts of data and must be calibrated before results become viable. The PTV group suggests a 16-hour course just to learn the basics of using their software </w:t>
+      </w:r>
+      <w:r>
+        <w:t xml:space="preserve">(PTV Planung Transport Verkehr GmbH, </w:t>
+      </w:r>
+      <w:r>
+        <w:t>2026</w:t>
+      </w:r>
+      <w:r>
+        <w:t>)</w:t>
+      </w:r>
+      <w:r>
+        <w:t>.</w:t>
+      </w:r>
+    </w:p>
+    <w:p>
+      <w:pPr>
+        <w:pStyle w:val="Heading2"/>
+      </w:pPr>
+      <w:r>
+        <w:t>The Who</w:t>
+      </w:r>
+      <w:bookmarkEnd w:id="5"/>
     </w:p>
     <w:p>
       <w:pPr>
@@ -1376,7 +1399,7 @@
         </w:numPr>
       </w:pPr>
       <w:r>
-        <w:t>Available commercial software</w:t>
+        <w:t>Good software not available to the public</w:t>
       </w:r>
     </w:p>
     <w:p>
@@ -1388,7 +1411,7 @@
         </w:numPr>
       </w:pPr>
       <w:r>
-        <w:t>Complexity</w:t>
+        <w:t>Students lack hands on tools</w:t>
       </w:r>
     </w:p>
     <w:p>
@@ -1400,290 +1423,94 @@
         </w:numPr>
       </w:pPr>
       <w:r>
-        <w:t>Drawbacks</w:t>
+        <w:t>Results understood by engineers and businessmen</w:t>
+      </w:r>
+    </w:p>
+    <w:p/>
+    <w:p>
+      <w:pPr>
+        <w:pStyle w:val="Heading1"/>
+      </w:pPr>
+      <w:bookmarkStart w:id="6" w:name="_Toc243679929"/>
+      <w:r>
+        <w:t>Solution</w:t>
+      </w:r>
+      <w:bookmarkEnd w:id="6"/>
+    </w:p>
+    <w:p>
+      <w:r>
+        <w:t>The proposed program will be a tool to improve the design process of intersections by integrating traffic simulations with a workflow for designing intersections. Reducing the time spent testing and iterating on designs by streamlining the process.</w:t>
       </w:r>
     </w:p>
     <w:p>
       <w:pPr>
         <w:pStyle w:val="Heading2"/>
       </w:pPr>
-      <w:bookmarkStart w:id="5" w:name="_Toc243679928"/>
-      <w:r>
-        <w:t>The Who</w:t>
-      </w:r>
-      <w:bookmarkEnd w:id="5"/>
-    </w:p>
-    <w:p>
-      <w:pPr>
-        <w:pStyle w:val="ListParagraph"/>
-        <w:numPr>
-          <w:ilvl w:val="0"/>
-          <w:numId w:val="1"/>
-        </w:numPr>
-      </w:pPr>
-      <w:r>
-        <w:t>Good software not available to the public</w:t>
-      </w:r>
-    </w:p>
-    <w:p>
-      <w:pPr>
-        <w:pStyle w:val="ListParagraph"/>
-        <w:numPr>
-          <w:ilvl w:val="0"/>
-          <w:numId w:val="1"/>
-        </w:numPr>
-      </w:pPr>
-      <w:r>
-        <w:t>Students lack hands on tools</w:t>
-      </w:r>
-    </w:p>
-    <w:p>
-      <w:pPr>
-        <w:pStyle w:val="ListParagraph"/>
-        <w:numPr>
-          <w:ilvl w:val="0"/>
-          <w:numId w:val="1"/>
-        </w:numPr>
-      </w:pPr>
-      <w:r>
-        <w:t>Results understood by engineers and businessmen</w:t>
+      <w:bookmarkStart w:id="7" w:name="_Toc243679930"/>
+      <w:r>
+        <w:t>Road Network Builder</w:t>
+      </w:r>
+      <w:bookmarkEnd w:id="7"/>
+    </w:p>
+    <w:p>
+      <w:r>
+        <w:t xml:space="preserve">Building an intersection will be done visually to make the process intuitive both for creating one standalone or from an existing layout. Current workflows for this use case are split into multiple, separately developed tools. A system to combine these functions with a single toolset will make the process smoother and more intuitive. </w:t>
+      </w:r>
+    </w:p>
+    <w:p>
+      <w:pPr>
+        <w:pStyle w:val="Heading2"/>
+      </w:pPr>
+      <w:bookmarkStart w:id="8" w:name="_Toc243679931"/>
+      <w:r>
+        <w:lastRenderedPageBreak/>
+        <w:t>Simulation</w:t>
+      </w:r>
+      <w:bookmarkEnd w:id="8"/>
+    </w:p>
+    <w:p>
+      <w:r>
+        <w:t>An intersection in the program can be tested using simulated traffic to determine its effectiveness. Simulations are visual, with individual vehicles and pedestrians using the intersection. Including this with design tools makes adjustments quick and prototyping fast.</w:t>
       </w:r>
     </w:p>
     <w:p/>
+    <w:p/>
     <w:p>
       <w:pPr>
         <w:pStyle w:val="Heading1"/>
       </w:pPr>
-      <w:bookmarkStart w:id="6" w:name="_Toc243679936"/>
-      <w:bookmarkStart w:id="7" w:name="_Toc243679929"/>
-      <w:r>
-        <w:t>Solution</w:t>
-      </w:r>
-      <w:bookmarkEnd w:id="7"/>
-    </w:p>
-    <w:p>
-      <w:r>
-        <w:t>The proposed program will be a tool to improve the design process of intersections by integrating traffic simulations with a workflow for designing intersections. Reducing the time spent testing and iterating on designs by streamlining the process.</w:t>
-      </w:r>
-    </w:p>
+      <w:bookmarkStart w:id="9" w:name="_Toc243679936"/>
+      <w:r>
+        <w:t>Features</w:t>
+      </w:r>
+      <w:bookmarkEnd w:id="9"/>
+    </w:p>
+    <w:p/>
     <w:p>
       <w:pPr>
         <w:pStyle w:val="Heading2"/>
       </w:pPr>
-      <w:bookmarkStart w:id="8" w:name="_Toc243679930"/>
-      <w:r>
-        <w:t>Road Network Builder</w:t>
-      </w:r>
-      <w:bookmarkEnd w:id="8"/>
-    </w:p>
-    <w:p>
-      <w:r>
-        <w:t xml:space="preserve">Building an intersection will be done visually to make the process intuitive both for creating one standalone or from an existing layout. Current workflows for this use case are split into multiple, separately developed tools. A system to combine these functions with a single toolset will make the process smoother and more intuitive. </w:t>
-      </w:r>
-    </w:p>
+      <w:r>
+        <w:t>Base Features</w:t>
+      </w:r>
+    </w:p>
+    <w:p>
+      <w:r>
+        <w:t xml:space="preserve">Basic functionality of the program should include the ability to draw intersections by dragging and dropping different intersection types (i.e. roundabout, traffic light, stop signs), select different entrances to an intersection and connect roads between them, change stop light intervals. The program should also include functionality to run simulations on the intersection to test efficiency and safety. The program will be able to simulate with variable traffic density and return relevant data back to the user. The user should be able to upload a satellite image of the intersection to draw on top of as a reference. </w:t>
+      </w:r>
+    </w:p>
+    <w:p/>
     <w:p>
       <w:pPr>
         <w:pStyle w:val="Heading2"/>
       </w:pPr>
-      <w:bookmarkStart w:id="9" w:name="_Toc243679931"/>
-      <w:r>
-        <w:t>Simulation</w:t>
-      </w:r>
-      <w:bookmarkEnd w:id="9"/>
-    </w:p>
-    <w:p>
-      <w:r>
-        <w:t>An intersection in the program can be tested using simulated traffic to determine its effectiveness. Simulations are visual, with individual vehicles and pedestrians using the intersection. Including this with design tools makes adjustments quick and prototyping fast.</w:t>
-      </w:r>
-    </w:p>
-    <w:p>
-      <w:pPr>
-        <w:pStyle w:val="Heading1"/>
-      </w:pPr>
-      <w:r>
-        <w:t>Features</w:t>
-      </w:r>
-      <w:bookmarkEnd w:id="6"/>
-    </w:p>
-    <w:p>
-      <w:pPr>
-        <w:pStyle w:val="ListParagraph"/>
-        <w:numPr>
-          <w:ilvl w:val="0"/>
-          <w:numId w:val="2"/>
-        </w:numPr>
-      </w:pPr>
-      <w:r>
-        <w:t>Base features:</w:t>
-      </w:r>
-    </w:p>
-    <w:p>
-      <w:pPr>
-        <w:pStyle w:val="ListParagraph"/>
-        <w:numPr>
-          <w:ilvl w:val="1"/>
-          <w:numId w:val="2"/>
-        </w:numPr>
-      </w:pPr>
-      <w:r>
-        <w:t>Ability to draw intersections</w:t>
-      </w:r>
-    </w:p>
-    <w:p>
-      <w:pPr>
-        <w:pStyle w:val="ListParagraph"/>
-        <w:numPr>
-          <w:ilvl w:val="2"/>
-          <w:numId w:val="2"/>
-        </w:numPr>
-      </w:pPr>
-      <w:r>
-        <w:t>Drag and drop intersection types</w:t>
-      </w:r>
-    </w:p>
-    <w:p>
-      <w:pPr>
-        <w:pStyle w:val="ListParagraph"/>
-        <w:numPr>
-          <w:ilvl w:val="2"/>
-          <w:numId w:val="2"/>
-        </w:numPr>
-      </w:pPr>
-      <w:r>
-        <w:t>Click select road connections</w:t>
-      </w:r>
-    </w:p>
-    <w:p>
-      <w:pPr>
-        <w:pStyle w:val="ListParagraph"/>
-        <w:numPr>
-          <w:ilvl w:val="2"/>
-          <w:numId w:val="2"/>
-        </w:numPr>
-      </w:pPr>
-      <w:r>
-        <w:t>Change stoplight intervals</w:t>
-      </w:r>
-    </w:p>
-    <w:p>
-      <w:pPr>
-        <w:pStyle w:val="ListParagraph"/>
-        <w:numPr>
-          <w:ilvl w:val="1"/>
-          <w:numId w:val="2"/>
-        </w:numPr>
-      </w:pPr>
-      <w:r>
-        <w:t>Run simulations on created intersections</w:t>
-      </w:r>
-    </w:p>
-    <w:p>
-      <w:pPr>
-        <w:pStyle w:val="ListParagraph"/>
-        <w:numPr>
-          <w:ilvl w:val="2"/>
-          <w:numId w:val="2"/>
-        </w:numPr>
-      </w:pPr>
-      <w:r>
-        <w:lastRenderedPageBreak/>
-        <w:t>Change amount of cars going through intersection from each direction</w:t>
-      </w:r>
-    </w:p>
-    <w:p>
-      <w:pPr>
-        <w:pStyle w:val="ListParagraph"/>
-        <w:numPr>
-          <w:ilvl w:val="2"/>
-          <w:numId w:val="2"/>
-        </w:numPr>
-      </w:pPr>
-      <w:r>
-        <w:t>Add traffic intensity</w:t>
-      </w:r>
-    </w:p>
-    <w:p>
-      <w:pPr>
-        <w:pStyle w:val="ListParagraph"/>
-        <w:numPr>
-          <w:ilvl w:val="1"/>
-          <w:numId w:val="2"/>
-        </w:numPr>
-      </w:pPr>
-      <w:r>
-        <w:t>Get data back from simulation</w:t>
-      </w:r>
-    </w:p>
-    <w:p>
-      <w:pPr>
-        <w:pStyle w:val="ListParagraph"/>
-        <w:numPr>
-          <w:ilvl w:val="2"/>
-          <w:numId w:val="2"/>
-        </w:numPr>
-      </w:pPr>
-      <w:r>
-        <w:t>Wait time</w:t>
-      </w:r>
-    </w:p>
-    <w:p>
-      <w:pPr>
-        <w:pStyle w:val="ListParagraph"/>
-        <w:numPr>
-          <w:ilvl w:val="2"/>
-          <w:numId w:val="2"/>
-        </w:numPr>
-      </w:pPr>
-      <w:r>
-        <w:t>Time in intersection</w:t>
-      </w:r>
-    </w:p>
-    <w:p>
-      <w:pPr>
-        <w:pStyle w:val="ListParagraph"/>
-        <w:numPr>
-          <w:ilvl w:val="1"/>
-          <w:numId w:val="2"/>
-        </w:numPr>
-      </w:pPr>
-      <w:r>
-        <w:t>Draw intersection over top of satellite image of intersection</w:t>
-      </w:r>
-    </w:p>
-    <w:p>
-      <w:pPr>
-        <w:pStyle w:val="ListParagraph"/>
-        <w:numPr>
-          <w:ilvl w:val="0"/>
-          <w:numId w:val="2"/>
-        </w:numPr>
-      </w:pPr>
-      <w:r>
-        <w:t>Stretch Goals:</w:t>
-      </w:r>
-    </w:p>
-    <w:p>
-      <w:pPr>
-        <w:pStyle w:val="ListParagraph"/>
-        <w:numPr>
-          <w:ilvl w:val="1"/>
-          <w:numId w:val="2"/>
-        </w:numPr>
-      </w:pPr>
-      <w:r>
-        <w:t>Upload video footage to track cars going in directions to accurately run simulation on real data</w:t>
-      </w:r>
-    </w:p>
-    <w:p>
-      <w:pPr>
-        <w:pStyle w:val="ListParagraph"/>
-        <w:numPr>
-          <w:ilvl w:val="1"/>
-          <w:numId w:val="2"/>
-        </w:numPr>
-      </w:pPr>
-      <w:r>
-        <w:t>AI iterates through many types of intersections to find the best one</w:t>
+      <w:r>
+        <w:t>Stretch Goals</w:t>
+      </w:r>
+    </w:p>
+    <w:p>
+      <w:r>
+        <w:t>These features are features we want to implement but aren’t necessarily core functionality. One of these features would allow the user to upload footage of an intersection and track the amount of cars coming from each direction and where they go in order to accurately represent the traffic going through the intersection during the simulation. Another one of these features would be an AI that can take a picture of an intersection and iterate through multiple different types of intersections, running a simulation on each of them and returning the one with the best results.</w:t>
       </w:r>
     </w:p>
     <w:p/>

</xml_diff>